<commit_message>
Refresh contract earnest money workflow
</commit_message>
<xml_diff>
--- a/Project Rooms/Contract for Deed/output/320 Rose - Contract for Deed Agreement - DRAFT.docx
+++ b/Project Rooms/Contract for Deed/output/320 Rose - Contract for Deed Agreement - DRAFT.docx
@@ -664,7 +664,7 @@
       </w:tblGrid>
       <w:tr>
         <w:trPr>
-          <w:trHeight w:hRule="exact" w:val="911"/>
+          <w:trHeight w:hRule="exact" w:val="1540"/>
         </w:trPr>
         <w:tc>
           <w:tcPr>
@@ -688,6 +688,7 @@
             </w:pPr>
             <w:r>
               <w:rPr>
+                <w:color w:val="C00000"/>
                 <w:sz w:val="24"/>
                 <w:szCs w:val="28"/>
               </w:rPr>
@@ -700,15 +701,86 @@
             <w:tcW w:w="1459" w:type="dxa"/>
           </w:tcPr>
           <w:p>
+            <w:pPr>
+              <w:jc w:val="right"/>
+            </w:pPr>
             <w:r>
-              <w:t>20,790.00</w:t>
+              <w:rPr>
+                <w:color w:val="C00000"/>
+              </w:rPr>
+              <w:t>100.00</w:t>
             </w:r>
           </w:p>
         </w:tc>
       </w:tr>
       <w:tr>
         <w:trPr>
-          <w:trHeight w:hRule="exact" w:val="542"/>
+          <w:trHeight w:hRule="exact" w:val="272"/>
+        </w:trPr>
+        <w:tc>
+          <w:tcPr>
+            <w:tcW w:w="522" w:type="dxa"/>
+          </w:tcPr>
+          <w:p>
+            <w:pPr>
+              <w:pStyle w:val="Textbody"/>
+              <w:tabs>
+                <w:tab w:val="clear" w:pos="280"/>
+                <w:tab w:val="clear" w:pos="10350"/>
+                <w:tab w:val="left" w:pos="720"/>
+              </w:tabs>
+              <w:spacing w:line="264" w:lineRule="auto"/>
+              <w:ind w:left="270"/>
+              <w:jc w:val="right"/>
+              <w:rPr>
+                <w:sz w:val="24"/>
+                <w:szCs w:val="24"/>
+              </w:rPr>
+            </w:pPr>
+            <w:r>
+              <w:rPr>
+                <w:color w:val="C00000"/>
+                <w:sz w:val="24"/>
+                <w:szCs w:val="24"/>
+              </w:rPr>
+              <w:t>$</w:t>
+            </w:r>
+          </w:p>
+        </w:tc>
+        <w:tc>
+          <w:tcPr>
+            <w:tcW w:w="1459" w:type="dxa"/>
+          </w:tcPr>
+          <w:p>
+            <w:pPr>
+              <w:pStyle w:val="Textbody"/>
+              <w:tabs>
+                <w:tab w:val="clear" w:pos="280"/>
+                <w:tab w:val="clear" w:pos="10350"/>
+                <w:tab w:val="left" w:pos="720"/>
+              </w:tabs>
+              <w:spacing w:line="264" w:lineRule="auto"/>
+              <w:ind w:left="270"/>
+              <w:jc w:val="right"/>
+              <w:rPr>
+                <w:sz w:val="24"/>
+                <w:szCs w:val="24"/>
+              </w:rPr>
+            </w:pPr>
+            <w:r>
+              <w:rPr>
+                <w:color w:val="C00000"/>
+                <w:sz w:val="24"/>
+                <w:szCs w:val="24"/>
+              </w:rPr>
+              <w:t>19,700.00</w:t>
+            </w:r>
+          </w:p>
+        </w:tc>
+      </w:tr>
+      <w:tr>
+        <w:trPr>
+          <w:trHeight w:hRule="exact" w:val="623"/>
         </w:trPr>
         <w:tc>
           <w:tcPr>
@@ -738,53 +810,8 @@
           </w:tcPr>
           <w:p>
             <w:pPr>
-              <w:pStyle w:val="Textbody"/>
-              <w:tabs>
-                <w:tab w:val="clear" w:pos="280"/>
-                <w:tab w:val="clear" w:pos="10350"/>
-                <w:tab w:val="left" w:pos="720"/>
-              </w:tabs>
-              <w:spacing w:line="264" w:lineRule="auto"/>
-              <w:ind w:left="270"/>
-              <w:rPr>
-                <w:sz w:val="24"/>
-                <w:szCs w:val="28"/>
-              </w:rPr>
+              <w:jc w:val="right"/>
             </w:pPr>
-          </w:p>
-        </w:tc>
-      </w:tr>
-      <w:tr>
-        <w:trPr>
-          <w:trHeight w:hRule="exact" w:val="632"/>
-        </w:trPr>
-        <w:tc>
-          <w:tcPr>
-            <w:tcW w:w="522" w:type="dxa"/>
-          </w:tcPr>
-          <w:p>
-            <w:pPr>
-              <w:pStyle w:val="Textbody"/>
-              <w:tabs>
-                <w:tab w:val="clear" w:pos="280"/>
-                <w:tab w:val="clear" w:pos="10350"/>
-                <w:tab w:val="left" w:pos="720"/>
-              </w:tabs>
-              <w:spacing w:line="264" w:lineRule="auto"/>
-              <w:ind w:left="270"/>
-              <w:jc w:val="right"/>
-              <w:rPr>
-                <w:sz w:val="24"/>
-                <w:szCs w:val="28"/>
-              </w:rPr>
-            </w:pPr>
-          </w:p>
-        </w:tc>
-        <w:tc>
-          <w:tcPr>
-            <w:tcW w:w="1459" w:type="dxa"/>
-          </w:tcPr>
-          <w:p>
             <w:r/>
           </w:p>
         </w:tc>
@@ -829,6 +856,7 @@
               </w:tabs>
               <w:spacing w:line="264" w:lineRule="auto"/>
               <w:ind w:left="270"/>
+              <w:jc w:val="right"/>
               <w:rPr>
                 <w:sz w:val="24"/>
                 <w:szCs w:val="28"/>
@@ -877,6 +905,7 @@
               </w:tabs>
               <w:spacing w:line="264" w:lineRule="auto"/>
               <w:ind w:left="270"/>
+              <w:jc w:val="right"/>
               <w:rPr>
                 <w:sz w:val="24"/>
                 <w:szCs w:val="28"/>
@@ -925,6 +954,7 @@
               </w:tabs>
               <w:spacing w:line="264" w:lineRule="auto"/>
               <w:ind w:left="270"/>
+              <w:jc w:val="right"/>
               <w:rPr>
                 <w:sz w:val="24"/>
                 <w:szCs w:val="28"/>
@@ -971,8 +1001,11 @@
             <w:tcW w:w="1459" w:type="dxa"/>
           </w:tcPr>
           <w:p>
+            <w:pPr>
+              <w:jc w:val="right"/>
+            </w:pPr>
             <w:r>
-              <w:t>325,710.00</w:t>
+              <w:t>310,200.00</w:t>
             </w:r>
           </w:p>
         </w:tc>
@@ -1017,6 +1050,7 @@
               </w:tabs>
               <w:spacing w:line="264" w:lineRule="auto"/>
               <w:ind w:left="270"/>
+              <w:jc w:val="right"/>
               <w:rPr>
                 <w:sz w:val="24"/>
                 <w:szCs w:val="28"/>
@@ -1063,8 +1097,11 @@
             <w:tcW w:w="1459" w:type="dxa"/>
           </w:tcPr>
           <w:p>
+            <w:pPr>
+              <w:jc w:val="right"/>
+            </w:pPr>
             <w:r>
-              <w:t>346,500.00</w:t>
+              <w:t>330,000.00</w:t>
             </w:r>
           </w:p>
         </w:tc>
@@ -1092,27 +1129,10 @@
       </w:pPr>
       <w:r>
         <w:rPr>
-          <w:szCs w:val="24"/>
-        </w:rPr>
-        <w:t>Binder deposit which will remain as a binder until closing, unless sooner forfeited or returned,</w:t>
-      </w:r>
-      <w:r>
-        <w:rPr>
-          <w:szCs w:val="24"/>
-        </w:rPr>
-        <w:t xml:space="preserve"> </w:t>
-      </w:r>
-      <w:r>
-        <w:rPr>
-          <w:szCs w:val="24"/>
-        </w:rPr>
-        <w:t xml:space="preserve">according to the provisions in this Agreement.         </w:t>
-      </w:r>
-      <w:r>
-        <w:rPr>
-          <w:szCs w:val="24"/>
-        </w:rPr>
-        <w:tab/>
+          <w:color w:val="C00000"/>
+          <w:szCs w:val="24"/>
+        </w:rPr>
+        <w:t>Earnest money deposit to be paid by Purchaser upon execution of this Contract. This earnest money shall remain as a binder until closing, unless sooner forfeited or returned according to the provisions in this Agreement, and shall be credited toward the total down payment.</w:t>
       </w:r>
     </w:p>
     <w:p>
@@ -1137,23 +1157,10 @@
       </w:pPr>
       <w:r>
         <w:rPr>
-          <w:szCs w:val="24"/>
-        </w:rPr>
-        <w:t xml:space="preserve">Additional binder deposit </w:t>
-      </w:r>
-      <w:proofErr w:type="gramStart"/>
-      <w:r>
-        <w:rPr>
-          <w:szCs w:val="24"/>
-        </w:rPr>
-        <w:t>due</w:t>
-      </w:r>
-      <w:proofErr w:type="gramEnd"/>
-      <w:r>
-        <w:rPr>
-          <w:szCs w:val="24"/>
-        </w:rPr>
-        <w:t xml:space="preserve"> within ______days after date of this agreement.                                                                     </w:t>
+          <w:color w:val="C00000"/>
+          <w:szCs w:val="24"/>
+        </w:rPr>
+        <w:t>Remaining balance of the down payment due at closing.</w:t>
       </w:r>
     </w:p>
     <w:p>
@@ -2182,7 +2189,14 @@
         <w:rPr>
           <w:szCs w:val="28"/>
         </w:rPr>
-        <w:t xml:space="preserve"> All mortgage payments or condominium and association fees will be current at Seller's expense at the time of closing.</w:t>
+        <w:t xml:space="preserve"> All mortgage payments or condominium and association fees will be </w:t>
+      </w:r>
+      <w:r>
+        <w:rPr>
+          <w:szCs w:val="28"/>
+        </w:rPr>
+        <w:lastRenderedPageBreak/>
+        <w:t>current at Seller's expense at the time of closing.</w:t>
       </w:r>
     </w:p>
     <w:p>
@@ -2248,7 +2262,7 @@
           <w:bCs/>
           <w:szCs w:val="28"/>
         </w:rPr>
-        <w:t>INTEREST RATE: Unpaid principal shall accrue interest at a rate of 7.500%(APR), with interest to be amortized over the term of this Contract for Deed. The Amount of Each Installment Payment above includes any interest payable, property Insurance, and escrowed Property Tax. Late payments shall accrue interest at a rate of four percent (4%) on any delinquent monies owed.</w:t>
+        <w:t>INTEREST RATE: Unpaid principal shall accrue interest at a rate of 8.500%(APR), with interest to be amortized over the term of this Contract for Deed. The Amount of Each Installment Payment above includes any interest payable, property Insurance, and escrowed Property Tax. Late payments shall accrue interest at a rate of four percent (4%) on any delinquent monies owed.</w:t>
       </w:r>
     </w:p>
     <w:p>
@@ -2458,7 +2472,7 @@
         </w:rPr>
         <w:t>Principal and Interest:</w:t>
         <w:tab/>
-        <w:t>2,277.41</w:t>
+        <w:t>2,385.17</w:t>
       </w:r>
       <w:r>
         <w:rPr>
@@ -2618,7 +2632,7 @@
         </w:rPr>
         <w:t>Total Monthly Payment:</w:t>
         <w:tab/>
-        <w:t>2,474.01</w:t>
+        <w:t>2,581.77</w:t>
       </w:r>
       <w:r>
         <w:rPr>
@@ -2909,14 +2923,14 @@
         <w:rPr>
           <w:szCs w:val="24"/>
         </w:rPr>
-        <w:t xml:space="preserve"> EXPRESS OBLIGATIONS UNDER THE CONTRACT AND THE CONTRACT PROVIDES THAT AS A RESULT OF SUCH BREACH THE SELLER IS ENTITLED TO FORFEIT THE CONTRACT. EXAMPLES OF BREACH OF CONTRACT INCLUDE LACK OF PAYMENT EXTENDING BEYOND 15 DAYS OF DUE DATE, PROHIBITED USE OF PROPERTY, FRAUDULENT IDENTIFICATION, AND FRAUDULENT PAYMENTS. </w:t>
+        <w:t xml:space="preserve"> EXPRESS OBLIGATIONS UNDER THE CONTRACT AND THE CONTRACT PROVIDES THAT AS A RESULT OF SUCH BREACH THE SELLER IS ENTITLED TO FORFEIT THE CONTRACT. EXAMPLES OF BREACH OF CONTRACT INCLUDE LACK OF </w:t>
       </w:r>
       <w:r>
         <w:rPr>
           <w:szCs w:val="24"/>
         </w:rPr>
         <w:lastRenderedPageBreak/>
-        <w:t>FURTHERMORE, THE PURCHASER’S RIGHTS SHALL NOT BE FORFEITED UNTIL THE PURCHASER HAS BEEN NOTIFIED OF THE INTENT TO FORFEIT IN ACCORDANCE WITH N.C. GEN. STAT. 47H-4 AND BEEN GIVEN A RIGHT TO CURE THE DEFAULT AND HAS FAILED TO DO SO WITHIN THE TIME PERIOD ALLOWED. A TIMELY TENDER OF CURE SHALL REINSTATE THE CONTRACT FOR DEED.</w:t>
+        <w:t>PAYMENT EXTENDING BEYOND 15 DAYS OF DUE DATE, PROHIBITED USE OF PROPERTY, FRAUDULENT IDENTIFICATION, AND FRAUDULENT PAYMENTS. FURTHERMORE, THE PURCHASER’S RIGHTS SHALL NOT BE FORFEITED UNTIL THE PURCHASER HAS BEEN NOTIFIED OF THE INTENT TO FORFEIT IN ACCORDANCE WITH N.C. GEN. STAT. 47H-4 AND BEEN GIVEN A RIGHT TO CURE THE DEFAULT AND HAS FAILED TO DO SO WITHIN THE TIME PERIOD ALLOWED. A TIMELY TENDER OF CURE SHALL REINSTATE THE CONTRACT FOR DEED.</w:t>
       </w:r>
     </w:p>
     <w:p>
@@ -5264,61 +5278,71 @@
       <w:proofErr w:type="gramStart"/>
       <w:r>
         <w:rPr>
-          <w:szCs w:val="28"/>
-        </w:rPr>
-        <w:t>[ ] Agent   [X] Seller, by the signature below, acknowledge receipt of $20,790.00 [  ] Cash   [   ] Check, as binder deposit, which is the amount mentioned in paragraph 1A of this Agreement.</w:t>
+          <w:color w:val="C00000"/>
+          <w:szCs w:val="28"/>
+        </w:rPr>
+        <w:t>[ ] Agent   [X] Seller, by the signature below, acknowledge receipt of $100.00 [  ] Cash   [   ] Check, as earnest money deposit, which is credited toward the total down payment mentioned in paragraph 1A of this Agreement. The remaining down payment balance of $19,700.00 shall be paid at closing.</w:t>
       </w:r>
       <w:proofErr w:type="gramEnd"/>
       <w:r>
         <w:rPr>
+          <w:color w:val="C00000"/>
           <w:szCs w:val="28"/>
         </w:rPr>
       </w:r>
       <w:proofErr w:type="gramStart"/>
       <w:r>
         <w:rPr>
+          <w:color w:val="C00000"/>
           <w:szCs w:val="28"/>
         </w:rPr>
       </w:r>
       <w:proofErr w:type="gramEnd"/>
       <w:r>
         <w:rPr>
+          <w:color w:val="C00000"/>
           <w:szCs w:val="28"/>
         </w:rPr>
       </w:r>
       <w:proofErr w:type="gramStart"/>
       <w:r>
         <w:rPr>
+          <w:color w:val="C00000"/>
           <w:szCs w:val="28"/>
         </w:rPr>
       </w:r>
       <w:proofErr w:type="gramEnd"/>
       <w:r>
         <w:rPr>
+          <w:color w:val="C00000"/>
           <w:szCs w:val="28"/>
         </w:rPr>
       </w:r>
       <w:proofErr w:type="gramStart"/>
       <w:r>
         <w:rPr>
+          <w:color w:val="C00000"/>
           <w:szCs w:val="28"/>
         </w:rPr>
       </w:r>
       <w:proofErr w:type="gramEnd"/>
       <w:r>
         <w:rPr>
+          <w:color w:val="C00000"/>
           <w:szCs w:val="28"/>
         </w:rPr>
       </w:r>
       <w:proofErr w:type="gramStart"/>
       <w:r>
         <w:rPr>
+          <w:color w:val="C00000"/>
           <w:szCs w:val="28"/>
         </w:rPr>
       </w:r>
       <w:proofErr w:type="gramEnd"/>
       <w:r>
         <w:rPr>
+          <w:color w:val="C00000"/>
           <w:szCs w:val="28"/>
         </w:rPr>
       </w:r>
@@ -8458,15 +8482,7 @@
 </file>
 
 <file path=customXml/item2.xml><?xml version="1.0" encoding="utf-8"?>
-<p:properties xmlns:p="http://schemas.microsoft.com/office/2006/metadata/properties" xmlns:xsi="http://www.w3.org/2001/XMLSchema-instance" xmlns:pc="http://schemas.microsoft.com/office/infopath/2007/PartnerControls">
-  <documentManagement>
-    <TaxCatchAll xmlns="42cc25d9-27fe-4f07-accb-ded05ec47eee" xsi:nil="true"/>
-    <lcf76f155ced4ddcb4097134ff3c332f xmlns="ab9fedca-001d-4cc9-b244-d9c3be5a27d3">
-      <Terms xmlns="http://schemas.microsoft.com/office/infopath/2007/PartnerControls"/>
-    </lcf76f155ced4ddcb4097134ff3c332f>
-    <_Flow_SignoffStatus xmlns="ab9fedca-001d-4cc9-b244-d9c3be5a27d3" xsi:nil="true"/>
-  </documentManagement>
-</p:properties>
+<b:Sources xmlns:b="http://schemas.openxmlformats.org/officeDocument/2006/bibliography" xmlns="http://schemas.openxmlformats.org/officeDocument/2006/bibliography" SelectedStyle="\APASixthEditionOfficeOnline.xsl" StyleName="APA" Version="6"/>
 </file>
 
 <file path=customXml/item3.xml><?xml version="1.0" encoding="utf-8"?>
@@ -8731,7 +8747,15 @@
 </file>
 
 <file path=customXml/item4.xml><?xml version="1.0" encoding="utf-8"?>
-<b:Sources xmlns:b="http://schemas.openxmlformats.org/officeDocument/2006/bibliography" xmlns="http://schemas.openxmlformats.org/officeDocument/2006/bibliography" SelectedStyle="\APASixthEditionOfficeOnline.xsl" StyleName="APA" Version="6"/>
+<p:properties xmlns:p="http://schemas.microsoft.com/office/2006/metadata/properties" xmlns:xsi="http://www.w3.org/2001/XMLSchema-instance" xmlns:pc="http://schemas.microsoft.com/office/infopath/2007/PartnerControls">
+  <documentManagement>
+    <TaxCatchAll xmlns="42cc25d9-27fe-4f07-accb-ded05ec47eee" xsi:nil="true"/>
+    <lcf76f155ced4ddcb4097134ff3c332f xmlns="ab9fedca-001d-4cc9-b244-d9c3be5a27d3">
+      <Terms xmlns="http://schemas.microsoft.com/office/infopath/2007/PartnerControls"/>
+    </lcf76f155ced4ddcb4097134ff3c332f>
+    <_Flow_SignoffStatus xmlns="ab9fedca-001d-4cc9-b244-d9c3be5a27d3" xsi:nil="true"/>
+  </documentManagement>
+</p:properties>
 </file>
 
 <file path=customXml/itemProps1.xml><?xml version="1.0" encoding="utf-8"?>
@@ -8743,12 +8767,9 @@
 </file>
 
 <file path=customXml/itemProps2.xml><?xml version="1.0" encoding="utf-8"?>
-<ds:datastoreItem xmlns:ds="http://schemas.openxmlformats.org/officeDocument/2006/customXml" ds:itemID="{1A4736DD-7889-4919-A280-9BE82A810A58}">
+<ds:datastoreItem xmlns:ds="http://schemas.openxmlformats.org/officeDocument/2006/customXml" ds:itemID="{3679C442-D341-425F-8964-A65FCEFD3D9B}">
   <ds:schemaRefs>
-    <ds:schemaRef ds:uri="http://schemas.microsoft.com/office/2006/metadata/properties"/>
-    <ds:schemaRef ds:uri="http://schemas.microsoft.com/office/infopath/2007/PartnerControls"/>
-    <ds:schemaRef ds:uri="42cc25d9-27fe-4f07-accb-ded05ec47eee"/>
-    <ds:schemaRef ds:uri="ab9fedca-001d-4cc9-b244-d9c3be5a27d3"/>
+    <ds:schemaRef ds:uri="http://schemas.openxmlformats.org/officeDocument/2006/bibliography"/>
   </ds:schemaRefs>
 </ds:datastoreItem>
 </file>
@@ -8773,9 +8794,12 @@
 </file>
 
 <file path=customXml/itemProps4.xml><?xml version="1.0" encoding="utf-8"?>
-<ds:datastoreItem xmlns:ds="http://schemas.openxmlformats.org/officeDocument/2006/customXml" ds:itemID="{3679C442-D341-425F-8964-A65FCEFD3D9B}">
+<ds:datastoreItem xmlns:ds="http://schemas.openxmlformats.org/officeDocument/2006/customXml" ds:itemID="{1A4736DD-7889-4919-A280-9BE82A810A58}">
   <ds:schemaRefs>
-    <ds:schemaRef ds:uri="http://schemas.openxmlformats.org/officeDocument/2006/bibliography"/>
+    <ds:schemaRef ds:uri="http://schemas.microsoft.com/office/2006/metadata/properties"/>
+    <ds:schemaRef ds:uri="http://schemas.microsoft.com/office/infopath/2007/PartnerControls"/>
+    <ds:schemaRef ds:uri="42cc25d9-27fe-4f07-accb-ded05ec47eee"/>
+    <ds:schemaRef ds:uri="ab9fedca-001d-4cc9-b244-d9c3be5a27d3"/>
   </ds:schemaRefs>
 </ds:datastoreItem>
 </file>
</xml_diff>

<commit_message>
Use selling earnest money field
</commit_message>
<xml_diff>
--- a/Project Rooms/Contract for Deed/output/320 Rose - Contract for Deed Agreement - DRAFT.docx
+++ b/Project Rooms/Contract for Deed/output/320 Rose - Contract for Deed Agreement - DRAFT.docx
@@ -708,7 +708,7 @@
               <w:rPr>
                 <w:color w:val="C00000"/>
               </w:rPr>
-              <w:t>100.00</w:t>
+              <w:t>6,000.00</w:t>
             </w:r>
           </w:p>
         </w:tc>
@@ -773,7 +773,7 @@
                 <w:sz w:val="24"/>
                 <w:szCs w:val="24"/>
               </w:rPr>
-              <w:t>19,700.00</w:t>
+              <w:t>13,800.00</w:t>
             </w:r>
           </w:p>
         </w:tc>
@@ -5281,7 +5281,7 @@
           <w:color w:val="C00000"/>
           <w:szCs w:val="28"/>
         </w:rPr>
-        <w:t>[ ] Agent   [X] Seller, by the signature below, acknowledge receipt of $100.00 [  ] Cash   [   ] Check, as earnest money deposit, which is credited toward the total down payment mentioned in paragraph 1A of this Agreement. The remaining down payment balance of $19,700.00 shall be paid at closing.</w:t>
+        <w:t>[ ] Agent   [X] Seller, by the signature below, acknowledge receipt of $6,000.00 [  ] Cash   [   ] Check, as earnest money deposit, which is credited toward the total down payment mentioned in paragraph 1A of this Agreement. The remaining down payment balance of $13,800.00 shall be paid at closing.</w:t>
       </w:r>
       <w:proofErr w:type="gramEnd"/>
       <w:r>

</xml_diff>

<commit_message>
Preserve black contract formatting
</commit_message>
<xml_diff>
--- a/Project Rooms/Contract for Deed/output/320 Rose - Contract for Deed Agreement - DRAFT.docx
+++ b/Project Rooms/Contract for Deed/output/320 Rose - Contract for Deed Agreement - DRAFT.docx
@@ -87,7 +87,6 @@
           <w:b/>
           <w:bCs/>
           <w:noProof/>
-          <w:color w:val="C00000"/>
           <w:sz w:val="28"/>
           <w:szCs w:val="28"/>
         </w:rPr>
@@ -567,7 +566,13 @@
         <w:rPr>
           <w:szCs w:val="28"/>
         </w:rPr>
-        <w:t>County of: WAKE</w:t>
+        <w:tab/>
+        <w:t>County of: Wake</w:t>
+      </w:r>
+      <w:r>
+        <w:rPr>
+          <w:szCs w:val="28"/>
+        </w:rPr>
       </w:r>
     </w:p>
     <w:p>
@@ -688,7 +693,6 @@
             </w:pPr>
             <w:r>
               <w:rPr>
-                <w:color w:val="C00000"/>
                 <w:sz w:val="24"/>
                 <w:szCs w:val="28"/>
               </w:rPr>
@@ -705,9 +709,6 @@
               <w:jc w:val="right"/>
             </w:pPr>
             <w:r>
-              <w:rPr>
-                <w:color w:val="C00000"/>
-              </w:rPr>
               <w:t>6,000.00</w:t>
             </w:r>
           </w:p>
@@ -739,7 +740,6 @@
             </w:pPr>
             <w:r>
               <w:rPr>
-                <w:color w:val="C00000"/>
                 <w:sz w:val="24"/>
                 <w:szCs w:val="24"/>
               </w:rPr>
@@ -769,7 +769,6 @@
             </w:pPr>
             <w:r>
               <w:rPr>
-                <w:color w:val="C00000"/>
                 <w:sz w:val="24"/>
                 <w:szCs w:val="24"/>
               </w:rPr>
@@ -1129,7 +1128,6 @@
       </w:pPr>
       <w:r>
         <w:rPr>
-          <w:color w:val="C00000"/>
           <w:szCs w:val="24"/>
         </w:rPr>
         <w:t>Earnest money deposit to be paid by Purchaser upon execution of this Contract. This earnest money shall remain as a binder until closing, unless sooner forfeited or returned according to the provisions in this Agreement, and shall be credited toward the total down payment.</w:t>
@@ -1157,7 +1155,6 @@
       </w:pPr>
       <w:r>
         <w:rPr>
-          <w:color w:val="C00000"/>
           <w:szCs w:val="24"/>
         </w:rPr>
         <w:t>Remaining balance of the down payment due at closing.</w:t>
@@ -1500,31 +1497,7 @@
         <w:rPr>
           <w:szCs w:val="28"/>
         </w:rPr>
-        <w:t>Purchaser Will Pay the following options</w:t>
-      </w:r>
-      <w:r>
-        <w:rPr>
-          <w:szCs w:val="28"/>
-        </w:rPr>
-        <w:t>,</w:t>
-      </w:r>
-      <w:r>
-        <w:rPr>
-          <w:szCs w:val="28"/>
-        </w:rPr>
-        <w:t xml:space="preserve"> if they </w:t>
-      </w:r>
-      <w:r>
-        <w:rPr>
-          <w:szCs w:val="28"/>
-        </w:rPr>
-        <w:t>apply</w:t>
-      </w:r>
-      <w:r>
-        <w:rPr>
-          <w:szCs w:val="28"/>
-        </w:rPr>
-        <w:t xml:space="preserve">: </w:t>
+        <w:t xml:space="preserve">Purchaser Will Pay the following options, if they apply: </w:t>
       </w:r>
     </w:p>
     <w:p>
@@ -2876,6 +2849,10 @@
       <w:r>
         <w:t>NOTE FOR ATTORNEY REVIEW: Confirm whether any pending orders, liens, adverse conditions, title matters, or required disclosures should be listed here before signing.</w:t>
       </w:r>
+      <w:proofErr w:type="gramStart"/>
+      <w:r/>
+      <w:proofErr w:type="gramEnd"/>
+      <w:r/>
     </w:p>
     <w:p>
       <w:pPr>
@@ -3118,19 +3095,7 @@
         <w:rPr>
           <w:szCs w:val="24"/>
         </w:rPr>
-        <w:t xml:space="preserve">for payment to Seller of those escrow items listed in paragraph 7. </w:t>
-      </w:r>
-      <w:r>
-        <w:rPr>
-          <w:szCs w:val="24"/>
-        </w:rPr>
-        <w:t xml:space="preserve">Purchaser </w:t>
-      </w:r>
-      <w:r>
-        <w:rPr>
-          <w:szCs w:val="24"/>
-        </w:rPr>
-        <w:t xml:space="preserve">shall be responsible for all </w:t>
+        <w:t xml:space="preserve">for payment to Seller of those escrow items listed in paragraph 7. Purchaser shall be responsible for all </w:t>
       </w:r>
       <w:r>
         <w:rPr>
@@ -3200,13 +3165,7 @@
         <w:rPr>
           <w:szCs w:val="28"/>
         </w:rPr>
-        <w:t>in its PRESENT AS IS CONDITION except as otherwise specified herein. Seller does hereby certify and represent that Seller has legal authority and capacity to convey the property with all improvements. Seller further certifies and represents that Seller knows of no latent defects to the property and knows of no facts materially affecting the value of the property except the following: Description of problems</w:t>
-      </w:r>
-      <w:r>
-        <w:rPr>
-          <w:szCs w:val="28"/>
-        </w:rPr>
-        <w:t xml:space="preserve">: </w:t>
+        <w:t xml:space="preserve">in its PRESENT AS IS CONDITION except as otherwise specified herein. Seller does hereby certify and represent that Seller has legal authority and capacity to convey the property with all improvements. Seller further certifies and represents that Seller knows of no latent defects to the property and knows of no facts materially affecting the value of the property except the following: Description of problems: </w:t>
       </w:r>
       <w:r>
         <w:rPr>
@@ -4084,12 +4043,6 @@
           <w:u w:val="single"/>
         </w:rPr>
         <w:tab/>
-      </w:r>
-      <w:r>
-        <w:rPr>
-          <w:szCs w:val="28"/>
-          <w:u w:val="single"/>
-        </w:rPr>
         <w:t xml:space="preserve">     </w:t>
       </w:r>
       <w:proofErr w:type="gramStart"/>
@@ -4706,13 +4659,11 @@
         <w:textAlignment w:val="baseline"/>
         <w:rPr>
           <w:rStyle w:val="normaltextrun"/>
-          <w:color w:val="000000"/>
         </w:rPr>
       </w:pPr>
       <w:r>
         <w:rPr>
           <w:rStyle w:val="normaltextrun"/>
-          <w:color w:val="000000"/>
         </w:rPr>
         <w:t xml:space="preserve">I, </w:t>
       </w:r>
@@ -4770,20 +4721,17 @@
         <w:textAlignment w:val="baseline"/>
         <w:rPr>
           <w:rFonts w:ascii="Segoe UI" w:hAnsi="Segoe UI" w:cs="Segoe UI"/>
-          <w:color w:val="000000"/>
         </w:rPr>
       </w:pPr>
       <w:r>
         <w:rPr>
           <w:rStyle w:val="normaltextrun"/>
-          <w:color w:val="000000"/>
         </w:rPr>
         <w:t>this the ____day of _________________, 2026.  </w:t>
       </w:r>
       <w:r>
         <w:rPr>
           <w:rStyle w:val="normaltextrun"/>
-          <w:color w:val="000000"/>
         </w:rPr>
         <w:tab/>
         <w:t>Notary Signature</w:t>
@@ -4791,49 +4739,42 @@
       <w:r>
         <w:rPr>
           <w:rStyle w:val="normaltextrun"/>
-          <w:color w:val="000000"/>
         </w:rPr>
         <w:tab/>
       </w:r>
       <w:r>
         <w:rPr>
           <w:rStyle w:val="normaltextrun"/>
-          <w:color w:val="000000"/>
         </w:rPr>
         <w:tab/>
       </w:r>
       <w:r>
         <w:rPr>
           <w:rStyle w:val="normaltextrun"/>
-          <w:color w:val="000000"/>
         </w:rPr>
         <w:tab/>
       </w:r>
       <w:r>
         <w:rPr>
           <w:rStyle w:val="normaltextrun"/>
-          <w:color w:val="000000"/>
         </w:rPr>
         <w:tab/>
       </w:r>
       <w:r>
         <w:rPr>
           <w:rStyle w:val="normaltextrun"/>
-          <w:color w:val="000000"/>
         </w:rPr>
         <w:tab/>
       </w:r>
       <w:r>
         <w:rPr>
           <w:rStyle w:val="normaltextrun"/>
-          <w:color w:val="000000"/>
         </w:rPr>
         <w:tab/>
       </w:r>
       <w:r>
         <w:rPr>
           <w:rStyle w:val="normaltextrun"/>
-          <w:color w:val="000000"/>
         </w:rPr>
         <w:tab/>
         <w:t xml:space="preserve"> </w:t>
@@ -4847,27 +4788,23 @@
         <w:textAlignment w:val="baseline"/>
         <w:rPr>
           <w:rFonts w:ascii="Segoe UI" w:hAnsi="Segoe UI" w:cs="Segoe UI"/>
-          <w:color w:val="000000"/>
         </w:rPr>
       </w:pPr>
       <w:r>
         <w:rPr>
           <w:rStyle w:val="normaltextrun"/>
-          <w:color w:val="000000"/>
         </w:rPr>
         <w:t>            </w:t>
       </w:r>
       <w:r>
         <w:rPr>
           <w:rStyle w:val="eop"/>
-          <w:color w:val="000000"/>
         </w:rPr>
         <w:t> </w:t>
       </w:r>
       <w:r>
         <w:rPr>
           <w:rStyle w:val="eop"/>
-          <w:color w:val="000000"/>
         </w:rPr>
         <w:tab/>
       </w:r>
@@ -4885,14 +4822,12 @@
         <w:textAlignment w:val="baseline"/>
         <w:rPr>
           <w:rStyle w:val="normaltextrun"/>
-          <w:color w:val="000000"/>
           <w:u w:val="single"/>
         </w:rPr>
       </w:pPr>
       <w:r>
         <w:rPr>
           <w:rStyle w:val="normaltextrun"/>
-          <w:color w:val="000000"/>
         </w:rPr>
         <w:t xml:space="preserve">Notary </w:t>
       </w:r>
@@ -4900,21 +4835,18 @@
       <w:r>
         <w:rPr>
           <w:rStyle w:val="normaltextrun"/>
-          <w:color w:val="000000"/>
         </w:rPr>
         <w:t>Public </w:t>
       </w:r>
       <w:r>
         <w:rPr>
           <w:rStyle w:val="eop"/>
-          <w:color w:val="000000"/>
         </w:rPr>
         <w:t> </w:t>
       </w:r>
       <w:r>
         <w:rPr>
           <w:rStyle w:val="normaltextrun"/>
-          <w:color w:val="000000"/>
         </w:rPr>
         <w:t>My</w:t>
       </w:r>
@@ -4922,21 +4854,18 @@
       <w:r>
         <w:rPr>
           <w:rStyle w:val="normaltextrun"/>
-          <w:color w:val="000000"/>
         </w:rPr>
         <w:t xml:space="preserve"> Commission expires:</w:t>
       </w:r>
       <w:r>
         <w:rPr>
           <w:rStyle w:val="normaltextrun"/>
-          <w:color w:val="000000"/>
         </w:rPr>
         <w:tab/>
       </w:r>
       <w:r>
         <w:rPr>
           <w:rStyle w:val="normaltextrun"/>
-          <w:color w:val="000000"/>
           <w:u w:val="single"/>
         </w:rPr>
         <w:tab/>
@@ -4944,7 +4873,6 @@
       <w:r>
         <w:rPr>
           <w:rStyle w:val="normaltextrun"/>
-          <w:color w:val="000000"/>
           <w:u w:val="single"/>
         </w:rPr>
         <w:tab/>
@@ -4952,7 +4880,6 @@
       <w:r>
         <w:rPr>
           <w:rStyle w:val="normaltextrun"/>
-          <w:color w:val="000000"/>
           <w:u w:val="single"/>
         </w:rPr>
         <w:tab/>
@@ -4960,7 +4887,6 @@
       <w:r>
         <w:rPr>
           <w:rStyle w:val="normaltextrun"/>
-          <w:color w:val="000000"/>
           <w:u w:val="single"/>
         </w:rPr>
         <w:tab/>
@@ -4968,7 +4894,6 @@
       <w:r>
         <w:rPr>
           <w:rStyle w:val="normaltextrun"/>
-          <w:color w:val="000000"/>
           <w:u w:val="single"/>
         </w:rPr>
         <w:tab/>
@@ -4987,7 +4912,6 @@
       <w:r>
         <w:rPr>
           <w:rStyle w:val="normaltextrun"/>
-          <w:color w:val="000000"/>
           <w:u w:val="single"/>
         </w:rPr>
         <w:br w:type="page"/>
@@ -5125,91 +5049,69 @@
         <w:spacing w:line="264" w:lineRule="auto"/>
         <w:jc w:val="both"/>
         <w:rPr>
-          <w:color w:val="C00000"/>
-          <w:szCs w:val="28"/>
-          <w:u w:val="single"/>
-        </w:rPr>
-      </w:pPr>
-      <w:r>
-        <w:rPr>
-          <w:szCs w:val="28"/>
-        </w:rPr>
-        <w:t>Seller’s Signature</w:t>
-      </w:r>
-      <w:r>
-        <w:rPr>
-          <w:color w:val="C00000"/>
-          <w:szCs w:val="28"/>
-        </w:rPr>
-        <w:t xml:space="preserve"> </w:t>
-      </w:r>
-      <w:r>
-        <w:rPr>
-          <w:color w:val="C00000"/>
-          <w:szCs w:val="28"/>
-        </w:rPr>
-        <w:tab/>
-      </w:r>
-      <w:r>
-        <w:rPr>
-          <w:color w:val="C00000"/>
-          <w:szCs w:val="28"/>
-        </w:rPr>
-        <w:tab/>
-      </w:r>
-      <w:r>
-        <w:rPr>
-          <w:color w:val="C00000"/>
-          <w:szCs w:val="28"/>
-        </w:rPr>
-        <w:tab/>
-      </w:r>
-      <w:r>
-        <w:rPr>
-          <w:color w:val="C00000"/>
-          <w:szCs w:val="28"/>
-        </w:rPr>
-        <w:tab/>
-      </w:r>
-      <w:r>
-        <w:rPr>
-          <w:color w:val="C00000"/>
-          <w:szCs w:val="28"/>
-        </w:rPr>
-        <w:tab/>
-      </w:r>
-      <w:r>
-        <w:rPr>
-          <w:color w:val="C00000"/>
-          <w:szCs w:val="28"/>
-        </w:rPr>
-        <w:tab/>
-      </w:r>
-      <w:r>
-        <w:rPr>
-          <w:color w:val="C00000"/>
-          <w:szCs w:val="28"/>
-        </w:rPr>
-        <w:tab/>
-      </w:r>
-      <w:r>
-        <w:rPr>
-          <w:color w:val="C00000"/>
-          <w:szCs w:val="28"/>
-        </w:rPr>
-        <w:tab/>
-      </w:r>
-      <w:r>
-        <w:rPr>
-          <w:color w:val="C00000"/>
-          <w:szCs w:val="28"/>
-        </w:rPr>
-        <w:tab/>
-      </w:r>
-      <w:r>
-        <w:rPr>
-          <w:szCs w:val="28"/>
-        </w:rPr>
+          <w:szCs w:val="28"/>
+          <w:u w:val="single"/>
+        </w:rPr>
+      </w:pPr>
+      <w:r>
+        <w:rPr>
+          <w:szCs w:val="28"/>
+        </w:rPr>
+        <w:t xml:space="preserve">Seller’s Signature </w:t>
+      </w:r>
+      <w:r>
+        <w:rPr>
+          <w:szCs w:val="28"/>
+        </w:rPr>
+        <w:tab/>
+      </w:r>
+      <w:r>
+        <w:rPr>
+          <w:szCs w:val="28"/>
+        </w:rPr>
+        <w:tab/>
+      </w:r>
+      <w:r>
+        <w:rPr>
+          <w:szCs w:val="28"/>
+        </w:rPr>
+        <w:tab/>
+      </w:r>
+      <w:r>
+        <w:rPr>
+          <w:szCs w:val="28"/>
+        </w:rPr>
+        <w:tab/>
+      </w:r>
+      <w:r>
+        <w:rPr>
+          <w:szCs w:val="28"/>
+        </w:rPr>
+        <w:tab/>
+      </w:r>
+      <w:r>
+        <w:rPr>
+          <w:szCs w:val="28"/>
+        </w:rPr>
+        <w:tab/>
+      </w:r>
+      <w:r>
+        <w:rPr>
+          <w:szCs w:val="28"/>
+        </w:rPr>
+        <w:tab/>
+      </w:r>
+      <w:r>
+        <w:rPr>
+          <w:szCs w:val="28"/>
+        </w:rPr>
+        <w:tab/>
+      </w:r>
+      <w:r>
+        <w:rPr>
+          <w:szCs w:val="28"/>
+        </w:rPr>
+        <w:tab/>
         <w:t>Date of Offer</w:t>
       </w:r>
     </w:p>
@@ -5232,7 +5134,6 @@
       </w:pPr>
       <w:r>
         <w:rPr>
-          <w:color w:val="C00000"/>
           <w:szCs w:val="28"/>
           <w:u w:val="single"/>
         </w:rPr>
@@ -5243,7 +5144,6 @@
       <w:pPr>
         <w:rPr>
           <w:b/>
-          <w:color w:val="0000FF"/>
         </w:rPr>
       </w:pPr>
     </w:p>
@@ -5278,7 +5178,6 @@
       <w:proofErr w:type="gramStart"/>
       <w:r>
         <w:rPr>
-          <w:color w:val="C00000"/>
           <w:szCs w:val="28"/>
         </w:rPr>
         <w:t>[ ] Agent   [X] Seller, by the signature below, acknowledge receipt of $6,000.00 [  ] Cash   [   ] Check, as earnest money deposit, which is credited toward the total down payment mentioned in paragraph 1A of this Agreement. The remaining down payment balance of $13,800.00 shall be paid at closing.</w:t>
@@ -5286,63 +5185,54 @@
       <w:proofErr w:type="gramEnd"/>
       <w:r>
         <w:rPr>
-          <w:color w:val="C00000"/>
           <w:szCs w:val="28"/>
         </w:rPr>
       </w:r>
       <w:proofErr w:type="gramStart"/>
       <w:r>
         <w:rPr>
-          <w:color w:val="C00000"/>
           <w:szCs w:val="28"/>
         </w:rPr>
       </w:r>
       <w:proofErr w:type="gramEnd"/>
       <w:r>
         <w:rPr>
-          <w:color w:val="C00000"/>
           <w:szCs w:val="28"/>
         </w:rPr>
       </w:r>
       <w:proofErr w:type="gramStart"/>
       <w:r>
         <w:rPr>
-          <w:color w:val="C00000"/>
           <w:szCs w:val="28"/>
         </w:rPr>
       </w:r>
       <w:proofErr w:type="gramEnd"/>
       <w:r>
         <w:rPr>
-          <w:color w:val="C00000"/>
           <w:szCs w:val="28"/>
         </w:rPr>
       </w:r>
       <w:proofErr w:type="gramStart"/>
       <w:r>
         <w:rPr>
-          <w:color w:val="C00000"/>
           <w:szCs w:val="28"/>
         </w:rPr>
       </w:r>
       <w:proofErr w:type="gramEnd"/>
       <w:r>
         <w:rPr>
-          <w:color w:val="C00000"/>
           <w:szCs w:val="28"/>
         </w:rPr>
       </w:r>
       <w:proofErr w:type="gramStart"/>
       <w:r>
         <w:rPr>
-          <w:color w:val="C00000"/>
           <w:szCs w:val="28"/>
         </w:rPr>
       </w:r>
       <w:proofErr w:type="gramEnd"/>
       <w:r>
         <w:rPr>
-          <w:color w:val="C00000"/>
           <w:szCs w:val="28"/>
         </w:rPr>
       </w:r>
@@ -5523,34 +5413,29 @@
         <w:textAlignment w:val="baseline"/>
         <w:rPr>
           <w:rFonts w:ascii="Segoe UI" w:hAnsi="Segoe UI" w:cs="Segoe UI"/>
-          <w:color w:val="000000"/>
         </w:rPr>
       </w:pPr>
       <w:r>
         <w:rPr>
           <w:rStyle w:val="normaltextrun"/>
-          <w:color w:val="000000"/>
         </w:rPr>
         <w:t xml:space="preserve">Under penalty of perjury, </w:t>
       </w:r>
       <w:r>
         <w:rPr>
           <w:rStyle w:val="normaltextrun"/>
-          <w:color w:val="000000"/>
         </w:rPr>
         <w:t>Seller/</w:t>
       </w:r>
       <w:r>
         <w:rPr>
           <w:rStyle w:val="normaltextrun"/>
-          <w:color w:val="000000"/>
         </w:rPr>
         <w:t>Affiant declares that he/she has examined this Affidavit and that to the best of his/his personal knowledge and belief, the contents of said Affidavit are true and correct. </w:t>
       </w:r>
       <w:r>
         <w:rPr>
           <w:rStyle w:val="eop"/>
-          <w:color w:val="000000"/>
         </w:rPr>
         <w:t> </w:t>
       </w:r>
@@ -5562,20 +5447,17 @@
         <w:textAlignment w:val="baseline"/>
         <w:rPr>
           <w:rFonts w:ascii="Segoe UI" w:hAnsi="Segoe UI" w:cs="Segoe UI"/>
-          <w:color w:val="000000"/>
         </w:rPr>
       </w:pPr>
       <w:r>
         <w:rPr>
           <w:rStyle w:val="normaltextrun"/>
-          <w:color w:val="000000"/>
         </w:rPr>
         <w:t xml:space="preserve">This _____ day of   </w:t>
       </w:r>
       <w:r>
         <w:rPr>
           <w:rStyle w:val="normaltextrun"/>
-          <w:color w:val="000000"/>
           <w:u w:val="single"/>
         </w:rPr>
         <w:tab/>
@@ -5583,7 +5465,6 @@
       <w:r>
         <w:rPr>
           <w:rStyle w:val="normaltextrun"/>
-          <w:color w:val="000000"/>
           <w:u w:val="single"/>
         </w:rPr>
         <w:tab/>
@@ -5591,7 +5472,6 @@
       <w:r>
         <w:rPr>
           <w:rStyle w:val="normaltextrun"/>
-          <w:color w:val="000000"/>
           <w:u w:val="single"/>
         </w:rPr>
         <w:tab/>
@@ -5599,21 +5479,18 @@
       <w:r>
         <w:rPr>
           <w:rStyle w:val="normaltextrun"/>
-          <w:color w:val="000000"/>
         </w:rPr>
         <w:t>,</w:t>
       </w:r>
       <w:r>
         <w:rPr>
           <w:rStyle w:val="normaltextrun"/>
-          <w:color w:val="000000"/>
         </w:rPr>
         <w:t xml:space="preserve"> 2026.</w:t>
       </w:r>
       <w:r>
         <w:rPr>
           <w:rStyle w:val="normaltextrun"/>
-          <w:color w:val="000000"/>
         </w:rPr>
         <w:tab/>
       </w:r>
@@ -5625,34 +5502,29 @@
         <w:textAlignment w:val="baseline"/>
         <w:rPr>
           <w:rFonts w:ascii="Segoe UI" w:hAnsi="Segoe UI" w:cs="Segoe UI"/>
-          <w:color w:val="000000"/>
         </w:rPr>
       </w:pPr>
       <w:r>
         <w:rPr>
           <w:rStyle w:val="normaltextrun"/>
-          <w:color w:val="000000"/>
         </w:rPr>
         <w:t> </w:t>
       </w:r>
       <w:r>
         <w:rPr>
           <w:rStyle w:val="eop"/>
-          <w:color w:val="000000"/>
         </w:rPr>
         <w:t> </w:t>
       </w:r>
       <w:r>
         <w:rPr>
           <w:rStyle w:val="normaltextrun"/>
-          <w:color w:val="000000"/>
         </w:rPr>
         <w:t> </w:t>
       </w:r>
       <w:r>
         <w:rPr>
           <w:rStyle w:val="eop"/>
-          <w:color w:val="000000"/>
         </w:rPr>
         <w:t> </w:t>
       </w:r>
@@ -5664,34 +5536,29 @@
         <w:textAlignment w:val="baseline"/>
         <w:rPr>
           <w:rStyle w:val="normaltextrun"/>
-          <w:color w:val="000000"/>
         </w:rPr>
       </w:pPr>
       <w:r>
         <w:rPr>
           <w:rStyle w:val="normaltextrun"/>
-          <w:color w:val="000000"/>
         </w:rPr>
         <w:t> </w:t>
       </w:r>
       <w:r>
         <w:rPr>
           <w:rStyle w:val="normaltextrun"/>
-          <w:color w:val="000000"/>
         </w:rPr>
         <w:softHyphen/>
       </w:r>
       <w:r>
         <w:rPr>
           <w:rStyle w:val="normaltextrun"/>
-          <w:color w:val="000000"/>
         </w:rPr>
         <w:softHyphen/>
       </w:r>
       <w:r>
         <w:rPr>
           <w:rStyle w:val="normaltextrun"/>
-          <w:color w:val="000000"/>
           <w:u w:val="single"/>
         </w:rPr>
         <w:softHyphen/>
@@ -5699,7 +5566,6 @@
       <w:r>
         <w:rPr>
           <w:rStyle w:val="normaltextrun"/>
-          <w:color w:val="000000"/>
           <w:u w:val="single"/>
         </w:rPr>
         <w:tab/>
@@ -5707,7 +5573,6 @@
       <w:r>
         <w:rPr>
           <w:rStyle w:val="normaltextrun"/>
-          <w:color w:val="000000"/>
           <w:u w:val="single"/>
         </w:rPr>
         <w:tab/>
@@ -5715,7 +5580,6 @@
       <w:r>
         <w:rPr>
           <w:rStyle w:val="normaltextrun"/>
-          <w:color w:val="000000"/>
           <w:u w:val="single"/>
         </w:rPr>
         <w:tab/>
@@ -5723,7 +5587,6 @@
       <w:r>
         <w:rPr>
           <w:rStyle w:val="normaltextrun"/>
-          <w:color w:val="000000"/>
           <w:u w:val="single"/>
         </w:rPr>
         <w:tab/>
@@ -5731,7 +5594,6 @@
       <w:r>
         <w:rPr>
           <w:rStyle w:val="normaltextrun"/>
-          <w:color w:val="000000"/>
           <w:u w:val="single"/>
         </w:rPr>
         <w:tab/>
@@ -5740,14 +5602,12 @@
       <w:r>
         <w:rPr>
           <w:rStyle w:val="normaltextrun"/>
-          <w:color w:val="000000"/>
         </w:rPr>
         <w:t xml:space="preserve"> </w:t>
       </w:r>
       <w:r>
         <w:rPr>
           <w:rStyle w:val="normaltextrun"/>
-          <w:color w:val="000000"/>
         </w:rPr>
         <w:tab/>
         <w:t>(Affiant) </w:t>
@@ -5822,13 +5682,11 @@
         <w:textAlignment w:val="baseline"/>
         <w:rPr>
           <w:rFonts w:ascii="Segoe UI" w:hAnsi="Segoe UI" w:cs="Segoe UI"/>
-          <w:color w:val="000000"/>
         </w:rPr>
       </w:pPr>
       <w:r>
         <w:rPr>
           <w:rStyle w:val="eop"/>
-          <w:color w:val="000000"/>
         </w:rPr>
         <w:t> </w:t>
       </w:r>
@@ -5840,13 +5698,11 @@
         <w:textAlignment w:val="baseline"/>
         <w:rPr>
           <w:rStyle w:val="normaltextrun"/>
-          <w:color w:val="000000"/>
         </w:rPr>
       </w:pPr>
       <w:r>
         <w:rPr>
           <w:rStyle w:val="normaltextrun"/>
-          <w:color w:val="000000"/>
         </w:rPr>
         <w:t xml:space="preserve">I, </w:t>
       </w:r>
@@ -5897,7 +5753,6 @@
         <w:textAlignment w:val="baseline"/>
         <w:rPr>
           <w:rStyle w:val="normaltextrun"/>
-          <w:color w:val="000000"/>
         </w:rPr>
       </w:pPr>
     </w:p>
@@ -5908,14 +5763,12 @@
         <w:textAlignment w:val="baseline"/>
         <w:rPr>
           <w:noProof/>
-          <w:color w:val="C00000"/>
           <w:u w:val="single"/>
         </w:rPr>
       </w:pPr>
       <w:r>
         <w:rPr>
           <w:noProof/>
-          <w:color w:val="C00000"/>
           <w:u w:val="single"/>
         </w:rPr>
         <w:t>Wes Browning, Manager of Investment Services LLC, Trustee of 320 Rose Pl Real Estate Trust dated March, 5 2025,</w:t>
@@ -5932,7 +5785,6 @@
         <w:textAlignment w:val="baseline"/>
         <w:rPr>
           <w:rStyle w:val="normaltextrun"/>
-          <w:color w:val="000000"/>
         </w:rPr>
       </w:pPr>
     </w:p>
@@ -5943,20 +5795,17 @@
         <w:textAlignment w:val="baseline"/>
         <w:rPr>
           <w:rStyle w:val="eop"/>
-          <w:color w:val="000000"/>
         </w:rPr>
       </w:pPr>
       <w:r>
         <w:rPr>
           <w:rStyle w:val="normaltextrun"/>
-          <w:color w:val="000000"/>
         </w:rPr>
         <w:t>this the ____day of _________________, 2026.  </w:t>
       </w:r>
       <w:r>
         <w:rPr>
           <w:rStyle w:val="normaltextrun"/>
-          <w:color w:val="000000"/>
         </w:rPr>
         <w:tab/>
       </w:r>
@@ -5968,7 +5817,6 @@
         <w:textAlignment w:val="baseline"/>
         <w:rPr>
           <w:rStyle w:val="eop"/>
-          <w:color w:val="000000"/>
         </w:rPr>
       </w:pPr>
     </w:p>
@@ -5979,20 +5827,17 @@
         <w:textAlignment w:val="baseline"/>
         <w:rPr>
           <w:rFonts w:ascii="Segoe UI" w:hAnsi="Segoe UI" w:cs="Segoe UI"/>
-          <w:color w:val="000000"/>
         </w:rPr>
       </w:pPr>
       <w:r>
         <w:rPr>
           <w:rStyle w:val="eop"/>
-          <w:color w:val="000000"/>
         </w:rPr>
         <w:t>Notary Signature</w:t>
       </w:r>
       <w:r>
         <w:rPr>
           <w:rStyle w:val="eop"/>
-          <w:color w:val="000000"/>
           <w:u w:val="single"/>
         </w:rPr>
         <w:tab/>
@@ -6000,7 +5845,6 @@
       <w:r>
         <w:rPr>
           <w:rStyle w:val="eop"/>
-          <w:color w:val="000000"/>
           <w:u w:val="single"/>
         </w:rPr>
         <w:tab/>
@@ -6008,7 +5852,6 @@
       <w:r>
         <w:rPr>
           <w:rStyle w:val="eop"/>
-          <w:color w:val="000000"/>
           <w:u w:val="single"/>
         </w:rPr>
         <w:tab/>
@@ -6016,7 +5859,6 @@
       <w:r>
         <w:rPr>
           <w:rStyle w:val="eop"/>
-          <w:color w:val="000000"/>
           <w:u w:val="single"/>
         </w:rPr>
         <w:tab/>
@@ -6024,7 +5866,6 @@
       <w:r>
         <w:rPr>
           <w:rStyle w:val="eop"/>
-          <w:color w:val="000000"/>
           <w:u w:val="single"/>
         </w:rPr>
         <w:tab/>
@@ -6032,7 +5873,6 @@
       <w:r>
         <w:rPr>
           <w:rStyle w:val="eop"/>
-          <w:color w:val="000000"/>
           <w:u w:val="single"/>
         </w:rPr>
         <w:tab/>
@@ -6040,7 +5880,6 @@
       <w:r>
         <w:rPr>
           <w:rStyle w:val="eop"/>
-          <w:color w:val="000000"/>
           <w:u w:val="single"/>
         </w:rPr>
         <w:tab/>
@@ -6048,7 +5887,6 @@
       <w:r>
         <w:rPr>
           <w:rStyle w:val="eop"/>
-          <w:color w:val="000000"/>
           <w:u w:val="single"/>
         </w:rPr>
         <w:tab/>
@@ -6056,7 +5894,6 @@
       <w:r>
         <w:rPr>
           <w:rStyle w:val="eop"/>
-          <w:color w:val="000000"/>
           <w:u w:val="single"/>
         </w:rPr>
         <w:tab/>
@@ -6064,7 +5901,6 @@
       <w:r>
         <w:rPr>
           <w:rStyle w:val="eop"/>
-          <w:color w:val="000000"/>
           <w:u w:val="single"/>
         </w:rPr>
         <w:tab/>
@@ -6078,27 +5914,23 @@
         <w:textAlignment w:val="baseline"/>
         <w:rPr>
           <w:rFonts w:ascii="Segoe UI" w:hAnsi="Segoe UI" w:cs="Segoe UI"/>
-          <w:color w:val="000000"/>
         </w:rPr>
       </w:pPr>
       <w:r>
         <w:rPr>
           <w:rStyle w:val="normaltextrun"/>
-          <w:color w:val="000000"/>
         </w:rPr>
         <w:t>            </w:t>
       </w:r>
       <w:r>
         <w:rPr>
           <w:rStyle w:val="eop"/>
-          <w:color w:val="000000"/>
         </w:rPr>
         <w:t> </w:t>
       </w:r>
       <w:r>
         <w:rPr>
           <w:rStyle w:val="eop"/>
-          <w:color w:val="000000"/>
         </w:rPr>
         <w:tab/>
       </w:r>
@@ -6115,13 +5947,11 @@
         <w:textAlignment w:val="baseline"/>
         <w:rPr>
           <w:rStyle w:val="normaltextrun"/>
-          <w:color w:val="000000"/>
         </w:rPr>
       </w:pPr>
       <w:r>
         <w:rPr>
           <w:rStyle w:val="normaltextrun"/>
-          <w:color w:val="000000"/>
         </w:rPr>
         <w:t xml:space="preserve">Notary </w:t>
       </w:r>
@@ -6129,21 +5959,18 @@
       <w:r>
         <w:rPr>
           <w:rStyle w:val="normaltextrun"/>
-          <w:color w:val="000000"/>
         </w:rPr>
         <w:t>Public </w:t>
       </w:r>
       <w:r>
         <w:rPr>
           <w:rStyle w:val="eop"/>
-          <w:color w:val="000000"/>
         </w:rPr>
         <w:t> </w:t>
       </w:r>
       <w:r>
         <w:rPr>
           <w:rStyle w:val="normaltextrun"/>
-          <w:color w:val="000000"/>
         </w:rPr>
         <w:t>My</w:t>
       </w:r>
@@ -6151,21 +5978,18 @@
       <w:r>
         <w:rPr>
           <w:rStyle w:val="normaltextrun"/>
-          <w:color w:val="000000"/>
         </w:rPr>
         <w:t xml:space="preserve"> Commission expires:</w:t>
       </w:r>
       <w:r>
         <w:rPr>
           <w:rStyle w:val="normaltextrun"/>
-          <w:color w:val="000000"/>
         </w:rPr>
         <w:tab/>
       </w:r>
       <w:r>
         <w:rPr>
           <w:rStyle w:val="normaltextrun"/>
-          <w:color w:val="000000"/>
           <w:u w:val="single"/>
         </w:rPr>
         <w:tab/>
@@ -6173,7 +5997,6 @@
       <w:r>
         <w:rPr>
           <w:rStyle w:val="normaltextrun"/>
-          <w:color w:val="000000"/>
           <w:u w:val="single"/>
         </w:rPr>
         <w:tab/>
@@ -6181,7 +6004,6 @@
       <w:r>
         <w:rPr>
           <w:rStyle w:val="normaltextrun"/>
-          <w:color w:val="000000"/>
           <w:u w:val="single"/>
         </w:rPr>
         <w:tab/>
@@ -6189,7 +6011,6 @@
       <w:r>
         <w:rPr>
           <w:rStyle w:val="normaltextrun"/>
-          <w:color w:val="000000"/>
           <w:u w:val="single"/>
         </w:rPr>
         <w:tab/>
@@ -6197,7 +6018,6 @@
       <w:r>
         <w:rPr>
           <w:rStyle w:val="normaltextrun"/>
-          <w:color w:val="000000"/>
           <w:u w:val="single"/>
         </w:rPr>
         <w:tab/>
@@ -8482,7 +8302,15 @@
 </file>
 
 <file path=customXml/item2.xml><?xml version="1.0" encoding="utf-8"?>
-<b:Sources xmlns:b="http://schemas.openxmlformats.org/officeDocument/2006/bibliography" xmlns="http://schemas.openxmlformats.org/officeDocument/2006/bibliography" SelectedStyle="\APASixthEditionOfficeOnline.xsl" StyleName="APA" Version="6"/>
+<p:properties xmlns:p="http://schemas.microsoft.com/office/2006/metadata/properties" xmlns:xsi="http://www.w3.org/2001/XMLSchema-instance" xmlns:pc="http://schemas.microsoft.com/office/infopath/2007/PartnerControls">
+  <documentManagement>
+    <TaxCatchAll xmlns="42cc25d9-27fe-4f07-accb-ded05ec47eee" xsi:nil="true"/>
+    <lcf76f155ced4ddcb4097134ff3c332f xmlns="ab9fedca-001d-4cc9-b244-d9c3be5a27d3">
+      <Terms xmlns="http://schemas.microsoft.com/office/infopath/2007/PartnerControls"/>
+    </lcf76f155ced4ddcb4097134ff3c332f>
+    <_Flow_SignoffStatus xmlns="ab9fedca-001d-4cc9-b244-d9c3be5a27d3" xsi:nil="true"/>
+  </documentManagement>
+</p:properties>
 </file>
 
 <file path=customXml/item3.xml><?xml version="1.0" encoding="utf-8"?>
@@ -8747,15 +8575,7 @@
 </file>
 
 <file path=customXml/item4.xml><?xml version="1.0" encoding="utf-8"?>
-<p:properties xmlns:p="http://schemas.microsoft.com/office/2006/metadata/properties" xmlns:xsi="http://www.w3.org/2001/XMLSchema-instance" xmlns:pc="http://schemas.microsoft.com/office/infopath/2007/PartnerControls">
-  <documentManagement>
-    <TaxCatchAll xmlns="42cc25d9-27fe-4f07-accb-ded05ec47eee" xsi:nil="true"/>
-    <lcf76f155ced4ddcb4097134ff3c332f xmlns="ab9fedca-001d-4cc9-b244-d9c3be5a27d3">
-      <Terms xmlns="http://schemas.microsoft.com/office/infopath/2007/PartnerControls"/>
-    </lcf76f155ced4ddcb4097134ff3c332f>
-    <_Flow_SignoffStatus xmlns="ab9fedca-001d-4cc9-b244-d9c3be5a27d3" xsi:nil="true"/>
-  </documentManagement>
-</p:properties>
+<b:Sources xmlns:b="http://schemas.openxmlformats.org/officeDocument/2006/bibliography" xmlns="http://schemas.openxmlformats.org/officeDocument/2006/bibliography" SelectedStyle="\APASixthEditionOfficeOnline.xsl" StyleName="APA" Version="6"/>
 </file>
 
 <file path=customXml/itemProps1.xml><?xml version="1.0" encoding="utf-8"?>
@@ -8767,9 +8587,12 @@
 </file>
 
 <file path=customXml/itemProps2.xml><?xml version="1.0" encoding="utf-8"?>
-<ds:datastoreItem xmlns:ds="http://schemas.openxmlformats.org/officeDocument/2006/customXml" ds:itemID="{3679C442-D341-425F-8964-A65FCEFD3D9B}">
+<ds:datastoreItem xmlns:ds="http://schemas.openxmlformats.org/officeDocument/2006/customXml" ds:itemID="{1A4736DD-7889-4919-A280-9BE82A810A58}">
   <ds:schemaRefs>
-    <ds:schemaRef ds:uri="http://schemas.openxmlformats.org/officeDocument/2006/bibliography"/>
+    <ds:schemaRef ds:uri="http://schemas.microsoft.com/office/2006/metadata/properties"/>
+    <ds:schemaRef ds:uri="http://schemas.microsoft.com/office/infopath/2007/PartnerControls"/>
+    <ds:schemaRef ds:uri="42cc25d9-27fe-4f07-accb-ded05ec47eee"/>
+    <ds:schemaRef ds:uri="ab9fedca-001d-4cc9-b244-d9c3be5a27d3"/>
   </ds:schemaRefs>
 </ds:datastoreItem>
 </file>
@@ -8794,12 +8617,9 @@
 </file>
 
 <file path=customXml/itemProps4.xml><?xml version="1.0" encoding="utf-8"?>
-<ds:datastoreItem xmlns:ds="http://schemas.openxmlformats.org/officeDocument/2006/customXml" ds:itemID="{1A4736DD-7889-4919-A280-9BE82A810A58}">
+<ds:datastoreItem xmlns:ds="http://schemas.openxmlformats.org/officeDocument/2006/customXml" ds:itemID="{3679C442-D341-425F-8964-A65FCEFD3D9B}">
   <ds:schemaRefs>
-    <ds:schemaRef ds:uri="http://schemas.microsoft.com/office/2006/metadata/properties"/>
-    <ds:schemaRef ds:uri="http://schemas.microsoft.com/office/infopath/2007/PartnerControls"/>
-    <ds:schemaRef ds:uri="42cc25d9-27fe-4f07-accb-ded05ec47eee"/>
-    <ds:schemaRef ds:uri="ab9fedca-001d-4cc9-b244-d9c3be5a27d3"/>
+    <ds:schemaRef ds:uri="http://schemas.openxmlformats.org/officeDocument/2006/bibliography"/>
   </ds:schemaRefs>
 </ds:datastoreItem>
 </file>
</xml_diff>

<commit_message>
Regenerate Rose contract package
</commit_message>
<xml_diff>
--- a/Project Rooms/Contract for Deed/output/320 Rose - Contract for Deed Agreement - DRAFT.docx
+++ b/Project Rooms/Contract for Deed/output/320 Rose - Contract for Deed Agreement - DRAFT.docx
@@ -772,7 +772,7 @@
                 <w:sz w:val="24"/>
                 <w:szCs w:val="24"/>
               </w:rPr>
-              <w:t>13,800.00</w:t>
+              <w:t>14,790.00</w:t>
             </w:r>
           </w:p>
         </w:tc>
@@ -1004,7 +1004,7 @@
               <w:jc w:val="right"/>
             </w:pPr>
             <w:r>
-              <w:t>310,200.00</w:t>
+              <w:t>325,710.00</w:t>
             </w:r>
           </w:p>
         </w:tc>
@@ -1100,7 +1100,7 @@
               <w:jc w:val="right"/>
             </w:pPr>
             <w:r>
-              <w:t>330,000.00</w:t>
+              <w:t>346,500.00</w:t>
             </w:r>
           </w:p>
         </w:tc>
@@ -2445,7 +2445,7 @@
         </w:rPr>
         <w:t>Principal and Interest:</w:t>
         <w:tab/>
-        <w:t>2,385.17</w:t>
+        <w:t>2,504.43</w:t>
       </w:r>
       <w:r>
         <w:rPr>
@@ -2605,7 +2605,7 @@
         </w:rPr>
         <w:t>Total Monthly Payment:</w:t>
         <w:tab/>
-        <w:t>2,581.77</w:t>
+        <w:t>2,701.03</w:t>
       </w:r>
       <w:r>
         <w:rPr>
@@ -4697,6 +4697,14 @@
         <w:rPr>
           <w:u w:val="single"/>
         </w:rPr>
+      </w:r>
+      <w:r/>
+      <w:r/>
+      <w:r/>
+      <w:r>
+        <w:rPr>
+          <w:u w:val="single"/>
+        </w:rPr>
         <w:tab/>
         <w:tab/>
         <w:tab/>
@@ -5180,7 +5188,7 @@
         <w:rPr>
           <w:szCs w:val="28"/>
         </w:rPr>
-        <w:t>[ ] Agent   [X] Seller, by the signature below, acknowledge receipt of $6,000.00 [  ] Cash   [   ] Check, as earnest money deposit, which is credited toward the total down payment mentioned in paragraph 1A of this Agreement. The remaining down payment balance of $13,800.00 shall be paid at closing.</w:t>
+        <w:t>[ ] Agent   [X] Seller, by the signature below, acknowledge receipt of $6,000.00 [  ] Cash   [   ] Check, as earnest money deposit, which is credited toward the total down payment mentioned in paragraph 1A of this Agreement. The remaining down payment balance of $14,790.00 shall be paid at closing.</w:t>
       </w:r>
       <w:proofErr w:type="gramEnd"/>
       <w:r>
@@ -5736,6 +5744,12 @@
         <w:rPr>
           <w:u w:val="single"/>
         </w:rPr>
+      </w:r>
+      <w:r/>
+      <w:r>
+        <w:rPr>
+          <w:u w:val="single"/>
+        </w:rPr>
         <w:tab/>
         <w:tab/>
         <w:tab/>
@@ -5773,6 +5787,7 @@
         </w:rPr>
         <w:t>Wes Browning, Manager of Investment Services LLC, Trustee of 320 Rose Pl Real Estate Trust dated March, 5 2025,</w:t>
       </w:r>
+      <w:r/>
       <w:r/>
       <w:r>
         <w:t xml:space="preserve"> personally appeared before me this day and acknowledged the execution of the foregoing instrument.  Witness my hand and notarial seal,</w:t>

</xml_diff>

<commit_message>
Refresh Rose package with lien disclosures
</commit_message>
<xml_diff>
--- a/Project Rooms/Contract for Deed/output/320 Rose - Contract for Deed Agreement - DRAFT.docx
+++ b/Project Rooms/Contract for Deed/output/320 Rose - Contract for Deed Agreement - DRAFT.docx
@@ -2847,7 +2847,11 @@
         </w:rPr>
       </w:pPr>
       <w:r>
-        <w:t>NOTE FOR ATTORNEY REVIEW: Confirm whether any pending orders, liens, adverse conditions, title matters, or required disclosures should be listed here before signing.</w:t>
+        <w:t>1st mortgage to Shellpoint of 122,713.02</w:t>
+        <w:br/>
+        <w:t>Defered Balance of 54,532.00</w:t>
+        <w:br/>
+        <w:t>A lien to attorneys of 100,000</w:t>
       </w:r>
       <w:proofErr w:type="gramStart"/>
       <w:r/>
@@ -4705,6 +4709,14 @@
         <w:rPr>
           <w:u w:val="single"/>
         </w:rPr>
+      </w:r>
+      <w:r/>
+      <w:r/>
+      <w:r/>
+      <w:r>
+        <w:rPr>
+          <w:u w:val="single"/>
+        </w:rPr>
         <w:tab/>
         <w:tab/>
         <w:tab/>
@@ -5750,6 +5762,12 @@
         <w:rPr>
           <w:u w:val="single"/>
         </w:rPr>
+      </w:r>
+      <w:r/>
+      <w:r>
+        <w:rPr>
+          <w:u w:val="single"/>
+        </w:rPr>
         <w:tab/>
         <w:tab/>
         <w:tab/>
@@ -5787,6 +5805,7 @@
         </w:rPr>
         <w:t>Wes Browning, Manager of Investment Services LLC, Trustee of 320 Rose Pl Real Estate Trust dated March, 5 2025,</w:t>
       </w:r>
+      <w:r/>
       <w:r/>
       <w:r/>
       <w:r>

</xml_diff>

<commit_message>
Format contract installment values table
</commit_message>
<xml_diff>
--- a/Project Rooms/Contract for Deed/output/320 Rose - Contract for Deed Agreement - DRAFT.docx
+++ b/Project Rooms/Contract for Deed/output/320 Rose - Contract for Deed Agreement - DRAFT.docx
@@ -113,20 +113,7 @@
           <w:szCs w:val="28"/>
         </w:rPr>
         <w:tab/>
-      </w:r>
-      <w:proofErr w:type="gramStart"/>
-      <w:r>
-        <w:rPr>
-          <w:szCs w:val="28"/>
-        </w:rPr>
-        <w:t>Whose</w:t>
-      </w:r>
-      <w:proofErr w:type="gramEnd"/>
-      <w:r>
-        <w:rPr>
-          <w:szCs w:val="28"/>
-        </w:rPr>
-        <w:t xml:space="preserve"> principal address is:</w:t>
+        <w:t>Whose principal address is:</w:t>
       </w:r>
     </w:p>
     <w:p>
@@ -568,11 +555,6 @@
         </w:rPr>
         <w:tab/>
         <w:t>County of: Wake</w:t>
-      </w:r>
-      <w:r>
-        <w:rPr>
-          <w:szCs w:val="28"/>
-        </w:rPr>
       </w:r>
     </w:p>
     <w:p>
@@ -1326,21 +1308,7 @@
         <w:rPr>
           <w:szCs w:val="24"/>
         </w:rPr>
-        <w:t xml:space="preserve">Existing mortgage balance encumbering the Property to </w:t>
-      </w:r>
-      <w:proofErr w:type="gramStart"/>
-      <w:r>
-        <w:rPr>
-          <w:szCs w:val="24"/>
-        </w:rPr>
-        <w:t>be taken</w:t>
-      </w:r>
-      <w:proofErr w:type="gramEnd"/>
-      <w:r>
-        <w:rPr>
-          <w:szCs w:val="24"/>
-        </w:rPr>
-        <w:t xml:space="preserve"> subject to by Purchaser (approximately).                     </w:t>
+        <w:t xml:space="preserve">Existing mortgage balance encumbering the Property to be taken subject to by Purchaser (approximately).                     </w:t>
       </w:r>
       <w:r>
         <w:rPr>
@@ -1374,21 +1342,7 @@
         <w:rPr>
           <w:szCs w:val="24"/>
         </w:rPr>
-        <w:t xml:space="preserve">Total Purchase </w:t>
-      </w:r>
-      <w:proofErr w:type="gramStart"/>
-      <w:r>
-        <w:rPr>
-          <w:szCs w:val="24"/>
-        </w:rPr>
-        <w:t>Price  -</w:t>
-      </w:r>
-      <w:proofErr w:type="gramEnd"/>
-      <w:r>
-        <w:rPr>
-          <w:szCs w:val="24"/>
-        </w:rPr>
-        <w:t xml:space="preserve"> exactly</w:t>
+        <w:t>Total Purchase Price  - exactly</w:t>
       </w:r>
       <w:r>
         <w:rPr>
@@ -1448,21 +1402,7 @@
         <w:rPr>
           <w:szCs w:val="28"/>
         </w:rPr>
-        <w:t xml:space="preserve">Purchaser agrees to provide </w:t>
-      </w:r>
-      <w:proofErr w:type="gramStart"/>
-      <w:r>
-        <w:rPr>
-          <w:szCs w:val="28"/>
-        </w:rPr>
-        <w:t>an additional</w:t>
-      </w:r>
-      <w:proofErr w:type="gramEnd"/>
-      <w:r>
-        <w:rPr>
-          <w:szCs w:val="28"/>
-        </w:rPr>
-        <w:t xml:space="preserve"> charges and fees associated with the recording of a Memorandum of (this) Contract for Deed and administrative costs of the Seller</w:t>
+        <w:t>Purchaser agrees to provide an additional charges and fees associated with the recording of a Memorandum of (this) Contract for Deed and administrative costs of the Seller</w:t>
       </w:r>
       <w:r>
         <w:rPr>
@@ -1591,14 +1531,7 @@
         <w:rPr>
           <w:szCs w:val="28"/>
         </w:rPr>
-        <w:t xml:space="preserve"> Wood Destroying Organism </w:t>
-      </w:r>
-      <w:proofErr w:type="gramStart"/>
-      <w:r>
-        <w:rPr>
-          <w:szCs w:val="28"/>
-        </w:rPr>
-        <w:t xml:space="preserve">Report </w:t>
+        <w:t xml:space="preserve"> Wood Destroying Organism Report </w:t>
       </w:r>
       <w:r>
         <w:rPr>
@@ -1612,38 +1545,13 @@
           <w:bCs/>
           <w:szCs w:val="28"/>
         </w:rPr>
-        <w:t>[</w:t>
-      </w:r>
-      <w:proofErr w:type="gramEnd"/>
-      <w:r>
-        <w:rPr>
-          <w:b/>
-          <w:bCs/>
-          <w:szCs w:val="28"/>
-        </w:rPr>
-        <w:t>X</w:t>
-      </w:r>
-      <w:proofErr w:type="gramStart"/>
-      <w:r>
-        <w:rPr>
-          <w:b/>
-          <w:bCs/>
-          <w:szCs w:val="28"/>
-        </w:rPr>
-        <w:t>]</w:t>
-      </w:r>
-      <w:r>
-        <w:rPr>
-          <w:szCs w:val="28"/>
-        </w:rPr>
-        <w:t xml:space="preserve">  Real</w:t>
-      </w:r>
-      <w:proofErr w:type="gramEnd"/>
-      <w:r>
-        <w:rPr>
-          <w:szCs w:val="28"/>
-        </w:rPr>
-        <w:t xml:space="preserve"> estate brokerage fee</w:t>
+        <w:t>[X]</w:t>
+      </w:r>
+      <w:r>
+        <w:rPr>
+          <w:szCs w:val="28"/>
+        </w:rPr>
+        <w:t xml:space="preserve">  Real estate brokerage fee</w:t>
       </w:r>
     </w:p>
     <w:p>
@@ -1703,21 +1611,7 @@
         <w:rPr>
           <w:szCs w:val="28"/>
         </w:rPr>
-        <w:t xml:space="preserve">[ </w:t>
-      </w:r>
-      <w:proofErr w:type="gramStart"/>
-      <w:r>
-        <w:rPr>
-          <w:szCs w:val="28"/>
-        </w:rPr>
-        <w:t xml:space="preserve">  ]</w:t>
-      </w:r>
-      <w:proofErr w:type="gramEnd"/>
-      <w:r>
-        <w:rPr>
-          <w:szCs w:val="28"/>
-        </w:rPr>
-        <w:t xml:space="preserve"> Other______________________________________</w:t>
+        <w:t>[   ] Other______________________________________</w:t>
       </w:r>
     </w:p>
     <w:p>
@@ -1807,34 +1701,16 @@
           <w:bCs/>
           <w:szCs w:val="28"/>
         </w:rPr>
-        <w:t xml:space="preserve">[X]Title insurance </w:t>
-      </w:r>
-      <w:proofErr w:type="gramStart"/>
+        <w:t xml:space="preserve">[X]Title insurance policy   </w:t>
+      </w:r>
       <w:r>
         <w:rPr>
           <w:b/>
           <w:bCs/>
           <w:szCs w:val="28"/>
         </w:rPr>
-        <w:t xml:space="preserve">policy   </w:t>
-      </w:r>
-      <w:r>
-        <w:rPr>
-          <w:b/>
-          <w:bCs/>
-          <w:szCs w:val="28"/>
-        </w:rPr>
-        <w:tab/>
-        <w:t>[</w:t>
-      </w:r>
-      <w:proofErr w:type="gramEnd"/>
-      <w:r>
-        <w:rPr>
-          <w:b/>
-          <w:bCs/>
-          <w:szCs w:val="28"/>
-        </w:rPr>
-        <w:t xml:space="preserve">X] Attorney's fee </w:t>
+        <w:tab/>
+        <w:t xml:space="preserve">[X] Attorney's fee </w:t>
       </w:r>
     </w:p>
     <w:p>
@@ -1859,34 +1735,16 @@
           <w:bCs/>
           <w:szCs w:val="28"/>
         </w:rPr>
-        <w:t xml:space="preserve">[X] Closing </w:t>
-      </w:r>
-      <w:proofErr w:type="gramStart"/>
+        <w:t xml:space="preserve">[X] Closing Costs   </w:t>
+      </w:r>
       <w:r>
         <w:rPr>
           <w:b/>
           <w:bCs/>
           <w:szCs w:val="28"/>
         </w:rPr>
-        <w:t xml:space="preserve">Costs   </w:t>
-      </w:r>
-      <w:r>
-        <w:rPr>
-          <w:b/>
-          <w:bCs/>
-          <w:szCs w:val="28"/>
-        </w:rPr>
-        <w:tab/>
-        <w:t>[</w:t>
-      </w:r>
-      <w:proofErr w:type="gramEnd"/>
-      <w:r>
-        <w:rPr>
-          <w:b/>
-          <w:bCs/>
-          <w:szCs w:val="28"/>
-        </w:rPr>
-        <w:t xml:space="preserve">X] Recording fees   </w:t>
+        <w:tab/>
+        <w:t xml:space="preserve">[X] Recording fees   </w:t>
       </w:r>
     </w:p>
     <w:p>
@@ -1911,34 +1769,16 @@
           <w:bCs/>
           <w:szCs w:val="28"/>
         </w:rPr>
-        <w:t xml:space="preserve">[X] Note </w:t>
-      </w:r>
-      <w:proofErr w:type="gramStart"/>
+        <w:t xml:space="preserve">[X] Note stamps   </w:t>
+      </w:r>
       <w:r>
         <w:rPr>
           <w:b/>
           <w:bCs/>
           <w:szCs w:val="28"/>
         </w:rPr>
-        <w:t xml:space="preserve">stamps   </w:t>
-      </w:r>
-      <w:r>
-        <w:rPr>
-          <w:b/>
-          <w:bCs/>
-          <w:szCs w:val="28"/>
-        </w:rPr>
-        <w:tab/>
-        <w:t>[</w:t>
-      </w:r>
-      <w:proofErr w:type="gramEnd"/>
-      <w:r>
-        <w:rPr>
-          <w:b/>
-          <w:bCs/>
-          <w:szCs w:val="28"/>
-        </w:rPr>
-        <w:t xml:space="preserve">X] Intangible tax    </w:t>
+        <w:tab/>
+        <w:t xml:space="preserve">[X] Intangible tax    </w:t>
       </w:r>
     </w:p>
     <w:p>
@@ -1982,42 +1822,14 @@
         <w:rPr>
           <w:szCs w:val="28"/>
         </w:rPr>
-        <w:t xml:space="preserve">[ </w:t>
-      </w:r>
-      <w:proofErr w:type="gramStart"/>
-      <w:r>
-        <w:rPr>
-          <w:szCs w:val="28"/>
-        </w:rPr>
-        <w:t xml:space="preserve">  ]</w:t>
-      </w:r>
-      <w:proofErr w:type="gramEnd"/>
-      <w:r>
-        <w:rPr>
-          <w:szCs w:val="28"/>
-        </w:rPr>
-        <w:t xml:space="preserve"> Credit reports   </w:t>
-      </w:r>
-      <w:r>
-        <w:rPr>
-          <w:szCs w:val="28"/>
-        </w:rPr>
-        <w:tab/>
-        <w:t xml:space="preserve">[ </w:t>
-      </w:r>
-      <w:proofErr w:type="gramStart"/>
-      <w:r>
-        <w:rPr>
-          <w:szCs w:val="28"/>
-        </w:rPr>
-        <w:t xml:space="preserve">  ]</w:t>
-      </w:r>
-      <w:proofErr w:type="gramEnd"/>
-      <w:r>
-        <w:rPr>
-          <w:szCs w:val="28"/>
-        </w:rPr>
-        <w:t xml:space="preserve"> Loan origination fee   </w:t>
+        <w:t xml:space="preserve">[   ] Credit reports   </w:t>
+      </w:r>
+      <w:r>
+        <w:rPr>
+          <w:szCs w:val="28"/>
+        </w:rPr>
+        <w:tab/>
+        <w:t xml:space="preserve">[   ] Loan origination fee   </w:t>
       </w:r>
     </w:p>
     <w:p>
@@ -2038,42 +1850,14 @@
         <w:rPr>
           <w:szCs w:val="28"/>
         </w:rPr>
-        <w:t xml:space="preserve">[ </w:t>
-      </w:r>
-      <w:proofErr w:type="gramStart"/>
-      <w:r>
-        <w:rPr>
-          <w:szCs w:val="28"/>
-        </w:rPr>
-        <w:t xml:space="preserve">  ]</w:t>
-      </w:r>
-      <w:proofErr w:type="gramEnd"/>
-      <w:r>
-        <w:rPr>
-          <w:szCs w:val="28"/>
-        </w:rPr>
-        <w:t xml:space="preserve"> Loan insurance premium   </w:t>
-      </w:r>
-      <w:r>
-        <w:rPr>
-          <w:szCs w:val="28"/>
-        </w:rPr>
-        <w:tab/>
-        <w:t xml:space="preserve">[ </w:t>
-      </w:r>
-      <w:proofErr w:type="gramStart"/>
-      <w:r>
-        <w:rPr>
-          <w:szCs w:val="28"/>
-        </w:rPr>
-        <w:t xml:space="preserve">  ]</w:t>
-      </w:r>
-      <w:proofErr w:type="gramEnd"/>
-      <w:r>
-        <w:rPr>
-          <w:szCs w:val="28"/>
-        </w:rPr>
-        <w:t xml:space="preserve"> Other_________________________________</w:t>
+        <w:t xml:space="preserve">[   ] Loan insurance premium   </w:t>
+      </w:r>
+      <w:r>
+        <w:rPr>
+          <w:szCs w:val="28"/>
+        </w:rPr>
+        <w:tab/>
+        <w:t>[   ] Other_________________________________</w:t>
       </w:r>
     </w:p>
     <w:p>
@@ -2090,19 +1874,11 @@
           <w:szCs w:val="28"/>
         </w:rPr>
       </w:pPr>
-      <w:proofErr w:type="gramStart"/>
-      <w:r>
-        <w:rPr>
-          <w:szCs w:val="28"/>
-        </w:rPr>
-        <w:t>[  ]</w:t>
-      </w:r>
-      <w:proofErr w:type="gramEnd"/>
-      <w:r>
-        <w:rPr>
-          <w:szCs w:val="28"/>
-        </w:rPr>
-        <w:t xml:space="preserve"> All other charges required by lender which Purchaser is prohibited from paying by law or regulation.</w:t>
+      <w:r>
+        <w:rPr>
+          <w:szCs w:val="28"/>
+        </w:rPr>
+        <w:t>[  ] All other charges required by lender which Purchaser is prohibited from paying by law or regulation.</w:t>
       </w:r>
     </w:p>
     <w:p>
@@ -2118,21 +1894,7 @@
         <w:rPr>
           <w:szCs w:val="28"/>
         </w:rPr>
-        <w:t xml:space="preserve">[ </w:t>
-      </w:r>
-      <w:proofErr w:type="gramStart"/>
-      <w:r>
-        <w:rPr>
-          <w:szCs w:val="28"/>
-        </w:rPr>
-        <w:t xml:space="preserve">  ]</w:t>
-      </w:r>
-      <w:proofErr w:type="gramEnd"/>
-      <w:r>
-        <w:rPr>
-          <w:szCs w:val="28"/>
-        </w:rPr>
-        <w:t xml:space="preserve"> Repairs or replacements, in addition to those in paragraph 9, not to exceed $_________________________</w:t>
+        <w:t>[   ] Repairs or replacements, in addition to those in paragraph 9, not to exceed $_________________________</w:t>
       </w:r>
     </w:p>
     <w:p>
@@ -2148,21 +1910,7 @@
         <w:rPr>
           <w:szCs w:val="28"/>
         </w:rPr>
-        <w:t xml:space="preserve">[ </w:t>
-      </w:r>
-      <w:proofErr w:type="gramStart"/>
-      <w:r>
-        <w:rPr>
-          <w:szCs w:val="28"/>
-        </w:rPr>
-        <w:t xml:space="preserve">  ]</w:t>
-      </w:r>
-      <w:proofErr w:type="gramEnd"/>
-      <w:r>
-        <w:rPr>
-          <w:szCs w:val="28"/>
-        </w:rPr>
-        <w:t xml:space="preserve"> All mortgage payments or condominium and association fees will be </w:t>
+        <w:t xml:space="preserve">[   ] All mortgage payments or condominium and association fees will be </w:t>
       </w:r>
       <w:r>
         <w:rPr>
@@ -2287,6 +2035,213 @@
         <w:t>INSTALLMENT PAYMENTS:</w:t>
       </w:r>
     </w:p>
+    <w:tbl>
+      <w:tblPr>
+        <w:tblW w:type="auto" w:w="0"/>
+        <w:jc w:val="center"/>
+        <w:tblLook w:firstColumn="1" w:firstRow="1" w:lastColumn="0" w:lastRow="0" w:noHBand="0" w:noVBand="1" w:val="04A0"/>
+      </w:tblPr>
+      <w:tblGrid>
+        <w:gridCol w:w="4680"/>
+        <w:gridCol w:w="4680"/>
+      </w:tblGrid>
+      <w:tr>
+        <w:tc>
+          <w:tcPr>
+            <w:tcW w:type="dxa" w:w="4680"/>
+            <w:vAlign w:val="top"/>
+          </w:tcPr>
+          <w:tbl>
+            <w:tblPr>
+              <w:tblStyle w:val="TableGrid"/>
+              <w:tblW w:type="auto" w:w="0"/>
+              <w:jc w:val="center"/>
+              <w:tblLook w:firstColumn="1" w:firstRow="1" w:lastColumn="0" w:lastRow="0" w:noHBand="0" w:noVBand="1" w:val="04A0"/>
+            </w:tblPr>
+            <w:tblGrid>
+              <w:gridCol w:w="4680"/>
+            </w:tblGrid>
+            <w:tr>
+              <w:tc>
+                <w:tcPr>
+                  <w:tcW w:type="dxa" w:w="4680"/>
+                  <w:vAlign w:val="center"/>
+                </w:tcPr>
+                <w:p>
+                  <w:pPr/>
+                  <w:r>
+                    <w:t>360</w:t>
+                  </w:r>
+                </w:p>
+              </w:tc>
+            </w:tr>
+            <w:tr>
+              <w:tc>
+                <w:tcPr>
+                  <w:tcW w:type="dxa" w:w="4680"/>
+                  <w:vAlign w:val="center"/>
+                </w:tcPr>
+                <w:p>
+                  <w:pPr/>
+                  <w:r>
+                    <w:t>7/1/2026</w:t>
+                  </w:r>
+                </w:p>
+              </w:tc>
+            </w:tr>
+            <w:tr>
+              <w:tc>
+                <w:tcPr>
+                  <w:tcW w:type="dxa" w:w="4680"/>
+                  <w:vAlign w:val="center"/>
+                </w:tcPr>
+                <w:p>
+                  <w:pPr/>
+                  <w:r>
+                    <w:t>6/1/2056</w:t>
+                  </w:r>
+                </w:p>
+              </w:tc>
+            </w:tr>
+            <w:tr>
+              <w:tc>
+                <w:tcPr>
+                  <w:tcW w:type="dxa" w:w="4680"/>
+                  <w:vAlign w:val="center"/>
+                </w:tcPr>
+                <w:p>
+                  <w:pPr/>
+                  <w:r>
+                    <w:t>2,504.43</w:t>
+                  </w:r>
+                </w:p>
+              </w:tc>
+            </w:tr>
+            <w:tr>
+              <w:tc>
+                <w:tcPr>
+                  <w:tcW w:type="dxa" w:w="4680"/>
+                  <w:vAlign w:val="center"/>
+                </w:tcPr>
+                <w:p>
+                  <w:pPr/>
+                  <w:r>
+                    <w:t>51.50</w:t>
+                  </w:r>
+                </w:p>
+              </w:tc>
+            </w:tr>
+            <w:tr>
+              <w:tc>
+                <w:tcPr>
+                  <w:tcW w:type="dxa" w:w="4680"/>
+                  <w:vAlign w:val="center"/>
+                </w:tcPr>
+                <w:p>
+                  <w:pPr/>
+                  <w:r>
+                    <w:t>145.10</w:t>
+                  </w:r>
+                </w:p>
+              </w:tc>
+            </w:tr>
+            <w:tr>
+              <w:tc>
+                <w:tcPr>
+                  <w:tcW w:type="dxa" w:w="4680"/>
+                  <w:vAlign w:val="center"/>
+                </w:tcPr>
+                <w:p>
+                  <w:pPr/>
+                  <w:r>
+                    <w:t>2,701.03</w:t>
+                  </w:r>
+                </w:p>
+              </w:tc>
+            </w:tr>
+          </w:tbl>
+          <w:p/>
+        </w:tc>
+        <w:tc>
+          <w:tcPr>
+            <w:tcW w:type="dxa" w:w="4680"/>
+            <w:vAlign w:val="top"/>
+          </w:tcPr>
+          <w:p>
+            <w:pPr>
+              <w:pStyle w:val="t1"/>
+              <w:spacing w:line="264" w:lineRule="auto"/>
+            </w:pPr>
+            <w:r>
+              <w:t>For the first instalments:</w:t>
+            </w:r>
+          </w:p>
+          <w:p>
+            <w:pPr>
+              <w:pStyle w:val="t1"/>
+              <w:spacing w:line="264" w:lineRule="auto"/>
+            </w:pPr>
+            <w:r>
+              <w:t>Due Date of the First Installment Payment:</w:t>
+            </w:r>
+          </w:p>
+          <w:p>
+            <w:pPr>
+              <w:pStyle w:val="t1"/>
+              <w:spacing w:line="264" w:lineRule="auto"/>
+            </w:pPr>
+            <w:r>
+              <w:t>Due Date of the Last Installment Payment:</w:t>
+            </w:r>
+          </w:p>
+          <w:p>
+            <w:pPr>
+              <w:pStyle w:val="t1"/>
+              <w:spacing w:line="264" w:lineRule="auto"/>
+            </w:pPr>
+            <w:r>
+              <w:t>Principal and Interest:</w:t>
+            </w:r>
+          </w:p>
+          <w:p>
+            <w:pPr>
+              <w:pStyle w:val="t1"/>
+              <w:spacing w:line="264" w:lineRule="auto"/>
+            </w:pPr>
+            <w:r>
+              <w:t>Property Insurance *:</w:t>
+            </w:r>
+          </w:p>
+          <w:p>
+            <w:pPr>
+              <w:pStyle w:val="t1"/>
+              <w:spacing w:line="264" w:lineRule="auto"/>
+            </w:pPr>
+            <w:r>
+              <w:t>Property Tax *:</w:t>
+            </w:r>
+          </w:p>
+          <w:p>
+            <w:pPr>
+              <w:pStyle w:val="t1"/>
+              <w:spacing w:line="264" w:lineRule="auto"/>
+            </w:pPr>
+            <w:r>
+              <w:t>Total Monthly Payment:</w:t>
+            </w:r>
+          </w:p>
+          <w:p>
+            <w:pPr>
+              <w:pStyle w:val="t1"/>
+              <w:spacing w:line="264" w:lineRule="auto"/>
+            </w:pPr>
+            <w:r>
+              <w:t>(*) The property Insurance and Property Tax values are correct for the contract year only and will adjust annually.</w:t>
+            </w:r>
+          </w:p>
+        </w:tc>
+      </w:tr>
+    </w:tbl>
     <w:p>
       <w:pPr>
         <w:pStyle w:val="t1"/>
@@ -2308,19 +2263,12 @@
         </w:rPr>
       </w:pPr>
       <w:r>
-        <w:rPr>
-          <w:szCs w:val="24"/>
-        </w:rPr>
-        <w:t>For the first 360 instalments:</w:t>
+        <w:t>ACH DRAFT PAYMENTS: Purchaser shall make each monthly payment by automatic ACH draft. Seller shall set up the ACH draft using the bank account and routing information provided by Purchaser on the signature page.</w:t>
       </w:r>
     </w:p>
     <w:p>
       <w:pPr>
         <w:pStyle w:val="t1"/>
-        <w:numPr>
-          <w:ilvl w:val="2"/>
-          <w:numId w:val="10"/>
-        </w:numPr>
         <w:tabs>
           <w:tab w:val="left" w:pos="720"/>
           <w:tab w:val="left" w:pos="1620"/>
@@ -2332,416 +2280,6 @@
           <w:tab w:val="left" w:pos="9780"/>
         </w:tabs>
         <w:spacing w:line="264" w:lineRule="auto"/>
-        <w:ind w:left="990" w:firstLine="0"/>
-        <w:rPr>
-          <w:szCs w:val="24"/>
-        </w:rPr>
-      </w:pPr>
-      <w:r>
-        <w:rPr>
-          <w:szCs w:val="24"/>
-        </w:rPr>
-        <w:t>Due Date of the First Installment Payment:</w:t>
-        <w:tab/>
-        <w:t>7/1/2026</w:t>
-      </w:r>
-      <w:r>
-        <w:rPr>
-          <w:szCs w:val="24"/>
-        </w:rPr>
-      </w:r>
-    </w:p>
-    <w:p>
-      <w:pPr>
-        <w:pStyle w:val="t1"/>
-        <w:numPr>
-          <w:ilvl w:val="2"/>
-          <w:numId w:val="10"/>
-        </w:numPr>
-        <w:tabs>
-          <w:tab w:val="left" w:pos="720"/>
-          <w:tab w:val="left" w:pos="1620"/>
-          <w:tab w:val="left" w:pos="1980"/>
-          <w:tab w:val="left" w:pos="3240"/>
-          <w:tab w:val="left" w:pos="5040"/>
-          <w:tab w:val="left" w:pos="7200"/>
-          <w:tab w:val="left" w:pos="8280"/>
-          <w:tab w:val="left" w:pos="9780"/>
-        </w:tabs>
-        <w:spacing w:line="264" w:lineRule="auto"/>
-        <w:ind w:left="990" w:firstLine="0"/>
-        <w:rPr>
-          <w:szCs w:val="24"/>
-        </w:rPr>
-      </w:pPr>
-      <w:r>
-        <w:rPr>
-          <w:szCs w:val="24"/>
-        </w:rPr>
-        <w:t>Due Date of the Last Installment Payment:</w:t>
-        <w:tab/>
-        <w:t>6/1/2056</w:t>
-      </w:r>
-      <w:r>
-        <w:rPr>
-          <w:szCs w:val="24"/>
-        </w:rPr>
-      </w:r>
-    </w:p>
-    <w:p>
-      <w:pPr>
-        <w:pStyle w:val="t1"/>
-        <w:numPr>
-          <w:ilvl w:val="2"/>
-          <w:numId w:val="10"/>
-        </w:numPr>
-        <w:tabs>
-          <w:tab w:val="left" w:pos="720"/>
-          <w:tab w:val="left" w:pos="1620"/>
-          <w:tab w:val="left" w:pos="1980"/>
-          <w:tab w:val="left" w:pos="3240"/>
-          <w:tab w:val="left" w:pos="7200"/>
-          <w:tab w:val="left" w:pos="8280"/>
-          <w:tab w:val="left" w:pos="9780"/>
-        </w:tabs>
-        <w:spacing w:line="264" w:lineRule="auto"/>
-        <w:ind w:left="990" w:firstLine="0"/>
-        <w:rPr>
-          <w:szCs w:val="24"/>
-        </w:rPr>
-      </w:pPr>
-      <w:r>
-        <w:rPr>
-          <w:szCs w:val="24"/>
-        </w:rPr>
-        <w:t>Amount of Each Installment Payment includes</w:t>
-      </w:r>
-    </w:p>
-    <w:p>
-      <w:pPr>
-        <w:pStyle w:val="t1"/>
-        <w:numPr>
-          <w:ilvl w:val="3"/>
-          <w:numId w:val="10"/>
-        </w:numPr>
-        <w:tabs>
-          <w:tab w:val="left" w:pos="720"/>
-          <w:tab w:val="left" w:pos="1890"/>
-          <w:tab w:val="left" w:pos="1980"/>
-          <w:tab w:val="left" w:pos="3870"/>
-          <w:tab w:val="left" w:pos="7200"/>
-          <w:tab w:val="left" w:pos="8280"/>
-          <w:tab w:val="left" w:pos="9780"/>
-        </w:tabs>
-        <w:spacing w:line="264" w:lineRule="auto"/>
-        <w:ind w:left="1260" w:firstLine="0"/>
-        <w:rPr>
-          <w:szCs w:val="24"/>
-        </w:rPr>
-      </w:pPr>
-      <w:r>
-        <w:rPr>
-          <w:szCs w:val="24"/>
-        </w:rPr>
-        <w:t>Principal and Interest:</w:t>
-        <w:tab/>
-        <w:t>2,504.43</w:t>
-      </w:r>
-      <w:r>
-        <w:rPr>
-          <w:szCs w:val="24"/>
-        </w:rPr>
-      </w:r>
-    </w:p>
-    <w:p>
-      <w:pPr>
-        <w:pStyle w:val="t1"/>
-        <w:numPr>
-          <w:ilvl w:val="3"/>
-          <w:numId w:val="10"/>
-        </w:numPr>
-        <w:tabs>
-          <w:tab w:val="left" w:pos="720"/>
-          <w:tab w:val="left" w:pos="1890"/>
-          <w:tab w:val="left" w:pos="1980"/>
-          <w:tab w:val="left" w:pos="3870"/>
-          <w:tab w:val="left" w:pos="7200"/>
-          <w:tab w:val="left" w:pos="8280"/>
-          <w:tab w:val="left" w:pos="9780"/>
-        </w:tabs>
-        <w:spacing w:line="264" w:lineRule="auto"/>
-        <w:ind w:left="1260" w:firstLine="0"/>
-        <w:rPr>
-          <w:szCs w:val="24"/>
-        </w:rPr>
-      </w:pPr>
-      <w:r>
-        <w:rPr>
-          <w:szCs w:val="24"/>
-        </w:rPr>
-        <w:t>Property Insurance</w:t>
-      </w:r>
-      <w:r>
-        <w:rPr>
-          <w:szCs w:val="24"/>
-        </w:rPr>
-        <w:t xml:space="preserve"> </w:t>
-      </w:r>
-      <w:r>
-        <w:rPr>
-          <w:szCs w:val="24"/>
-        </w:rPr>
-        <w:t>*</w:t>
-      </w:r>
-      <w:proofErr w:type="gramStart"/>
-      <w:r>
-        <w:rPr>
-          <w:szCs w:val="24"/>
-        </w:rPr>
-        <w:t>:</w:t>
-      </w:r>
-      <w:r>
-        <w:rPr>
-          <w:szCs w:val="24"/>
-        </w:rPr>
-        <w:tab/>
-        <w:t xml:space="preserve"> 51.50</w:t>
-      </w:r>
-      <w:proofErr w:type="gramEnd"/>
-    </w:p>
-    <w:p>
-      <w:pPr>
-        <w:pStyle w:val="t1"/>
-        <w:numPr>
-          <w:ilvl w:val="3"/>
-          <w:numId w:val="10"/>
-        </w:numPr>
-        <w:tabs>
-          <w:tab w:val="left" w:pos="720"/>
-          <w:tab w:val="left" w:pos="1890"/>
-          <w:tab w:val="left" w:pos="1980"/>
-          <w:tab w:val="left" w:pos="3870"/>
-          <w:tab w:val="left" w:pos="7200"/>
-          <w:tab w:val="left" w:pos="8280"/>
-          <w:tab w:val="left" w:pos="9780"/>
-        </w:tabs>
-        <w:spacing w:line="264" w:lineRule="auto"/>
-        <w:ind w:left="1260" w:firstLine="0"/>
-        <w:rPr>
-          <w:szCs w:val="24"/>
-        </w:rPr>
-      </w:pPr>
-      <w:r>
-        <w:rPr>
-          <w:szCs w:val="24"/>
-        </w:rPr>
-        <w:t>Property Tax</w:t>
-      </w:r>
-      <w:r>
-        <w:rPr>
-          <w:szCs w:val="24"/>
-        </w:rPr>
-        <w:t xml:space="preserve"> </w:t>
-      </w:r>
-      <w:r>
-        <w:rPr>
-          <w:szCs w:val="24"/>
-        </w:rPr>
-        <w:t>*</w:t>
-      </w:r>
-      <w:proofErr w:type="gramStart"/>
-      <w:r>
-        <w:rPr>
-          <w:szCs w:val="24"/>
-        </w:rPr>
-        <w:t>:</w:t>
-      </w:r>
-      <w:r>
-        <w:rPr>
-          <w:szCs w:val="24"/>
-        </w:rPr>
-        <w:tab/>
-        <w:t xml:space="preserve"> </w:t>
-      </w:r>
-      <w:r>
-        <w:rPr>
-          <w:szCs w:val="24"/>
-        </w:rPr>
-        <w:tab/>
-      </w:r>
-      <w:proofErr w:type="gramEnd"/>
-      <w:r>
-        <w:rPr>
-          <w:szCs w:val="24"/>
-        </w:rPr>
-        <w:t>145.10</w:t>
-      </w:r>
-    </w:p>
-    <w:p>
-      <w:pPr>
-        <w:pStyle w:val="t1"/>
-        <w:numPr>
-          <w:ilvl w:val="3"/>
-          <w:numId w:val="10"/>
-        </w:numPr>
-        <w:tabs>
-          <w:tab w:val="left" w:pos="720"/>
-          <w:tab w:val="left" w:pos="1890"/>
-          <w:tab w:val="left" w:pos="1980"/>
-          <w:tab w:val="left" w:pos="3870"/>
-          <w:tab w:val="left" w:pos="7200"/>
-          <w:tab w:val="left" w:pos="8280"/>
-          <w:tab w:val="left" w:pos="9780"/>
-        </w:tabs>
-        <w:spacing w:line="264" w:lineRule="auto"/>
-        <w:ind w:left="1260" w:firstLine="0"/>
-        <w:rPr>
-          <w:szCs w:val="24"/>
-        </w:rPr>
-      </w:pPr>
-      <w:r>
-        <w:rPr>
-          <w:szCs w:val="24"/>
-        </w:rPr>
-        <w:t>Total Monthly Payment:</w:t>
-        <w:tab/>
-        <w:t>2,701.03</w:t>
-      </w:r>
-      <w:r>
-        <w:rPr>
-          <w:szCs w:val="24"/>
-        </w:rPr>
-      </w:r>
-    </w:p>
-    <w:p>
-      <w:pPr>
-        <w:pStyle w:val="t1"/>
-        <w:numPr>
-          <w:ilvl w:val="1"/>
-          <w:numId w:val="10"/>
-        </w:numPr>
-        <w:tabs>
-          <w:tab w:val="left" w:pos="720"/>
-          <w:tab w:val="left" w:pos="3240"/>
-          <w:tab w:val="left" w:pos="7200"/>
-          <w:tab w:val="left" w:pos="8280"/>
-          <w:tab w:val="left" w:pos="9780"/>
-        </w:tabs>
-        <w:spacing w:line="264" w:lineRule="auto"/>
-        <w:ind w:left="630"/>
-        <w:rPr>
-          <w:szCs w:val="24"/>
-        </w:rPr>
-      </w:pPr>
-      <w:r>
-        <w:rPr>
-          <w:szCs w:val="24"/>
-        </w:rPr>
-        <w:t xml:space="preserve">(*) </w:t>
-      </w:r>
-      <w:r>
-        <w:rPr>
-          <w:szCs w:val="24"/>
-        </w:rPr>
-        <w:t>The property Insurance and Property Tax values are correct for the contract year only and will adjust annually.</w:t>
-      </w:r>
-    </w:p>
-    <w:p>
-      <w:pPr>
-        <w:pStyle w:val="t1"/>
-        <w:tabs>
-          <w:tab w:val="left" w:pos="720"/>
-          <w:tab w:val="left" w:pos="1890"/>
-          <w:tab w:val="left" w:pos="1980"/>
-          <w:tab w:val="left" w:pos="3870"/>
-          <w:tab w:val="left" w:pos="7200"/>
-          <w:tab w:val="left" w:pos="8280"/>
-          <w:tab w:val="left" w:pos="9780"/>
-        </w:tabs>
-        <w:spacing w:line="264" w:lineRule="auto"/>
-        <w:ind w:left="1260"/>
-        <w:rPr>
-          <w:szCs w:val="24"/>
-        </w:rPr>
-      </w:pPr>
-    </w:p>
-    <w:p>
-      <w:pPr>
-        <w:pStyle w:val="t1"/>
-        <w:numPr>
-          <w:ilvl w:val="1"/>
-          <w:numId w:val="10"/>
-        </w:numPr>
-        <w:tabs>
-          <w:tab w:val="left" w:pos="720"/>
-          <w:tab w:val="left" w:pos="3240"/>
-          <w:tab w:val="left" w:pos="7200"/>
-          <w:tab w:val="left" w:pos="8280"/>
-          <w:tab w:val="left" w:pos="9780"/>
-        </w:tabs>
-        <w:spacing w:line="264" w:lineRule="auto"/>
-        <w:ind w:left="630"/>
-        <w:rPr>
-          <w:szCs w:val="24"/>
-        </w:rPr>
-      </w:pPr>
-      <w:r>
-        <w:rPr>
-          <w:szCs w:val="24"/>
-        </w:rPr>
-        <w:t>Total Number of Installment Payments:</w:t>
-        <w:tab/>
-        <w:t>360</w:t>
-      </w:r>
-      <w:r>
-        <w:rPr>
-          <w:szCs w:val="24"/>
-        </w:rPr>
-      </w:r>
-    </w:p>
-    <w:p>
-      <w:pPr>
-        <w:pStyle w:val="ListParagraph"/>
-      </w:pPr>
-    </w:p>
-    <w:p>
-      <w:pPr>
-        <w:pStyle w:val="t1"/>
-        <w:numPr>
-          <w:ilvl w:val="1"/>
-          <w:numId w:val="10"/>
-        </w:numPr>
-        <w:tabs>
-          <w:tab w:val="left" w:pos="720"/>
-          <w:tab w:val="left" w:pos="3240"/>
-          <w:tab w:val="left" w:pos="7200"/>
-          <w:tab w:val="left" w:pos="8280"/>
-          <w:tab w:val="left" w:pos="9780"/>
-        </w:tabs>
-        <w:spacing w:line="264" w:lineRule="auto"/>
-        <w:ind w:left="630"/>
-        <w:rPr>
-          <w:szCs w:val="24"/>
-        </w:rPr>
-      </w:pPr>
-      <w:r>
-        <w:t>ACH DRAFT PAYMENTS: Purchaser shall make each monthly payment by automatic ACH draft. Seller shall set up the ACH draft using the bank account and routing information provided by Purchaser on the signature page.</w:t>
-      </w:r>
-    </w:p>
-    <w:p>
-      <w:pPr>
-        <w:pStyle w:val="t1"/>
-        <w:tabs>
-          <w:tab w:val="left" w:pos="720"/>
-          <w:tab w:val="left" w:pos="1620"/>
-          <w:tab w:val="left" w:pos="1980"/>
-          <w:tab w:val="left" w:pos="3240"/>
-          <w:tab w:val="left" w:pos="5040"/>
-          <w:tab w:val="left" w:pos="7200"/>
-          <w:tab w:val="left" w:pos="8280"/>
-          <w:tab w:val="left" w:pos="9780"/>
-        </w:tabs>
-        <w:spacing w:line="264" w:lineRule="auto"/>
         <w:ind w:left="990"/>
         <w:rPr>
           <w:szCs w:val="24"/>
@@ -2841,7 +2379,7 @@
     </w:p>
     <w:p>
       <w:pPr>
-        <w:jc w:val="both"/>
+        <w:jc w:val="center"/>
         <w:rPr>
           <w:szCs w:val="28"/>
         </w:rPr>
@@ -2853,9 +2391,7 @@
         <w:br/>
         <w:t>A lien to attorneys of 100,000</w:t>
       </w:r>
-      <w:proofErr w:type="gramStart"/>
       <w:r/>
-      <w:proofErr w:type="gramEnd"/>
       <w:r/>
     </w:p>
     <w:p>
@@ -2890,28 +2426,14 @@
         <w:rPr>
           <w:szCs w:val="24"/>
         </w:rPr>
-        <w:t xml:space="preserve">A PURCHASER’S RIGHTS UNDER A CONTRACT FOR DEED SHALL NOT BE FORFEITED EXCEPT AS PROVIDED IN N.C. GEN. STAT. CHAPTER 47H. A CONTRACT FOR DEED CANNOT BE FORFEITED UNLESS A BREACH HAS OCCURRED IN ONE OR MORE OF </w:t>
-      </w:r>
-      <w:proofErr w:type="gramStart"/>
-      <w:r>
-        <w:rPr>
-          <w:szCs w:val="24"/>
-        </w:rPr>
-        <w:t>THE PURCHASER’S</w:t>
-      </w:r>
-      <w:proofErr w:type="gramEnd"/>
-      <w:r>
-        <w:rPr>
-          <w:szCs w:val="24"/>
-        </w:rPr>
-        <w:t xml:space="preserve"> EXPRESS OBLIGATIONS UNDER THE CONTRACT AND THE CONTRACT PROVIDES THAT AS A RESULT OF SUCH BREACH THE SELLER IS ENTITLED TO FORFEIT THE CONTRACT. EXAMPLES OF BREACH OF CONTRACT INCLUDE LACK OF </w:t>
+        <w:t xml:space="preserve">A PURCHASER’S RIGHTS UNDER A CONTRACT FOR DEED SHALL NOT BE FORFEITED EXCEPT AS PROVIDED IN N.C. GEN. STAT. CHAPTER 47H. A CONTRACT FOR DEED CANNOT BE FORFEITED UNLESS A BREACH HAS OCCURRED IN ONE OR MORE OF THE PURCHASER’S EXPRESS OBLIGATIONS UNDER THE CONTRACT AND THE CONTRACT PROVIDES THAT AS A RESULT OF SUCH BREACH THE SELLER IS ENTITLED TO FORFEIT THE </w:t>
       </w:r>
       <w:r>
         <w:rPr>
           <w:szCs w:val="24"/>
         </w:rPr>
         <w:lastRenderedPageBreak/>
-        <w:t>PAYMENT EXTENDING BEYOND 15 DAYS OF DUE DATE, PROHIBITED USE OF PROPERTY, FRAUDULENT IDENTIFICATION, AND FRAUDULENT PAYMENTS. FURTHERMORE, THE PURCHASER’S RIGHTS SHALL NOT BE FORFEITED UNTIL THE PURCHASER HAS BEEN NOTIFIED OF THE INTENT TO FORFEIT IN ACCORDANCE WITH N.C. GEN. STAT. 47H-4 AND BEEN GIVEN A RIGHT TO CURE THE DEFAULT AND HAS FAILED TO DO SO WITHIN THE TIME PERIOD ALLOWED. A TIMELY TENDER OF CURE SHALL REINSTATE THE CONTRACT FOR DEED.</w:t>
+        <w:t>CONTRACT. EXAMPLES OF BREACH OF CONTRACT INCLUDE LACK OF PAYMENT EXTENDING BEYOND 15 DAYS OF DUE DATE, PROHIBITED USE OF PROPERTY, FRAUDULENT IDENTIFICATION, AND FRAUDULENT PAYMENTS. FURTHERMORE, THE PURCHASER’S RIGHTS SHALL NOT BE FORFEITED UNTIL THE PURCHASER HAS BEEN NOTIFIED OF THE INTENT TO FORFEIT IN ACCORDANCE WITH N.C. GEN. STAT. 47H-4 AND BEEN GIVEN A RIGHT TO CURE THE DEFAULT AND HAS FAILED TO DO SO WITHIN THE TIME PERIOD ALLOWED. A TIMELY TENDER OF CURE SHALL REINSTATE THE CONTRACT FOR DEED.</w:t>
       </w:r>
     </w:p>
     <w:p>
@@ -2947,21 +2469,7 @@
         <w:rPr>
           <w:szCs w:val="24"/>
         </w:rPr>
-        <w:t xml:space="preserve">Any unauthorized or unpermitted construction, improvements, excavation (to include clearing, logging, and planting), or otherwise altering the property from its original condition at the time this contract is executed is prohibited.  Authorization may be given by the Seller for certain improvements if Purchaser </w:t>
-      </w:r>
-      <w:proofErr w:type="gramStart"/>
-      <w:r>
-        <w:rPr>
-          <w:szCs w:val="24"/>
-        </w:rPr>
-        <w:t>submits an application</w:t>
-      </w:r>
-      <w:proofErr w:type="gramEnd"/>
-      <w:r>
-        <w:rPr>
-          <w:szCs w:val="24"/>
-        </w:rPr>
-        <w:t xml:space="preserve"> in writing to make changes and receives authorization in writing from Seller.  Authorization will be withheld or granted solely at the discretion of the Seller. Additionally, any use not permitted by local, state, and federal laws and ordinances is prohibited. </w:t>
+        <w:t xml:space="preserve">Any unauthorized or unpermitted construction, improvements, excavation (to include clearing, logging, and planting), or otherwise altering the property from its original condition at the time this contract is executed is prohibited.  Authorization may be given by the Seller for certain improvements if Purchaser submits an application in writing to make changes and receives authorization in writing from Seller.  Authorization will be withheld or granted solely at the discretion of the Seller. Additionally, any use not permitted by local, state, and federal laws and ordinances is prohibited. </w:t>
       </w:r>
     </w:p>
     <w:p>
@@ -2996,21 +2504,7 @@
         <w:rPr>
           <w:szCs w:val="24"/>
         </w:rPr>
-        <w:t xml:space="preserve"> Purchaser may prepay some or </w:t>
-      </w:r>
-      <w:proofErr w:type="gramStart"/>
-      <w:r>
-        <w:rPr>
-          <w:szCs w:val="24"/>
-        </w:rPr>
-        <w:t>all of</w:t>
-      </w:r>
-      <w:proofErr w:type="gramEnd"/>
-      <w:r>
-        <w:rPr>
-          <w:szCs w:val="24"/>
-        </w:rPr>
-        <w:t xml:space="preserve"> the remaining Balance Owed on this contract at any time.</w:t>
+        <w:t xml:space="preserve"> Purchaser may prepay some or all of the remaining Balance Owed on this contract at any time.</w:t>
       </w:r>
     </w:p>
     <w:p>
@@ -3387,21 +2881,7 @@
         <w:rPr>
           <w:szCs w:val="28"/>
         </w:rPr>
-        <w:t xml:space="preserve"> has </w:t>
-      </w:r>
-      <w:proofErr w:type="gramStart"/>
-      <w:r>
-        <w:rPr>
-          <w:szCs w:val="28"/>
-        </w:rPr>
-        <w:t>[  ]</w:t>
-      </w:r>
-      <w:proofErr w:type="gramEnd"/>
-      <w:r>
-        <w:rPr>
-          <w:szCs w:val="28"/>
-        </w:rPr>
-        <w:t xml:space="preserve"> has not inspected the property and HAS NOT RELIED UPON ANY REPRESENTATIONS MADE BY ANY REAL ESTATE AGENT in describing the property, and Purchaser accepts the property in its PRESENT AS IS CONDITION, except as otherwise specified herein.</w:t>
+        <w:t xml:space="preserve"> has [  ] has not inspected the property and HAS NOT RELIED UPON ANY REPRESENTATIONS MADE BY ANY REAL ESTATE AGENT in describing the property, and Purchaser accepts the property in its PRESENT AS IS CONDITION, except as otherwise specified herein.</w:t>
       </w:r>
     </w:p>
     <w:p>
@@ -3551,25 +3031,7 @@
           <w:bCs/>
           <w:szCs w:val="28"/>
         </w:rPr>
-        <w:t xml:space="preserve">[ </w:t>
-      </w:r>
-      <w:proofErr w:type="gramStart"/>
-      <w:r>
-        <w:rPr>
-          <w:b/>
-          <w:bCs/>
-          <w:szCs w:val="28"/>
-        </w:rPr>
-        <w:t xml:space="preserve">  ]</w:t>
-      </w:r>
-      <w:proofErr w:type="gramEnd"/>
-      <w:r>
-        <w:rPr>
-          <w:b/>
-          <w:bCs/>
-          <w:szCs w:val="28"/>
-        </w:rPr>
-        <w:t xml:space="preserve"> _____________days after date of satisfaction of all conditions in paragraph 19 unless extended by other conditions of this Agreement or this agreement is cancelled by the Purchaser.</w:t>
+        <w:t>[   ] _____________days after date of satisfaction of all conditions in paragraph 19 unless extended by other conditions of this Agreement or this agreement is cancelled by the Purchaser.</w:t>
       </w:r>
       <w:r>
         <w:rPr>
@@ -3655,37 +3117,7 @@
         <w:rPr>
           <w:szCs w:val="28"/>
         </w:rPr>
-        <w:t xml:space="preserve">Additional Terms, Conditions or Addenda (lettered </w:t>
-      </w:r>
-      <w:proofErr w:type="spellStart"/>
-      <w:proofErr w:type="gramStart"/>
-      <w:r>
-        <w:rPr>
-          <w:szCs w:val="28"/>
-        </w:rPr>
-        <w:t>a,b</w:t>
-      </w:r>
-      <w:proofErr w:type="gramEnd"/>
-      <w:r>
-        <w:rPr>
-          <w:szCs w:val="28"/>
-        </w:rPr>
-        <w:t>,</w:t>
-      </w:r>
-      <w:proofErr w:type="gramStart"/>
-      <w:r>
-        <w:rPr>
-          <w:szCs w:val="28"/>
-        </w:rPr>
-        <w:t>c,d</w:t>
-      </w:r>
-      <w:proofErr w:type="spellEnd"/>
-      <w:proofErr w:type="gramEnd"/>
-      <w:r>
-        <w:rPr>
-          <w:szCs w:val="28"/>
-        </w:rPr>
-        <w:t>, etc.)</w:t>
+        <w:t>Additional Terms, Conditions or Addenda (lettered a,b,c,d, etc.)</w:t>
       </w:r>
     </w:p>
     <w:p>
@@ -3918,28 +3350,13 @@
           <w:szCs w:val="28"/>
           <w:u w:val="single"/>
         </w:rPr>
-        <w:t xml:space="preserve">     </w:t>
-      </w:r>
-      <w:proofErr w:type="gramStart"/>
-      <w:r>
-        <w:rPr>
-          <w:szCs w:val="28"/>
-          <w:u w:val="single"/>
-        </w:rPr>
-        <w:t xml:space="preserve">  </w:t>
-      </w:r>
-      <w:r>
-        <w:rPr>
-          <w:szCs w:val="28"/>
-        </w:rPr>
-        <w:t>.</w:t>
-      </w:r>
-      <w:proofErr w:type="gramEnd"/>
-      <w:r>
-        <w:rPr>
-          <w:szCs w:val="28"/>
-        </w:rPr>
-        <w:t xml:space="preserve"> </w:t>
+        <w:t xml:space="preserve">       </w:t>
+      </w:r>
+      <w:r>
+        <w:rPr>
+          <w:szCs w:val="28"/>
+        </w:rPr>
+        <w:t xml:space="preserve">. </w:t>
       </w:r>
     </w:p>
     <w:p>
@@ -4047,15 +3464,7 @@
           <w:u w:val="single"/>
         </w:rPr>
         <w:tab/>
-        <w:t xml:space="preserve">     </w:t>
-      </w:r>
-      <w:proofErr w:type="gramStart"/>
-      <w:r>
-        <w:rPr>
-          <w:szCs w:val="28"/>
-          <w:u w:val="single"/>
-        </w:rPr>
-        <w:t xml:space="preserve">  </w:t>
+        <w:t xml:space="preserve">       </w:t>
       </w:r>
       <w:r>
         <w:rPr>
@@ -4063,7 +3472,6 @@
         </w:rPr>
         <w:t>.</w:t>
       </w:r>
-      <w:proofErr w:type="gramEnd"/>
     </w:p>
     <w:p>
       <w:pPr>
@@ -4619,27 +4027,16 @@
         </w:rPr>
       </w:pPr>
       <w:r>
-        <w:t>STATE</w:t>
-      </w:r>
-      <w:proofErr w:type="gramStart"/>
-      <w:r>
-        <w:t xml:space="preserve">:   </w:t>
-      </w:r>
-      <w:r>
-        <w:tab/>
-      </w:r>
-      <w:r>
-        <w:rPr>
-          <w:u w:val="single"/>
-        </w:rPr>
-        <w:t>North</w:t>
-      </w:r>
-      <w:proofErr w:type="gramEnd"/>
-      <w:r>
-        <w:rPr>
-          <w:u w:val="single"/>
-        </w:rPr>
-        <w:t xml:space="preserve"> Carolina</w:t>
+        <w:t xml:space="preserve">STATE:   </w:t>
+      </w:r>
+      <w:r>
+        <w:tab/>
+      </w:r>
+      <w:r>
+        <w:rPr>
+          <w:u w:val="single"/>
+        </w:rPr>
+        <w:t>North Carolina</w:t>
       </w:r>
     </w:p>
     <w:p>
@@ -4651,9 +4048,6 @@
       <w:r>
         <w:t>COUNTY:  Wake</w:t>
       </w:r>
-      <w:proofErr w:type="gramStart"/>
-      <w:r/>
-      <w:proofErr w:type="gramEnd"/>
     </w:p>
     <w:p>
       <w:pPr>
@@ -4709,14 +4103,6 @@
         <w:rPr>
           <w:u w:val="single"/>
         </w:rPr>
-      </w:r>
-      <w:r/>
-      <w:r/>
-      <w:r/>
-      <w:r>
-        <w:rPr>
-          <w:u w:val="single"/>
-        </w:rPr>
         <w:tab/>
         <w:tab/>
         <w:tab/>
@@ -4849,33 +4235,19 @@
         <w:rPr>
           <w:rStyle w:val="normaltextrun"/>
         </w:rPr>
-        <w:t xml:space="preserve">Notary </w:t>
-      </w:r>
-      <w:proofErr w:type="gramStart"/>
+        <w:t>Notary Public </w:t>
+      </w:r>
+      <w:r>
+        <w:rPr>
+          <w:rStyle w:val="eop"/>
+        </w:rPr>
+        <w:t> </w:t>
+      </w:r>
       <w:r>
         <w:rPr>
           <w:rStyle w:val="normaltextrun"/>
         </w:rPr>
-        <w:t>Public </w:t>
-      </w:r>
-      <w:r>
-        <w:rPr>
-          <w:rStyle w:val="eop"/>
-        </w:rPr>
-        <w:t> </w:t>
-      </w:r>
-      <w:r>
-        <w:rPr>
-          <w:rStyle w:val="normaltextrun"/>
-        </w:rPr>
-        <w:t>My</w:t>
-      </w:r>
-      <w:proofErr w:type="gramEnd"/>
-      <w:r>
-        <w:rPr>
-          <w:rStyle w:val="normaltextrun"/>
-        </w:rPr>
-        <w:t xml:space="preserve"> Commission expires:</w:t>
+        <w:t>My Commission expires:</w:t>
       </w:r>
       <w:r>
         <w:rPr>
@@ -5195,66 +4567,11 @@
           <w:szCs w:val="28"/>
         </w:rPr>
       </w:pPr>
-      <w:proofErr w:type="gramStart"/>
       <w:r>
         <w:rPr>
           <w:szCs w:val="28"/>
         </w:rPr>
         <w:t>[ ] Agent   [X] Seller, by the signature below, acknowledge receipt of $6,000.00 [  ] Cash   [   ] Check, as earnest money deposit, which is credited toward the total down payment mentioned in paragraph 1A of this Agreement. The remaining down payment balance of $14,790.00 shall be paid at closing.</w:t>
-      </w:r>
-      <w:proofErr w:type="gramEnd"/>
-      <w:r>
-        <w:rPr>
-          <w:szCs w:val="28"/>
-        </w:rPr>
-      </w:r>
-      <w:proofErr w:type="gramStart"/>
-      <w:r>
-        <w:rPr>
-          <w:szCs w:val="28"/>
-        </w:rPr>
-      </w:r>
-      <w:proofErr w:type="gramEnd"/>
-      <w:r>
-        <w:rPr>
-          <w:szCs w:val="28"/>
-        </w:rPr>
-      </w:r>
-      <w:proofErr w:type="gramStart"/>
-      <w:r>
-        <w:rPr>
-          <w:szCs w:val="28"/>
-        </w:rPr>
-      </w:r>
-      <w:proofErr w:type="gramEnd"/>
-      <w:r>
-        <w:rPr>
-          <w:szCs w:val="28"/>
-        </w:rPr>
-      </w:r>
-      <w:proofErr w:type="gramStart"/>
-      <w:r>
-        <w:rPr>
-          <w:szCs w:val="28"/>
-        </w:rPr>
-      </w:r>
-      <w:proofErr w:type="gramEnd"/>
-      <w:r>
-        <w:rPr>
-          <w:szCs w:val="28"/>
-        </w:rPr>
-      </w:r>
-      <w:proofErr w:type="gramStart"/>
-      <w:r>
-        <w:rPr>
-          <w:szCs w:val="28"/>
-        </w:rPr>
-      </w:r>
-      <w:proofErr w:type="gramEnd"/>
-      <w:r>
-        <w:rPr>
-          <w:szCs w:val="28"/>
-        </w:rPr>
       </w:r>
     </w:p>
     <w:p>
@@ -5643,27 +4960,16 @@
         </w:rPr>
       </w:pPr>
       <w:r>
-        <w:t>STATE</w:t>
-      </w:r>
-      <w:proofErr w:type="gramStart"/>
-      <w:r>
-        <w:t xml:space="preserve">:   </w:t>
-      </w:r>
-      <w:r>
-        <w:tab/>
-      </w:r>
-      <w:r>
-        <w:rPr>
-          <w:u w:val="single"/>
-        </w:rPr>
-        <w:t>North</w:t>
-      </w:r>
-      <w:proofErr w:type="gramEnd"/>
-      <w:r>
-        <w:rPr>
-          <w:u w:val="single"/>
-        </w:rPr>
-        <w:t xml:space="preserve"> Carolina</w:t>
+        <w:t xml:space="preserve">STATE:   </w:t>
+      </w:r>
+      <w:r>
+        <w:tab/>
+      </w:r>
+      <w:r>
+        <w:rPr>
+          <w:u w:val="single"/>
+        </w:rPr>
+        <w:t>North Carolina</w:t>
       </w:r>
       <w:r>
         <w:rPr>
@@ -5684,9 +4990,6 @@
       <w:r>
         <w:t>COUNTY:  Wake</w:t>
       </w:r>
-      <w:proofErr w:type="gramStart"/>
-      <w:r/>
-      <w:proofErr w:type="gramEnd"/>
     </w:p>
     <w:p>
       <w:pPr>
@@ -5762,12 +5065,6 @@
         <w:rPr>
           <w:u w:val="single"/>
         </w:rPr>
-      </w:r>
-      <w:r/>
-      <w:r>
-        <w:rPr>
-          <w:u w:val="single"/>
-        </w:rPr>
         <w:tab/>
         <w:tab/>
         <w:tab/>
@@ -5807,7 +5104,6 @@
       </w:r>
       <w:r/>
       <w:r/>
-      <w:r/>
       <w:r>
         <w:t xml:space="preserve"> personally appeared before me this day and acknowledged the execution of the foregoing instrument.  Witness my hand and notarial seal,</w:t>
       </w:r>
@@ -5987,33 +5283,19 @@
         <w:rPr>
           <w:rStyle w:val="normaltextrun"/>
         </w:rPr>
-        <w:t xml:space="preserve">Notary </w:t>
-      </w:r>
-      <w:proofErr w:type="gramStart"/>
+        <w:t>Notary Public </w:t>
+      </w:r>
+      <w:r>
+        <w:rPr>
+          <w:rStyle w:val="eop"/>
+        </w:rPr>
+        <w:t> </w:t>
+      </w:r>
       <w:r>
         <w:rPr>
           <w:rStyle w:val="normaltextrun"/>
         </w:rPr>
-        <w:t>Public </w:t>
-      </w:r>
-      <w:r>
-        <w:rPr>
-          <w:rStyle w:val="eop"/>
-        </w:rPr>
-        <w:t> </w:t>
-      </w:r>
-      <w:r>
-        <w:rPr>
-          <w:rStyle w:val="normaltextrun"/>
-        </w:rPr>
-        <w:t>My</w:t>
-      </w:r>
-      <w:proofErr w:type="gramEnd"/>
-      <w:r>
-        <w:rPr>
-          <w:rStyle w:val="normaltextrun"/>
-        </w:rPr>
-        <w:t xml:space="preserve"> Commission expires:</w:t>
+        <w:t>My Commission expires:</w:t>
       </w:r>
       <w:r>
         <w:rPr>
@@ -8336,15 +7618,7 @@
 </file>
 
 <file path=customXml/item2.xml><?xml version="1.0" encoding="utf-8"?>
-<p:properties xmlns:p="http://schemas.microsoft.com/office/2006/metadata/properties" xmlns:xsi="http://www.w3.org/2001/XMLSchema-instance" xmlns:pc="http://schemas.microsoft.com/office/infopath/2007/PartnerControls">
-  <documentManagement>
-    <TaxCatchAll xmlns="42cc25d9-27fe-4f07-accb-ded05ec47eee" xsi:nil="true"/>
-    <lcf76f155ced4ddcb4097134ff3c332f xmlns="ab9fedca-001d-4cc9-b244-d9c3be5a27d3">
-      <Terms xmlns="http://schemas.microsoft.com/office/infopath/2007/PartnerControls"/>
-    </lcf76f155ced4ddcb4097134ff3c332f>
-    <_Flow_SignoffStatus xmlns="ab9fedca-001d-4cc9-b244-d9c3be5a27d3" xsi:nil="true"/>
-  </documentManagement>
-</p:properties>
+<b:Sources xmlns:b="http://schemas.openxmlformats.org/officeDocument/2006/bibliography" xmlns="http://schemas.openxmlformats.org/officeDocument/2006/bibliography" SelectedStyle="\APASixthEditionOfficeOnline.xsl" StyleName="APA" Version="6"/>
 </file>
 
 <file path=customXml/item3.xml><?xml version="1.0" encoding="utf-8"?>
@@ -8609,7 +7883,15 @@
 </file>
 
 <file path=customXml/item4.xml><?xml version="1.0" encoding="utf-8"?>
-<b:Sources xmlns:b="http://schemas.openxmlformats.org/officeDocument/2006/bibliography" xmlns="http://schemas.openxmlformats.org/officeDocument/2006/bibliography" SelectedStyle="\APASixthEditionOfficeOnline.xsl" StyleName="APA" Version="6"/>
+<p:properties xmlns:p="http://schemas.microsoft.com/office/2006/metadata/properties" xmlns:xsi="http://www.w3.org/2001/XMLSchema-instance" xmlns:pc="http://schemas.microsoft.com/office/infopath/2007/PartnerControls">
+  <documentManagement>
+    <TaxCatchAll xmlns="42cc25d9-27fe-4f07-accb-ded05ec47eee" xsi:nil="true"/>
+    <lcf76f155ced4ddcb4097134ff3c332f xmlns="ab9fedca-001d-4cc9-b244-d9c3be5a27d3">
+      <Terms xmlns="http://schemas.microsoft.com/office/infopath/2007/PartnerControls"/>
+    </lcf76f155ced4ddcb4097134ff3c332f>
+    <_Flow_SignoffStatus xmlns="ab9fedca-001d-4cc9-b244-d9c3be5a27d3" xsi:nil="true"/>
+  </documentManagement>
+</p:properties>
 </file>
 
 <file path=customXml/itemProps1.xml><?xml version="1.0" encoding="utf-8"?>
@@ -8621,12 +7903,9 @@
 </file>
 
 <file path=customXml/itemProps2.xml><?xml version="1.0" encoding="utf-8"?>
-<ds:datastoreItem xmlns:ds="http://schemas.openxmlformats.org/officeDocument/2006/customXml" ds:itemID="{1A4736DD-7889-4919-A280-9BE82A810A58}">
+<ds:datastoreItem xmlns:ds="http://schemas.openxmlformats.org/officeDocument/2006/customXml" ds:itemID="{3679C442-D341-425F-8964-A65FCEFD3D9B}">
   <ds:schemaRefs>
-    <ds:schemaRef ds:uri="http://schemas.microsoft.com/office/2006/metadata/properties"/>
-    <ds:schemaRef ds:uri="http://schemas.microsoft.com/office/infopath/2007/PartnerControls"/>
-    <ds:schemaRef ds:uri="42cc25d9-27fe-4f07-accb-ded05ec47eee"/>
-    <ds:schemaRef ds:uri="ab9fedca-001d-4cc9-b244-d9c3be5a27d3"/>
+    <ds:schemaRef ds:uri="http://schemas.openxmlformats.org/officeDocument/2006/bibliography"/>
   </ds:schemaRefs>
 </ds:datastoreItem>
 </file>
@@ -8651,9 +7930,12 @@
 </file>
 
 <file path=customXml/itemProps4.xml><?xml version="1.0" encoding="utf-8"?>
-<ds:datastoreItem xmlns:ds="http://schemas.openxmlformats.org/officeDocument/2006/customXml" ds:itemID="{3679C442-D341-425F-8964-A65FCEFD3D9B}">
+<ds:datastoreItem xmlns:ds="http://schemas.openxmlformats.org/officeDocument/2006/customXml" ds:itemID="{1A4736DD-7889-4919-A280-9BE82A810A58}">
   <ds:schemaRefs>
-    <ds:schemaRef ds:uri="http://schemas.openxmlformats.org/officeDocument/2006/bibliography"/>
+    <ds:schemaRef ds:uri="http://schemas.microsoft.com/office/2006/metadata/properties"/>
+    <ds:schemaRef ds:uri="http://schemas.microsoft.com/office/infopath/2007/PartnerControls"/>
+    <ds:schemaRef ds:uri="42cc25d9-27fe-4f07-accb-ded05ec47eee"/>
+    <ds:schemaRef ds:uri="ab9fedca-001d-4cc9-b244-d9c3be5a27d3"/>
   </ds:schemaRefs>
 </ds:datastoreItem>
 </file>
</xml_diff>

<commit_message>
Preserve installment formatting and add attorney contingency
</commit_message>
<xml_diff>
--- a/Project Rooms/Contract for Deed/output/320 Rose - Contract for Deed Agreement - DRAFT.docx
+++ b/Project Rooms/Contract for Deed/output/320 Rose - Contract for Deed Agreement - DRAFT.docx
@@ -113,7 +113,20 @@
           <w:szCs w:val="28"/>
         </w:rPr>
         <w:tab/>
-        <w:t>Whose principal address is:</w:t>
+      </w:r>
+      <w:proofErr w:type="gramStart"/>
+      <w:r>
+        <w:rPr>
+          <w:szCs w:val="28"/>
+        </w:rPr>
+        <w:t>Whose</w:t>
+      </w:r>
+      <w:proofErr w:type="gramEnd"/>
+      <w:r>
+        <w:rPr>
+          <w:szCs w:val="28"/>
+        </w:rPr>
+        <w:t xml:space="preserve"> principal address is:</w:t>
       </w:r>
     </w:p>
     <w:p>
@@ -1308,7 +1321,21 @@
         <w:rPr>
           <w:szCs w:val="24"/>
         </w:rPr>
-        <w:t xml:space="preserve">Existing mortgage balance encumbering the Property to be taken subject to by Purchaser (approximately).                     </w:t>
+        <w:t xml:space="preserve">Existing mortgage balance encumbering the Property to </w:t>
+      </w:r>
+      <w:proofErr w:type="gramStart"/>
+      <w:r>
+        <w:rPr>
+          <w:szCs w:val="24"/>
+        </w:rPr>
+        <w:t>be taken</w:t>
+      </w:r>
+      <w:proofErr w:type="gramEnd"/>
+      <w:r>
+        <w:rPr>
+          <w:szCs w:val="24"/>
+        </w:rPr>
+        <w:t xml:space="preserve"> subject to by Purchaser (approximately).                     </w:t>
       </w:r>
       <w:r>
         <w:rPr>
@@ -1342,7 +1369,21 @@
         <w:rPr>
           <w:szCs w:val="24"/>
         </w:rPr>
-        <w:t>Total Purchase Price  - exactly</w:t>
+        <w:t xml:space="preserve">Total Purchase </w:t>
+      </w:r>
+      <w:proofErr w:type="gramStart"/>
+      <w:r>
+        <w:rPr>
+          <w:szCs w:val="24"/>
+        </w:rPr>
+        <w:t>Price  -</w:t>
+      </w:r>
+      <w:proofErr w:type="gramEnd"/>
+      <w:r>
+        <w:rPr>
+          <w:szCs w:val="24"/>
+        </w:rPr>
+        <w:t xml:space="preserve"> exactly</w:t>
       </w:r>
       <w:r>
         <w:rPr>
@@ -1402,7 +1443,21 @@
         <w:rPr>
           <w:szCs w:val="28"/>
         </w:rPr>
-        <w:t>Purchaser agrees to provide an additional charges and fees associated with the recording of a Memorandum of (this) Contract for Deed and administrative costs of the Seller</w:t>
+        <w:t xml:space="preserve">Purchaser agrees to provide </w:t>
+      </w:r>
+      <w:proofErr w:type="gramStart"/>
+      <w:r>
+        <w:rPr>
+          <w:szCs w:val="28"/>
+        </w:rPr>
+        <w:t>an additional</w:t>
+      </w:r>
+      <w:proofErr w:type="gramEnd"/>
+      <w:r>
+        <w:rPr>
+          <w:szCs w:val="28"/>
+        </w:rPr>
+        <w:t xml:space="preserve"> charges and fees associated with the recording of a Memorandum of (this) Contract for Deed and administrative costs of the Seller</w:t>
       </w:r>
       <w:r>
         <w:rPr>
@@ -1531,7 +1586,14 @@
         <w:rPr>
           <w:szCs w:val="28"/>
         </w:rPr>
-        <w:t xml:space="preserve"> Wood Destroying Organism Report </w:t>
+        <w:t xml:space="preserve"> Wood Destroying Organism </w:t>
+      </w:r>
+      <w:proofErr w:type="gramStart"/>
+      <w:r>
+        <w:rPr>
+          <w:szCs w:val="28"/>
+        </w:rPr>
+        <w:t xml:space="preserve">Report </w:t>
       </w:r>
       <w:r>
         <w:rPr>
@@ -1545,13 +1607,38 @@
           <w:bCs/>
           <w:szCs w:val="28"/>
         </w:rPr>
-        <w:t>[X]</w:t>
-      </w:r>
-      <w:r>
-        <w:rPr>
-          <w:szCs w:val="28"/>
-        </w:rPr>
-        <w:t xml:space="preserve">  Real estate brokerage fee</w:t>
+        <w:t>[</w:t>
+      </w:r>
+      <w:proofErr w:type="gramEnd"/>
+      <w:r>
+        <w:rPr>
+          <w:b/>
+          <w:bCs/>
+          <w:szCs w:val="28"/>
+        </w:rPr>
+        <w:t>X</w:t>
+      </w:r>
+      <w:proofErr w:type="gramStart"/>
+      <w:r>
+        <w:rPr>
+          <w:b/>
+          <w:bCs/>
+          <w:szCs w:val="28"/>
+        </w:rPr>
+        <w:t>]</w:t>
+      </w:r>
+      <w:r>
+        <w:rPr>
+          <w:szCs w:val="28"/>
+        </w:rPr>
+        <w:t xml:space="preserve">  Real</w:t>
+      </w:r>
+      <w:proofErr w:type="gramEnd"/>
+      <w:r>
+        <w:rPr>
+          <w:szCs w:val="28"/>
+        </w:rPr>
+        <w:t xml:space="preserve"> estate brokerage fee</w:t>
       </w:r>
     </w:p>
     <w:p>
@@ -1611,7 +1698,21 @@
         <w:rPr>
           <w:szCs w:val="28"/>
         </w:rPr>
-        <w:t>[   ] Other______________________________________</w:t>
+        <w:t xml:space="preserve">[ </w:t>
+      </w:r>
+      <w:proofErr w:type="gramStart"/>
+      <w:r>
+        <w:rPr>
+          <w:szCs w:val="28"/>
+        </w:rPr>
+        <w:t xml:space="preserve">  ]</w:t>
+      </w:r>
+      <w:proofErr w:type="gramEnd"/>
+      <w:r>
+        <w:rPr>
+          <w:szCs w:val="28"/>
+        </w:rPr>
+        <w:t xml:space="preserve"> Other______________________________________</w:t>
       </w:r>
     </w:p>
     <w:p>
@@ -1701,16 +1802,34 @@
           <w:bCs/>
           <w:szCs w:val="28"/>
         </w:rPr>
-        <w:t xml:space="preserve">[X]Title insurance policy   </w:t>
-      </w:r>
+        <w:t xml:space="preserve">[X]Title insurance </w:t>
+      </w:r>
+      <w:proofErr w:type="gramStart"/>
       <w:r>
         <w:rPr>
           <w:b/>
           <w:bCs/>
           <w:szCs w:val="28"/>
         </w:rPr>
-        <w:tab/>
-        <w:t xml:space="preserve">[X] Attorney's fee </w:t>
+        <w:t xml:space="preserve">policy   </w:t>
+      </w:r>
+      <w:r>
+        <w:rPr>
+          <w:b/>
+          <w:bCs/>
+          <w:szCs w:val="28"/>
+        </w:rPr>
+        <w:tab/>
+        <w:t>[</w:t>
+      </w:r>
+      <w:proofErr w:type="gramEnd"/>
+      <w:r>
+        <w:rPr>
+          <w:b/>
+          <w:bCs/>
+          <w:szCs w:val="28"/>
+        </w:rPr>
+        <w:t xml:space="preserve">X] Attorney's fee </w:t>
       </w:r>
     </w:p>
     <w:p>
@@ -1735,16 +1854,34 @@
           <w:bCs/>
           <w:szCs w:val="28"/>
         </w:rPr>
-        <w:t xml:space="preserve">[X] Closing Costs   </w:t>
-      </w:r>
+        <w:t xml:space="preserve">[X] Closing </w:t>
+      </w:r>
+      <w:proofErr w:type="gramStart"/>
       <w:r>
         <w:rPr>
           <w:b/>
           <w:bCs/>
           <w:szCs w:val="28"/>
         </w:rPr>
-        <w:tab/>
-        <w:t xml:space="preserve">[X] Recording fees   </w:t>
+        <w:t xml:space="preserve">Costs   </w:t>
+      </w:r>
+      <w:r>
+        <w:rPr>
+          <w:b/>
+          <w:bCs/>
+          <w:szCs w:val="28"/>
+        </w:rPr>
+        <w:tab/>
+        <w:t>[</w:t>
+      </w:r>
+      <w:proofErr w:type="gramEnd"/>
+      <w:r>
+        <w:rPr>
+          <w:b/>
+          <w:bCs/>
+          <w:szCs w:val="28"/>
+        </w:rPr>
+        <w:t xml:space="preserve">X] Recording fees   </w:t>
       </w:r>
     </w:p>
     <w:p>
@@ -1769,16 +1906,34 @@
           <w:bCs/>
           <w:szCs w:val="28"/>
         </w:rPr>
-        <w:t xml:space="preserve">[X] Note stamps   </w:t>
-      </w:r>
+        <w:t xml:space="preserve">[X] Note </w:t>
+      </w:r>
+      <w:proofErr w:type="gramStart"/>
       <w:r>
         <w:rPr>
           <w:b/>
           <w:bCs/>
           <w:szCs w:val="28"/>
         </w:rPr>
-        <w:tab/>
-        <w:t xml:space="preserve">[X] Intangible tax    </w:t>
+        <w:t xml:space="preserve">stamps   </w:t>
+      </w:r>
+      <w:r>
+        <w:rPr>
+          <w:b/>
+          <w:bCs/>
+          <w:szCs w:val="28"/>
+        </w:rPr>
+        <w:tab/>
+        <w:t>[</w:t>
+      </w:r>
+      <w:proofErr w:type="gramEnd"/>
+      <w:r>
+        <w:rPr>
+          <w:b/>
+          <w:bCs/>
+          <w:szCs w:val="28"/>
+        </w:rPr>
+        <w:t xml:space="preserve">X] Intangible tax    </w:t>
       </w:r>
     </w:p>
     <w:p>
@@ -1822,14 +1977,42 @@
         <w:rPr>
           <w:szCs w:val="28"/>
         </w:rPr>
-        <w:t xml:space="preserve">[   ] Credit reports   </w:t>
-      </w:r>
-      <w:r>
-        <w:rPr>
-          <w:szCs w:val="28"/>
-        </w:rPr>
-        <w:tab/>
-        <w:t xml:space="preserve">[   ] Loan origination fee   </w:t>
+        <w:t xml:space="preserve">[ </w:t>
+      </w:r>
+      <w:proofErr w:type="gramStart"/>
+      <w:r>
+        <w:rPr>
+          <w:szCs w:val="28"/>
+        </w:rPr>
+        <w:t xml:space="preserve">  ]</w:t>
+      </w:r>
+      <w:proofErr w:type="gramEnd"/>
+      <w:r>
+        <w:rPr>
+          <w:szCs w:val="28"/>
+        </w:rPr>
+        <w:t xml:space="preserve"> Credit reports   </w:t>
+      </w:r>
+      <w:r>
+        <w:rPr>
+          <w:szCs w:val="28"/>
+        </w:rPr>
+        <w:tab/>
+        <w:t xml:space="preserve">[ </w:t>
+      </w:r>
+      <w:proofErr w:type="gramStart"/>
+      <w:r>
+        <w:rPr>
+          <w:szCs w:val="28"/>
+        </w:rPr>
+        <w:t xml:space="preserve">  ]</w:t>
+      </w:r>
+      <w:proofErr w:type="gramEnd"/>
+      <w:r>
+        <w:rPr>
+          <w:szCs w:val="28"/>
+        </w:rPr>
+        <w:t xml:space="preserve"> Loan origination fee   </w:t>
       </w:r>
     </w:p>
     <w:p>
@@ -1850,14 +2033,42 @@
         <w:rPr>
           <w:szCs w:val="28"/>
         </w:rPr>
-        <w:t xml:space="preserve">[   ] Loan insurance premium   </w:t>
-      </w:r>
-      <w:r>
-        <w:rPr>
-          <w:szCs w:val="28"/>
-        </w:rPr>
-        <w:tab/>
-        <w:t>[   ] Other_________________________________</w:t>
+        <w:t xml:space="preserve">[ </w:t>
+      </w:r>
+      <w:proofErr w:type="gramStart"/>
+      <w:r>
+        <w:rPr>
+          <w:szCs w:val="28"/>
+        </w:rPr>
+        <w:t xml:space="preserve">  ]</w:t>
+      </w:r>
+      <w:proofErr w:type="gramEnd"/>
+      <w:r>
+        <w:rPr>
+          <w:szCs w:val="28"/>
+        </w:rPr>
+        <w:t xml:space="preserve"> Loan insurance premium   </w:t>
+      </w:r>
+      <w:r>
+        <w:rPr>
+          <w:szCs w:val="28"/>
+        </w:rPr>
+        <w:tab/>
+        <w:t xml:space="preserve">[ </w:t>
+      </w:r>
+      <w:proofErr w:type="gramStart"/>
+      <w:r>
+        <w:rPr>
+          <w:szCs w:val="28"/>
+        </w:rPr>
+        <w:t xml:space="preserve">  ]</w:t>
+      </w:r>
+      <w:proofErr w:type="gramEnd"/>
+      <w:r>
+        <w:rPr>
+          <w:szCs w:val="28"/>
+        </w:rPr>
+        <w:t xml:space="preserve"> Other_________________________________</w:t>
       </w:r>
     </w:p>
     <w:p>
@@ -1874,11 +2085,19 @@
           <w:szCs w:val="28"/>
         </w:rPr>
       </w:pPr>
-      <w:r>
-        <w:rPr>
-          <w:szCs w:val="28"/>
-        </w:rPr>
-        <w:t>[  ] All other charges required by lender which Purchaser is prohibited from paying by law or regulation.</w:t>
+      <w:proofErr w:type="gramStart"/>
+      <w:r>
+        <w:rPr>
+          <w:szCs w:val="28"/>
+        </w:rPr>
+        <w:t>[  ]</w:t>
+      </w:r>
+      <w:proofErr w:type="gramEnd"/>
+      <w:r>
+        <w:rPr>
+          <w:szCs w:val="28"/>
+        </w:rPr>
+        <w:t xml:space="preserve"> All other charges required by lender which Purchaser is prohibited from paying by law or regulation.</w:t>
       </w:r>
     </w:p>
     <w:p>
@@ -1894,7 +2113,21 @@
         <w:rPr>
           <w:szCs w:val="28"/>
         </w:rPr>
-        <w:t>[   ] Repairs or replacements, in addition to those in paragraph 9, not to exceed $_________________________</w:t>
+        <w:t xml:space="preserve">[ </w:t>
+      </w:r>
+      <w:proofErr w:type="gramStart"/>
+      <w:r>
+        <w:rPr>
+          <w:szCs w:val="28"/>
+        </w:rPr>
+        <w:t xml:space="preserve">  ]</w:t>
+      </w:r>
+      <w:proofErr w:type="gramEnd"/>
+      <w:r>
+        <w:rPr>
+          <w:szCs w:val="28"/>
+        </w:rPr>
+        <w:t xml:space="preserve"> Repairs or replacements, in addition to those in paragraph 9, not to exceed $_________________________</w:t>
       </w:r>
     </w:p>
     <w:p>
@@ -1910,7 +2143,21 @@
         <w:rPr>
           <w:szCs w:val="28"/>
         </w:rPr>
-        <w:t xml:space="preserve">[   ] All mortgage payments or condominium and association fees will be </w:t>
+        <w:t xml:space="preserve">[ </w:t>
+      </w:r>
+      <w:proofErr w:type="gramStart"/>
+      <w:r>
+        <w:rPr>
+          <w:szCs w:val="28"/>
+        </w:rPr>
+        <w:t xml:space="preserve">  ]</w:t>
+      </w:r>
+      <w:proofErr w:type="gramEnd"/>
+      <w:r>
+        <w:rPr>
+          <w:szCs w:val="28"/>
+        </w:rPr>
+        <w:t xml:space="preserve"> All mortgage payments or condominium and association fees will be </w:t>
       </w:r>
       <w:r>
         <w:rPr>
@@ -1988,7 +2235,22 @@
     </w:p>
     <w:p>
       <w:pPr>
+        <w:pStyle w:val="ListParagraph"/>
+        <w:ind w:left="0"/>
+        <w:rPr>
+          <w:b/>
+          <w:bCs/>
+          <w:szCs w:val="28"/>
+        </w:rPr>
+      </w:pPr>
+    </w:p>
+    <w:p>
+      <w:pPr>
         <w:pStyle w:val="t1"/>
+        <w:numPr>
+          <w:ilvl w:val="0"/>
+          <w:numId w:val="10"/>
+        </w:numPr>
         <w:tabs>
           <w:tab w:val="left" w:pos="360"/>
           <w:tab w:val="left" w:pos="720"/>
@@ -1998,28 +2260,6 @@
           <w:tab w:val="left" w:pos="9780"/>
         </w:tabs>
         <w:spacing w:line="264" w:lineRule="auto"/>
-        <w:jc w:val="both"/>
-        <w:rPr>
-          <w:szCs w:val="28"/>
-        </w:rPr>
-      </w:pPr>
-    </w:p>
-    <w:p>
-      <w:pPr>
-        <w:pStyle w:val="t1"/>
-        <w:numPr>
-          <w:ilvl w:val="0"/>
-          <w:numId w:val="10"/>
-        </w:numPr>
-        <w:tabs>
-          <w:tab w:val="left" w:pos="360"/>
-          <w:tab w:val="left" w:pos="720"/>
-          <w:tab w:val="left" w:pos="3240"/>
-          <w:tab w:val="left" w:pos="7200"/>
-          <w:tab w:val="left" w:pos="8280"/>
-          <w:tab w:val="left" w:pos="9780"/>
-        </w:tabs>
-        <w:spacing w:line="264" w:lineRule="auto"/>
         <w:rPr>
           <w:b/>
           <w:bCs/>
@@ -2032,153 +2272,57 @@
           <w:bCs/>
           <w:szCs w:val="28"/>
         </w:rPr>
-        <w:t>INSTALLMENT PAYMENTS:</w:t>
+        <w:t>Installment Payments</w:t>
       </w:r>
     </w:p>
     <w:tbl>
       <w:tblPr>
-        <w:tblW w:type="auto" w:w="0"/>
+        <w:tblW w:w="10508" w:type="dxa"/>
         <w:jc w:val="center"/>
-        <w:tblLook w:firstColumn="1" w:firstRow="1" w:lastColumn="0" w:lastRow="0" w:noHBand="0" w:noVBand="1" w:val="04A0"/>
+        <w:tblLook w:val="04A0" w:firstRow="1" w:lastRow="0" w:firstColumn="1" w:lastColumn="0" w:noHBand="0" w:noVBand="1"/>
       </w:tblPr>
       <w:tblGrid>
-        <w:gridCol w:w="4680"/>
+        <w:gridCol w:w="5828"/>
         <w:gridCol w:w="4680"/>
       </w:tblGrid>
       <w:tr>
+        <w:trPr>
+          <w:jc w:val="center"/>
+        </w:trPr>
         <w:tc>
           <w:tcPr>
-            <w:tcW w:type="dxa" w:w="4680"/>
-            <w:vAlign w:val="top"/>
-          </w:tcPr>
-          <w:tbl>
-            <w:tblPr>
-              <w:tblStyle w:val="TableGrid"/>
-              <w:tblW w:type="auto" w:w="0"/>
-              <w:jc w:val="center"/>
-              <w:tblLook w:firstColumn="1" w:firstRow="1" w:lastColumn="0" w:lastRow="0" w:noHBand="0" w:noVBand="1" w:val="04A0"/>
-            </w:tblPr>
-            <w:tblGrid>
-              <w:gridCol w:w="4680"/>
-            </w:tblGrid>
-            <w:tr>
-              <w:tc>
-                <w:tcPr>
-                  <w:tcW w:type="dxa" w:w="4680"/>
-                  <w:vAlign w:val="center"/>
-                </w:tcPr>
-                <w:p>
-                  <w:pPr/>
-                  <w:r>
-                    <w:t>360</w:t>
-                  </w:r>
-                </w:p>
-              </w:tc>
-            </w:tr>
-            <w:tr>
-              <w:tc>
-                <w:tcPr>
-                  <w:tcW w:type="dxa" w:w="4680"/>
-                  <w:vAlign w:val="center"/>
-                </w:tcPr>
-                <w:p>
-                  <w:pPr/>
-                  <w:r>
-                    <w:t>7/1/2026</w:t>
-                  </w:r>
-                </w:p>
-              </w:tc>
-            </w:tr>
-            <w:tr>
-              <w:tc>
-                <w:tcPr>
-                  <w:tcW w:type="dxa" w:w="4680"/>
-                  <w:vAlign w:val="center"/>
-                </w:tcPr>
-                <w:p>
-                  <w:pPr/>
-                  <w:r>
-                    <w:t>6/1/2056</w:t>
-                  </w:r>
-                </w:p>
-              </w:tc>
-            </w:tr>
-            <w:tr>
-              <w:tc>
-                <w:tcPr>
-                  <w:tcW w:type="dxa" w:w="4680"/>
-                  <w:vAlign w:val="center"/>
-                </w:tcPr>
-                <w:p>
-                  <w:pPr/>
-                  <w:r>
-                    <w:t>2,504.43</w:t>
-                  </w:r>
-                </w:p>
-              </w:tc>
-            </w:tr>
-            <w:tr>
-              <w:tc>
-                <w:tcPr>
-                  <w:tcW w:type="dxa" w:w="4680"/>
-                  <w:vAlign w:val="center"/>
-                </w:tcPr>
-                <w:p>
-                  <w:pPr/>
-                  <w:r>
-                    <w:t>51.50</w:t>
-                  </w:r>
-                </w:p>
-              </w:tc>
-            </w:tr>
-            <w:tr>
-              <w:tc>
-                <w:tcPr>
-                  <w:tcW w:type="dxa" w:w="4680"/>
-                  <w:vAlign w:val="center"/>
-                </w:tcPr>
-                <w:p>
-                  <w:pPr/>
-                  <w:r>
-                    <w:t>145.10</w:t>
-                  </w:r>
-                </w:p>
-              </w:tc>
-            </w:tr>
-            <w:tr>
-              <w:tc>
-                <w:tcPr>
-                  <w:tcW w:type="dxa" w:w="4680"/>
-                  <w:vAlign w:val="center"/>
-                </w:tcPr>
-                <w:p>
-                  <w:pPr/>
-                  <w:r>
-                    <w:t>2,701.03</w:t>
-                  </w:r>
-                </w:p>
-              </w:tc>
-            </w:tr>
-          </w:tbl>
-          <w:p/>
-        </w:tc>
-        <w:tc>
-          <w:tcPr>
-            <w:tcW w:type="dxa" w:w="4680"/>
-            <w:vAlign w:val="top"/>
+            <w:tcW w:w="5828" w:type="dxa"/>
           </w:tcPr>
           <w:p>
             <w:pPr>
               <w:pStyle w:val="t1"/>
+              <w:numPr>
+                <w:ilvl w:val="1"/>
+                <w:numId w:val="10"/>
+              </w:numPr>
               <w:spacing w:line="264" w:lineRule="auto"/>
+              <w:ind w:right="-223"/>
             </w:pPr>
             <w:r>
-              <w:t>For the first instalments:</w:t>
+              <w:t>Number of I</w:t>
+            </w:r>
+            <w:r>
+              <w:t>nstal</w:t>
+            </w:r>
+            <w:r>
+              <w:t>l</w:t>
+            </w:r>
+            <w:r>
+              <w:t>ments:</w:t>
             </w:r>
           </w:p>
           <w:p>
             <w:pPr>
               <w:pStyle w:val="t1"/>
+              <w:numPr>
+                <w:ilvl w:val="1"/>
+                <w:numId w:val="10"/>
+              </w:numPr>
               <w:spacing w:line="264" w:lineRule="auto"/>
             </w:pPr>
             <w:r>
@@ -2188,6 +2332,10 @@
           <w:p>
             <w:pPr>
               <w:pStyle w:val="t1"/>
+              <w:numPr>
+                <w:ilvl w:val="1"/>
+                <w:numId w:val="10"/>
+              </w:numPr>
               <w:spacing w:line="264" w:lineRule="auto"/>
             </w:pPr>
             <w:r>
@@ -2197,6 +2345,10 @@
           <w:p>
             <w:pPr>
               <w:pStyle w:val="t1"/>
+              <w:numPr>
+                <w:ilvl w:val="1"/>
+                <w:numId w:val="10"/>
+              </w:numPr>
               <w:spacing w:line="264" w:lineRule="auto"/>
             </w:pPr>
             <w:r>
@@ -2206,6 +2358,10 @@
           <w:p>
             <w:pPr>
               <w:pStyle w:val="t1"/>
+              <w:numPr>
+                <w:ilvl w:val="1"/>
+                <w:numId w:val="10"/>
+              </w:numPr>
               <w:spacing w:line="264" w:lineRule="auto"/>
             </w:pPr>
             <w:r>
@@ -2215,6 +2371,10 @@
           <w:p>
             <w:pPr>
               <w:pStyle w:val="t1"/>
+              <w:numPr>
+                <w:ilvl w:val="1"/>
+                <w:numId w:val="10"/>
+              </w:numPr>
               <w:spacing w:line="264" w:lineRule="auto"/>
             </w:pPr>
             <w:r>
@@ -2224,6 +2384,10 @@
           <w:p>
             <w:pPr>
               <w:pStyle w:val="t1"/>
+              <w:numPr>
+                <w:ilvl w:val="1"/>
+                <w:numId w:val="10"/>
+              </w:numPr>
               <w:spacing w:line="264" w:lineRule="auto"/>
             </w:pPr>
             <w:r>
@@ -2232,24 +2396,307 @@
           </w:p>
           <w:p>
             <w:pPr>
-              <w:pStyle w:val="t1"/>
-              <w:spacing w:line="264" w:lineRule="auto"/>
+              <w:numPr>
+                <w:ilvl w:val="1"/>
+                <w:numId w:val="10"/>
+              </w:numPr>
             </w:pPr>
             <w:r>
               <w:t>(*) The property Insurance and Property Tax values are correct for the contract year only and will adjust annually.</w:t>
             </w:r>
           </w:p>
         </w:tc>
+        <w:tc>
+          <w:tcPr>
+            <w:tcW w:w="4680" w:type="dxa"/>
+          </w:tcPr>
+          <w:tbl>
+            <w:tblPr>
+              <w:tblW w:w="2284" w:type="dxa"/>
+              <w:jc w:val="center"/>
+              <w:tblBorders>
+                <w:top w:val="single" w:sz="4" w:space="0" w:color="auto"/>
+                <w:left w:val="single" w:sz="4" w:space="0" w:color="auto"/>
+                <w:bottom w:val="single" w:sz="4" w:space="0" w:color="auto"/>
+                <w:right w:val="single" w:sz="4" w:space="0" w:color="auto"/>
+                <w:insideH w:val="single" w:sz="4" w:space="0" w:color="auto"/>
+                <w:insideV w:val="single" w:sz="4" w:space="0" w:color="auto"/>
+              </w:tblBorders>
+              <w:tblLook w:val="04A0" w:firstRow="1" w:lastRow="0" w:firstColumn="1" w:lastColumn="0" w:noHBand="0" w:noVBand="1"/>
+            </w:tblPr>
+            <w:tblGrid>
+              <w:gridCol w:w="2284"/>
+            </w:tblGrid>
+            <w:tr>
+              <w:trPr>
+                <w:jc w:val="center"/>
+              </w:trPr>
+              <w:tc>
+                <w:tcPr>
+                  <w:tcW w:w="2284" w:type="dxa"/>
+                  <w:vAlign w:val="center"/>
+                </w:tcPr>
+                <w:p>
+                  <w:pPr>
+                    <w:jc w:val="right"/>
+                  </w:pPr>
+                  <w:r>
+                    <w:t>360</w:t>
+                  </w:r>
+                </w:p>
+              </w:tc>
+            </w:tr>
+            <w:tr>
+              <w:trPr>
+                <w:jc w:val="center"/>
+              </w:trPr>
+              <w:tc>
+                <w:tcPr>
+                  <w:tcW w:w="2284" w:type="dxa"/>
+                  <w:vAlign w:val="center"/>
+                </w:tcPr>
+                <w:p>
+                  <w:pPr>
+                    <w:jc w:val="right"/>
+                  </w:pPr>
+                  <w:r>
+                    <w:t>7/1/2026</w:t>
+                  </w:r>
+                </w:p>
+              </w:tc>
+            </w:tr>
+            <w:tr>
+              <w:trPr>
+                <w:jc w:val="center"/>
+              </w:trPr>
+              <w:tc>
+                <w:tcPr>
+                  <w:tcW w:w="2284" w:type="dxa"/>
+                  <w:vAlign w:val="center"/>
+                </w:tcPr>
+                <w:p>
+                  <w:pPr>
+                    <w:jc w:val="right"/>
+                  </w:pPr>
+                  <w:r>
+                    <w:t>6/1/2056</w:t>
+                  </w:r>
+                </w:p>
+              </w:tc>
+            </w:tr>
+            <w:tr>
+              <w:trPr>
+                <w:jc w:val="center"/>
+              </w:trPr>
+              <w:tc>
+                <w:tcPr>
+                  <w:tcW w:w="2284" w:type="dxa"/>
+                  <w:vAlign w:val="center"/>
+                </w:tcPr>
+                <w:p>
+                  <w:pPr>
+                    <w:jc w:val="right"/>
+                  </w:pPr>
+                  <w:r>
+                    <w:t>2,504.43</w:t>
+                  </w:r>
+                </w:p>
+              </w:tc>
+            </w:tr>
+            <w:tr>
+              <w:trPr>
+                <w:jc w:val="center"/>
+              </w:trPr>
+              <w:tc>
+                <w:tcPr>
+                  <w:tcW w:w="2284" w:type="dxa"/>
+                  <w:vAlign w:val="center"/>
+                </w:tcPr>
+                <w:p>
+                  <w:pPr>
+                    <w:jc w:val="right"/>
+                  </w:pPr>
+                  <w:r>
+                    <w:t>51.50</w:t>
+                  </w:r>
+                </w:p>
+              </w:tc>
+            </w:tr>
+            <w:tr>
+              <w:trPr>
+                <w:jc w:val="center"/>
+              </w:trPr>
+              <w:tc>
+                <w:tcPr>
+                  <w:tcW w:w="2284" w:type="dxa"/>
+                  <w:vAlign w:val="center"/>
+                </w:tcPr>
+                <w:p>
+                  <w:pPr>
+                    <w:jc w:val="right"/>
+                  </w:pPr>
+                  <w:r>
+                    <w:t>145.10</w:t>
+                  </w:r>
+                </w:p>
+              </w:tc>
+            </w:tr>
+            <w:tr>
+              <w:trPr>
+                <w:trHeight w:val="350"/>
+                <w:jc w:val="center"/>
+              </w:trPr>
+              <w:tc>
+                <w:tcPr>
+                  <w:tcW w:w="2284" w:type="dxa"/>
+                  <w:vAlign w:val="center"/>
+                </w:tcPr>
+                <w:p>
+                  <w:pPr>
+                    <w:jc w:val="right"/>
+                  </w:pPr>
+                  <w:r>
+                    <w:t>2,701.03</w:t>
+                  </w:r>
+                </w:p>
+              </w:tc>
+            </w:tr>
+          </w:tbl>
+          <w:p>
+            <w:pPr>
+              <w:pStyle w:val="t1"/>
+              <w:spacing w:line="264" w:lineRule="auto"/>
+            </w:pPr>
+            <w:r>
+              <w:t>360</w:t>
+            </w:r>
+          </w:p>
+          <w:p>
+            <w:pPr>
+              <w:pStyle w:val="t1"/>
+              <w:spacing w:line="264" w:lineRule="auto"/>
+            </w:pPr>
+            <w:r>
+              <w:t>7/1/2026</w:t>
+            </w:r>
+          </w:p>
+          <w:p>
+            <w:pPr>
+              <w:pStyle w:val="t1"/>
+              <w:spacing w:line="264" w:lineRule="auto"/>
+            </w:pPr>
+            <w:r>
+              <w:t>6/1/2056</w:t>
+            </w:r>
+          </w:p>
+          <w:p>
+            <w:pPr>
+              <w:pStyle w:val="t1"/>
+              <w:spacing w:line="264" w:lineRule="auto"/>
+            </w:pPr>
+            <w:r>
+              <w:t>2,504.43</w:t>
+            </w:r>
+          </w:p>
+          <w:p>
+            <w:pPr>
+              <w:pStyle w:val="t1"/>
+              <w:spacing w:line="264" w:lineRule="auto"/>
+            </w:pPr>
+            <w:r>
+              <w:t>51.50</w:t>
+            </w:r>
+          </w:p>
+          <w:p>
+            <w:pPr>
+              <w:pStyle w:val="t1"/>
+              <w:spacing w:line="264" w:lineRule="auto"/>
+            </w:pPr>
+            <w:r>
+              <w:t>145.10</w:t>
+            </w:r>
+          </w:p>
+          <w:p>
+            <w:pPr>
+              <w:pStyle w:val="t1"/>
+              <w:spacing w:line="264" w:lineRule="auto"/>
+            </w:pPr>
+            <w:r>
+              <w:t>2,701.03</w:t>
+            </w:r>
+          </w:p>
+        </w:tc>
+      </w:tr>
+      <w:tr>
+        <w:trPr>
+          <w:jc w:val="center"/>
+        </w:trPr>
+        <w:tc>
+          <w:tcPr>
+            <w:tcW w:w="5828" w:type="dxa"/>
+          </w:tcPr>
+          <w:p>
+            <w:pPr>
+              <w:pStyle w:val="t1"/>
+              <w:tabs>
+                <w:tab w:val="left" w:pos="360"/>
+                <w:tab w:val="left" w:pos="720"/>
+                <w:tab w:val="left" w:pos="3240"/>
+                <w:tab w:val="left" w:pos="7200"/>
+                <w:tab w:val="left" w:pos="8280"/>
+                <w:tab w:val="left" w:pos="9780"/>
+              </w:tabs>
+              <w:spacing w:line="264" w:lineRule="auto"/>
+              <w:ind w:left="360"/>
+              <w:jc w:val="both"/>
+              <w:rPr>
+                <w:b/>
+                <w:bCs/>
+                <w:szCs w:val="28"/>
+              </w:rPr>
+            </w:pPr>
+          </w:p>
+        </w:tc>
+        <w:tc>
+          <w:tcPr>
+            <w:tcW w:w="4680" w:type="dxa"/>
+          </w:tcPr>
+          <w:p>
+            <w:pPr>
+              <w:pStyle w:val="t1"/>
+              <w:numPr>
+                <w:ilvl w:val="0"/>
+                <w:numId w:val="10"/>
+              </w:numPr>
+              <w:tabs>
+                <w:tab w:val="left" w:pos="360"/>
+                <w:tab w:val="left" w:pos="720"/>
+                <w:tab w:val="left" w:pos="3240"/>
+                <w:tab w:val="left" w:pos="7200"/>
+                <w:tab w:val="left" w:pos="8280"/>
+                <w:tab w:val="left" w:pos="9780"/>
+              </w:tabs>
+              <w:spacing w:line="264" w:lineRule="auto"/>
+              <w:jc w:val="both"/>
+              <w:rPr>
+                <w:b/>
+                <w:bCs/>
+                <w:szCs w:val="28"/>
+              </w:rPr>
+            </w:pPr>
+          </w:p>
+        </w:tc>
       </w:tr>
     </w:tbl>
     <w:p>
       <w:pPr>
         <w:pStyle w:val="t1"/>
         <w:numPr>
-          <w:ilvl w:val="1"/>
+          <w:ilvl w:val="0"/>
           <w:numId w:val="10"/>
         </w:numPr>
         <w:tabs>
+          <w:tab w:val="left" w:pos="360"/>
           <w:tab w:val="left" w:pos="720"/>
           <w:tab w:val="left" w:pos="3240"/>
           <w:tab w:val="left" w:pos="7200"/>
@@ -2257,13 +2704,30 @@
           <w:tab w:val="left" w:pos="9780"/>
         </w:tabs>
         <w:spacing w:line="264" w:lineRule="auto"/>
-        <w:ind w:left="630"/>
-        <w:rPr>
-          <w:szCs w:val="24"/>
-        </w:rPr>
-      </w:pPr>
-      <w:r>
-        <w:t>ACH DRAFT PAYMENTS: Purchaser shall make each monthly payment by automatic ACH draft. Seller shall set up the ACH draft using the bank account and routing information provided by Purchaser on the signature page.</w:t>
+        <w:jc w:val="both"/>
+        <w:rPr>
+          <w:szCs w:val="24"/>
+        </w:rPr>
+      </w:pPr>
+      <w:r>
+        <w:rPr>
+          <w:b/>
+          <w:bCs/>
+          <w:szCs w:val="28"/>
+        </w:rPr>
+        <w:t xml:space="preserve">ACH DRAFT PAYMENTS: </w:t>
+      </w:r>
+      <w:r>
+        <w:rPr>
+          <w:szCs w:val="28"/>
+        </w:rPr>
+        <w:t>Purchaser shall make each monthly payment by automatic ACH draft. Seller shall set up the ACH draft using the bank account and routing information provided by Purchaser</w:t>
+      </w:r>
+      <w:r>
+        <w:t xml:space="preserve"> </w:t>
+      </w:r>
+      <w:r>
+        <w:t>on the signature page.</w:t>
       </w:r>
     </w:p>
     <w:p>
@@ -2392,6 +2856,14 @@
         <w:t>A lien to attorneys of 100,000</w:t>
       </w:r>
       <w:r/>
+      <w:proofErr w:type="spellStart"/>
+      <w:r/>
+      <w:proofErr w:type="spellEnd"/>
+      <w:r/>
+      <w:r/>
+      <w:proofErr w:type="gramStart"/>
+      <w:r/>
+      <w:proofErr w:type="gramEnd"/>
       <w:r/>
     </w:p>
     <w:p>
@@ -2426,14 +2898,28 @@
         <w:rPr>
           <w:szCs w:val="24"/>
         </w:rPr>
-        <w:t xml:space="preserve">A PURCHASER’S RIGHTS UNDER A CONTRACT FOR DEED SHALL NOT BE FORFEITED EXCEPT AS PROVIDED IN N.C. GEN. STAT. CHAPTER 47H. A CONTRACT FOR DEED CANNOT BE FORFEITED UNLESS A BREACH HAS OCCURRED IN ONE OR MORE OF THE PURCHASER’S EXPRESS OBLIGATIONS UNDER THE CONTRACT AND THE CONTRACT PROVIDES THAT AS A RESULT OF SUCH BREACH THE SELLER IS ENTITLED TO FORFEIT THE </w:t>
+        <w:t xml:space="preserve">A PURCHASER’S RIGHTS UNDER A CONTRACT FOR DEED SHALL NOT BE FORFEITED EXCEPT AS PROVIDED IN N.C. GEN. STAT. CHAPTER 47H. A CONTRACT FOR DEED CANNOT BE FORFEITED UNLESS A BREACH HAS OCCURRED IN ONE OR MORE OF </w:t>
+      </w:r>
+      <w:proofErr w:type="gramStart"/>
+      <w:r>
+        <w:rPr>
+          <w:szCs w:val="24"/>
+        </w:rPr>
+        <w:t>THE PURCHASER’S</w:t>
+      </w:r>
+      <w:proofErr w:type="gramEnd"/>
+      <w:r>
+        <w:rPr>
+          <w:szCs w:val="24"/>
+        </w:rPr>
+        <w:t xml:space="preserve"> EXPRESS OBLIGATIONS UNDER THE CONTRACT AND THE CONTRACT PROVIDES THAT AS A RESULT OF SUCH BREACH THE SELLER IS ENTITLED TO FORFEIT THE CONTRACT. EXAMPLES OF BREACH OF CONTRACT INCLUDE LACK OF PAYMENT EXTENDING BEYOND 15 DAYS OF DUE DATE, PROHIBITED USE OF </w:t>
       </w:r>
       <w:r>
         <w:rPr>
           <w:szCs w:val="24"/>
         </w:rPr>
         <w:lastRenderedPageBreak/>
-        <w:t>CONTRACT. EXAMPLES OF BREACH OF CONTRACT INCLUDE LACK OF PAYMENT EXTENDING BEYOND 15 DAYS OF DUE DATE, PROHIBITED USE OF PROPERTY, FRAUDULENT IDENTIFICATION, AND FRAUDULENT PAYMENTS. FURTHERMORE, THE PURCHASER’S RIGHTS SHALL NOT BE FORFEITED UNTIL THE PURCHASER HAS BEEN NOTIFIED OF THE INTENT TO FORFEIT IN ACCORDANCE WITH N.C. GEN. STAT. 47H-4 AND BEEN GIVEN A RIGHT TO CURE THE DEFAULT AND HAS FAILED TO DO SO WITHIN THE TIME PERIOD ALLOWED. A TIMELY TENDER OF CURE SHALL REINSTATE THE CONTRACT FOR DEED.</w:t>
+        <w:t>PROPERTY, FRAUDULENT IDENTIFICATION, AND FRAUDULENT PAYMENTS. FURTHERMORE, THE PURCHASER’S RIGHTS SHALL NOT BE FORFEITED UNTIL THE PURCHASER HAS BEEN NOTIFIED OF THE INTENT TO FORFEIT IN ACCORDANCE WITH N.C. GEN. STAT. 47H-4 AND BEEN GIVEN A RIGHT TO CURE THE DEFAULT AND HAS FAILED TO DO SO WITHIN THE TIME PERIOD ALLOWED. A TIMELY TENDER OF CURE SHALL REINSTATE THE CONTRACT FOR DEED.</w:t>
       </w:r>
     </w:p>
     <w:p>
@@ -2469,7 +2955,21 @@
         <w:rPr>
           <w:szCs w:val="24"/>
         </w:rPr>
-        <w:t xml:space="preserve">Any unauthorized or unpermitted construction, improvements, excavation (to include clearing, logging, and planting), or otherwise altering the property from its original condition at the time this contract is executed is prohibited.  Authorization may be given by the Seller for certain improvements if Purchaser submits an application in writing to make changes and receives authorization in writing from Seller.  Authorization will be withheld or granted solely at the discretion of the Seller. Additionally, any use not permitted by local, state, and federal laws and ordinances is prohibited. </w:t>
+        <w:t xml:space="preserve">Any unauthorized or unpermitted construction, improvements, excavation (to include clearing, logging, and planting), or otherwise altering the property from its original condition at the time this contract is executed is prohibited.  Authorization may be given by the Seller for certain improvements if Purchaser </w:t>
+      </w:r>
+      <w:proofErr w:type="gramStart"/>
+      <w:r>
+        <w:rPr>
+          <w:szCs w:val="24"/>
+        </w:rPr>
+        <w:t>submits an application</w:t>
+      </w:r>
+      <w:proofErr w:type="gramEnd"/>
+      <w:r>
+        <w:rPr>
+          <w:szCs w:val="24"/>
+        </w:rPr>
+        <w:t xml:space="preserve"> in writing to make changes and receives authorization in writing from Seller.  Authorization will be withheld or granted solely at the discretion of the Seller. Additionally, any use not permitted by local, state, and federal laws and ordinances is prohibited. </w:t>
       </w:r>
     </w:p>
     <w:p>
@@ -2504,7 +3004,21 @@
         <w:rPr>
           <w:szCs w:val="24"/>
         </w:rPr>
-        <w:t xml:space="preserve"> Purchaser may prepay some or all of the remaining Balance Owed on this contract at any time.</w:t>
+        <w:t xml:space="preserve"> Purchaser may prepay some or </w:t>
+      </w:r>
+      <w:proofErr w:type="gramStart"/>
+      <w:r>
+        <w:rPr>
+          <w:szCs w:val="24"/>
+        </w:rPr>
+        <w:t>all of</w:t>
+      </w:r>
+      <w:proofErr w:type="gramEnd"/>
+      <w:r>
+        <w:rPr>
+          <w:szCs w:val="24"/>
+        </w:rPr>
+        <w:t xml:space="preserve"> the remaining Balance Owed on this contract at any time.</w:t>
       </w:r>
     </w:p>
     <w:p>
@@ -2881,7 +3395,21 @@
         <w:rPr>
           <w:szCs w:val="28"/>
         </w:rPr>
-        <w:t xml:space="preserve"> has [  ] has not inspected the property and HAS NOT RELIED UPON ANY REPRESENTATIONS MADE BY ANY REAL ESTATE AGENT in describing the property, and Purchaser accepts the property in its PRESENT AS IS CONDITION, except as otherwise specified herein.</w:t>
+        <w:t xml:space="preserve"> has </w:t>
+      </w:r>
+      <w:proofErr w:type="gramStart"/>
+      <w:r>
+        <w:rPr>
+          <w:szCs w:val="28"/>
+        </w:rPr>
+        <w:t>[  ]</w:t>
+      </w:r>
+      <w:proofErr w:type="gramEnd"/>
+      <w:r>
+        <w:rPr>
+          <w:szCs w:val="28"/>
+        </w:rPr>
+        <w:t xml:space="preserve"> has not inspected the property and HAS NOT RELIED UPON ANY REPRESENTATIONS MADE BY ANY REAL ESTATE AGENT in describing the property, and Purchaser accepts the property in its PRESENT AS IS CONDITION, except as otherwise specified herein.</w:t>
       </w:r>
     </w:p>
     <w:p>
@@ -3031,7 +3559,25 @@
           <w:bCs/>
           <w:szCs w:val="28"/>
         </w:rPr>
-        <w:t>[   ] _____________days after date of satisfaction of all conditions in paragraph 19 unless extended by other conditions of this Agreement or this agreement is cancelled by the Purchaser.</w:t>
+        <w:t xml:space="preserve">[ </w:t>
+      </w:r>
+      <w:proofErr w:type="gramStart"/>
+      <w:r>
+        <w:rPr>
+          <w:b/>
+          <w:bCs/>
+          <w:szCs w:val="28"/>
+        </w:rPr>
+        <w:t xml:space="preserve">  ]</w:t>
+      </w:r>
+      <w:proofErr w:type="gramEnd"/>
+      <w:r>
+        <w:rPr>
+          <w:b/>
+          <w:bCs/>
+          <w:szCs w:val="28"/>
+        </w:rPr>
+        <w:t xml:space="preserve"> _____________days after date of satisfaction of all conditions in paragraph 19 unless extended by other conditions of this Agreement or this agreement is cancelled by the Purchaser.</w:t>
       </w:r>
       <w:r>
         <w:rPr>
@@ -3117,7 +3663,48 @@
         <w:rPr>
           <w:szCs w:val="28"/>
         </w:rPr>
-        <w:t>Additional Terms, Conditions or Addenda (lettered a,b,c,d, etc.)</w:t>
+        <w:t xml:space="preserve">Additional Terms, Conditions or Addenda (lettered </w:t>
+      </w:r>
+      <w:proofErr w:type="spellStart"/>
+      <w:proofErr w:type="gramStart"/>
+      <w:r>
+        <w:rPr>
+          <w:szCs w:val="28"/>
+        </w:rPr>
+        <w:t>a,b</w:t>
+      </w:r>
+      <w:proofErr w:type="gramEnd"/>
+      <w:r>
+        <w:rPr>
+          <w:szCs w:val="28"/>
+        </w:rPr>
+        <w:t>,</w:t>
+      </w:r>
+      <w:proofErr w:type="gramStart"/>
+      <w:r>
+        <w:rPr>
+          <w:szCs w:val="28"/>
+        </w:rPr>
+        <w:t>c,d</w:t>
+      </w:r>
+      <w:proofErr w:type="spellEnd"/>
+      <w:proofErr w:type="gramEnd"/>
+      <w:r>
+        <w:rPr>
+          <w:szCs w:val="28"/>
+        </w:rPr>
+        <w:t>, etc.)</w:t>
+      </w:r>
+    </w:p>
+    <w:p>
+      <w:pPr>
+        <w:spacing w:line="264" w:lineRule="auto"/>
+      </w:pPr>
+      <w:r>
+        <w:rPr>
+          <w:b/>
+        </w:rPr>
+        <w:t>This Contract is signed contingent upon any changes Seller's attorney may make or require. The parties shall sign the Contract again at closing with any such alterations incorporated. If any such changes are sufficient to cause Purchaser to withdraw from the transaction, Purchaser's due diligence funds shall be returned to Purchaser.</w:t>
       </w:r>
     </w:p>
     <w:p>
@@ -3350,13 +3937,28 @@
           <w:szCs w:val="28"/>
           <w:u w:val="single"/>
         </w:rPr>
-        <w:t xml:space="preserve">       </w:t>
-      </w:r>
-      <w:r>
-        <w:rPr>
-          <w:szCs w:val="28"/>
-        </w:rPr>
-        <w:t xml:space="preserve">. </w:t>
+        <w:t xml:space="preserve">     </w:t>
+      </w:r>
+      <w:proofErr w:type="gramStart"/>
+      <w:r>
+        <w:rPr>
+          <w:szCs w:val="28"/>
+          <w:u w:val="single"/>
+        </w:rPr>
+        <w:t xml:space="preserve">  </w:t>
+      </w:r>
+      <w:r>
+        <w:rPr>
+          <w:szCs w:val="28"/>
+        </w:rPr>
+        <w:t>.</w:t>
+      </w:r>
+      <w:proofErr w:type="gramEnd"/>
+      <w:r>
+        <w:rPr>
+          <w:szCs w:val="28"/>
+        </w:rPr>
+        <w:t xml:space="preserve"> </w:t>
       </w:r>
     </w:p>
     <w:p>
@@ -3464,7 +4066,15 @@
           <w:u w:val="single"/>
         </w:rPr>
         <w:tab/>
-        <w:t xml:space="preserve">       </w:t>
+        <w:t xml:space="preserve">     </w:t>
+      </w:r>
+      <w:proofErr w:type="gramStart"/>
+      <w:r>
+        <w:rPr>
+          <w:szCs w:val="28"/>
+          <w:u w:val="single"/>
+        </w:rPr>
+        <w:t xml:space="preserve">  </w:t>
       </w:r>
       <w:r>
         <w:rPr>
@@ -3472,6 +4082,7 @@
         </w:rPr>
         <w:t>.</w:t>
       </w:r>
+      <w:proofErr w:type="gramEnd"/>
     </w:p>
     <w:p>
       <w:pPr>
@@ -4027,16 +4638,27 @@
         </w:rPr>
       </w:pPr>
       <w:r>
-        <w:t xml:space="preserve">STATE:   </w:t>
-      </w:r>
-      <w:r>
-        <w:tab/>
-      </w:r>
-      <w:r>
-        <w:rPr>
-          <w:u w:val="single"/>
-        </w:rPr>
-        <w:t>North Carolina</w:t>
+        <w:t>STATE</w:t>
+      </w:r>
+      <w:proofErr w:type="gramStart"/>
+      <w:r>
+        <w:t xml:space="preserve">:   </w:t>
+      </w:r>
+      <w:r>
+        <w:tab/>
+      </w:r>
+      <w:r>
+        <w:rPr>
+          <w:u w:val="single"/>
+        </w:rPr>
+        <w:t>North</w:t>
+      </w:r>
+      <w:proofErr w:type="gramEnd"/>
+      <w:r>
+        <w:rPr>
+          <w:u w:val="single"/>
+        </w:rPr>
+        <w:t xml:space="preserve"> Carolina</w:t>
       </w:r>
     </w:p>
     <w:p>
@@ -4048,6 +4670,9 @@
       <w:r>
         <w:t>COUNTY:  Wake</w:t>
       </w:r>
+      <w:proofErr w:type="gramStart"/>
+      <w:r/>
+      <w:proofErr w:type="gramEnd"/>
     </w:p>
     <w:p>
       <w:pPr>
@@ -4235,7 +4860,14 @@
         <w:rPr>
           <w:rStyle w:val="normaltextrun"/>
         </w:rPr>
-        <w:t>Notary Public </w:t>
+        <w:t xml:space="preserve">Notary </w:t>
+      </w:r>
+      <w:proofErr w:type="gramStart"/>
+      <w:r>
+        <w:rPr>
+          <w:rStyle w:val="normaltextrun"/>
+        </w:rPr>
+        <w:t>Public </w:t>
       </w:r>
       <w:r>
         <w:rPr>
@@ -4247,7 +4879,14 @@
         <w:rPr>
           <w:rStyle w:val="normaltextrun"/>
         </w:rPr>
-        <w:t>My Commission expires:</w:t>
+        <w:t>My</w:t>
+      </w:r>
+      <w:proofErr w:type="gramEnd"/>
+      <w:r>
+        <w:rPr>
+          <w:rStyle w:val="normaltextrun"/>
+        </w:rPr>
+        <w:t xml:space="preserve"> Commission expires:</w:t>
       </w:r>
       <w:r>
         <w:rPr>
@@ -4567,11 +5206,66 @@
           <w:szCs w:val="28"/>
         </w:rPr>
       </w:pPr>
+      <w:proofErr w:type="gramStart"/>
       <w:r>
         <w:rPr>
           <w:szCs w:val="28"/>
         </w:rPr>
         <w:t>[ ] Agent   [X] Seller, by the signature below, acknowledge receipt of $6,000.00 [  ] Cash   [   ] Check, as earnest money deposit, which is credited toward the total down payment mentioned in paragraph 1A of this Agreement. The remaining down payment balance of $14,790.00 shall be paid at closing.</w:t>
+      </w:r>
+      <w:proofErr w:type="gramEnd"/>
+      <w:r>
+        <w:rPr>
+          <w:szCs w:val="28"/>
+        </w:rPr>
+      </w:r>
+      <w:proofErr w:type="gramStart"/>
+      <w:r>
+        <w:rPr>
+          <w:szCs w:val="28"/>
+        </w:rPr>
+      </w:r>
+      <w:proofErr w:type="gramEnd"/>
+      <w:r>
+        <w:rPr>
+          <w:szCs w:val="28"/>
+        </w:rPr>
+      </w:r>
+      <w:proofErr w:type="gramStart"/>
+      <w:r>
+        <w:rPr>
+          <w:szCs w:val="28"/>
+        </w:rPr>
+      </w:r>
+      <w:proofErr w:type="gramEnd"/>
+      <w:r>
+        <w:rPr>
+          <w:szCs w:val="28"/>
+        </w:rPr>
+      </w:r>
+      <w:proofErr w:type="gramStart"/>
+      <w:r>
+        <w:rPr>
+          <w:szCs w:val="28"/>
+        </w:rPr>
+      </w:r>
+      <w:proofErr w:type="gramEnd"/>
+      <w:r>
+        <w:rPr>
+          <w:szCs w:val="28"/>
+        </w:rPr>
+      </w:r>
+      <w:proofErr w:type="gramStart"/>
+      <w:r>
+        <w:rPr>
+          <w:szCs w:val="28"/>
+        </w:rPr>
+      </w:r>
+      <w:proofErr w:type="gramEnd"/>
+      <w:r>
+        <w:rPr>
+          <w:szCs w:val="28"/>
+        </w:rPr>
       </w:r>
     </w:p>
     <w:p>
@@ -4960,16 +5654,27 @@
         </w:rPr>
       </w:pPr>
       <w:r>
-        <w:t xml:space="preserve">STATE:   </w:t>
-      </w:r>
-      <w:r>
-        <w:tab/>
-      </w:r>
-      <w:r>
-        <w:rPr>
-          <w:u w:val="single"/>
-        </w:rPr>
-        <w:t>North Carolina</w:t>
+        <w:t>STATE</w:t>
+      </w:r>
+      <w:proofErr w:type="gramStart"/>
+      <w:r>
+        <w:t xml:space="preserve">:   </w:t>
+      </w:r>
+      <w:r>
+        <w:tab/>
+      </w:r>
+      <w:r>
+        <w:rPr>
+          <w:u w:val="single"/>
+        </w:rPr>
+        <w:t>North</w:t>
+      </w:r>
+      <w:proofErr w:type="gramEnd"/>
+      <w:r>
+        <w:rPr>
+          <w:u w:val="single"/>
+        </w:rPr>
+        <w:t xml:space="preserve"> Carolina</w:t>
       </w:r>
       <w:r>
         <w:rPr>
@@ -4990,6 +5695,9 @@
       <w:r>
         <w:t>COUNTY:  Wake</w:t>
       </w:r>
+      <w:proofErr w:type="gramStart"/>
+      <w:r/>
+      <w:proofErr w:type="gramEnd"/>
     </w:p>
     <w:p>
       <w:pPr>
@@ -5283,7 +5991,14 @@
         <w:rPr>
           <w:rStyle w:val="normaltextrun"/>
         </w:rPr>
-        <w:t>Notary Public </w:t>
+        <w:t xml:space="preserve">Notary </w:t>
+      </w:r>
+      <w:proofErr w:type="gramStart"/>
+      <w:r>
+        <w:rPr>
+          <w:rStyle w:val="normaltextrun"/>
+        </w:rPr>
+        <w:t>Public </w:t>
       </w:r>
       <w:r>
         <w:rPr>
@@ -5295,7 +6010,14 @@
         <w:rPr>
           <w:rStyle w:val="normaltextrun"/>
         </w:rPr>
-        <w:t>My Commission expires:</w:t>
+        <w:t>My</w:t>
+      </w:r>
+      <w:proofErr w:type="gramEnd"/>
+      <w:r>
+        <w:rPr>
+          <w:rStyle w:val="normaltextrun"/>
+        </w:rPr>
+        <w:t xml:space="preserve"> Commission expires:</w:t>
       </w:r>
       <w:r>
         <w:rPr>
@@ -7618,7 +8340,15 @@
 </file>
 
 <file path=customXml/item2.xml><?xml version="1.0" encoding="utf-8"?>
-<b:Sources xmlns:b="http://schemas.openxmlformats.org/officeDocument/2006/bibliography" xmlns="http://schemas.openxmlformats.org/officeDocument/2006/bibliography" SelectedStyle="\APASixthEditionOfficeOnline.xsl" StyleName="APA" Version="6"/>
+<p:properties xmlns:p="http://schemas.microsoft.com/office/2006/metadata/properties" xmlns:xsi="http://www.w3.org/2001/XMLSchema-instance" xmlns:pc="http://schemas.microsoft.com/office/infopath/2007/PartnerControls">
+  <documentManagement>
+    <TaxCatchAll xmlns="42cc25d9-27fe-4f07-accb-ded05ec47eee" xsi:nil="true"/>
+    <lcf76f155ced4ddcb4097134ff3c332f xmlns="ab9fedca-001d-4cc9-b244-d9c3be5a27d3">
+      <Terms xmlns="http://schemas.microsoft.com/office/infopath/2007/PartnerControls"/>
+    </lcf76f155ced4ddcb4097134ff3c332f>
+    <_Flow_SignoffStatus xmlns="ab9fedca-001d-4cc9-b244-d9c3be5a27d3" xsi:nil="true"/>
+  </documentManagement>
+</p:properties>
 </file>
 
 <file path=customXml/item3.xml><?xml version="1.0" encoding="utf-8"?>
@@ -7883,15 +8613,7 @@
 </file>
 
 <file path=customXml/item4.xml><?xml version="1.0" encoding="utf-8"?>
-<p:properties xmlns:p="http://schemas.microsoft.com/office/2006/metadata/properties" xmlns:xsi="http://www.w3.org/2001/XMLSchema-instance" xmlns:pc="http://schemas.microsoft.com/office/infopath/2007/PartnerControls">
-  <documentManagement>
-    <TaxCatchAll xmlns="42cc25d9-27fe-4f07-accb-ded05ec47eee" xsi:nil="true"/>
-    <lcf76f155ced4ddcb4097134ff3c332f xmlns="ab9fedca-001d-4cc9-b244-d9c3be5a27d3">
-      <Terms xmlns="http://schemas.microsoft.com/office/infopath/2007/PartnerControls"/>
-    </lcf76f155ced4ddcb4097134ff3c332f>
-    <_Flow_SignoffStatus xmlns="ab9fedca-001d-4cc9-b244-d9c3be5a27d3" xsi:nil="true"/>
-  </documentManagement>
-</p:properties>
+<b:Sources xmlns:b="http://schemas.openxmlformats.org/officeDocument/2006/bibliography" xmlns="http://schemas.openxmlformats.org/officeDocument/2006/bibliography" SelectedStyle="\APASixthEditionOfficeOnline.xsl" StyleName="APA" Version="6"/>
 </file>
 
 <file path=customXml/itemProps1.xml><?xml version="1.0" encoding="utf-8"?>
@@ -7903,9 +8625,12 @@
 </file>
 
 <file path=customXml/itemProps2.xml><?xml version="1.0" encoding="utf-8"?>
-<ds:datastoreItem xmlns:ds="http://schemas.openxmlformats.org/officeDocument/2006/customXml" ds:itemID="{3679C442-D341-425F-8964-A65FCEFD3D9B}">
+<ds:datastoreItem xmlns:ds="http://schemas.openxmlformats.org/officeDocument/2006/customXml" ds:itemID="{1A4736DD-7889-4919-A280-9BE82A810A58}">
   <ds:schemaRefs>
-    <ds:schemaRef ds:uri="http://schemas.openxmlformats.org/officeDocument/2006/bibliography"/>
+    <ds:schemaRef ds:uri="http://schemas.microsoft.com/office/2006/metadata/properties"/>
+    <ds:schemaRef ds:uri="http://schemas.microsoft.com/office/infopath/2007/PartnerControls"/>
+    <ds:schemaRef ds:uri="42cc25d9-27fe-4f07-accb-ded05ec47eee"/>
+    <ds:schemaRef ds:uri="ab9fedca-001d-4cc9-b244-d9c3be5a27d3"/>
   </ds:schemaRefs>
 </ds:datastoreItem>
 </file>
@@ -7930,12 +8655,9 @@
 </file>
 
 <file path=customXml/itemProps4.xml><?xml version="1.0" encoding="utf-8"?>
-<ds:datastoreItem xmlns:ds="http://schemas.openxmlformats.org/officeDocument/2006/customXml" ds:itemID="{1A4736DD-7889-4919-A280-9BE82A810A58}">
+<ds:datastoreItem xmlns:ds="http://schemas.openxmlformats.org/officeDocument/2006/customXml" ds:itemID="{3679C442-D341-425F-8964-A65FCEFD3D9B}">
   <ds:schemaRefs>
-    <ds:schemaRef ds:uri="http://schemas.microsoft.com/office/2006/metadata/properties"/>
-    <ds:schemaRef ds:uri="http://schemas.microsoft.com/office/infopath/2007/PartnerControls"/>
-    <ds:schemaRef ds:uri="42cc25d9-27fe-4f07-accb-ded05ec47eee"/>
-    <ds:schemaRef ds:uri="ab9fedca-001d-4cc9-b244-d9c3be5a27d3"/>
+    <ds:schemaRef ds:uri="http://schemas.openxmlformats.org/officeDocument/2006/bibliography"/>
   </ds:schemaRefs>
 </ds:datastoreItem>
 </file>
</xml_diff>

<commit_message>
Update attorney contingency and installment value table
</commit_message>
<xml_diff>
--- a/Project Rooms/Contract for Deed/output/320 Rose - Contract for Deed Agreement - DRAFT.docx
+++ b/Project Rooms/Contract for Deed/output/320 Rose - Contract for Deed Agreement - DRAFT.docx
@@ -113,20 +113,7 @@
           <w:szCs w:val="28"/>
         </w:rPr>
         <w:tab/>
-      </w:r>
-      <w:proofErr w:type="gramStart"/>
-      <w:r>
-        <w:rPr>
-          <w:szCs w:val="28"/>
-        </w:rPr>
-        <w:t>Whose</w:t>
-      </w:r>
-      <w:proofErr w:type="gramEnd"/>
-      <w:r>
-        <w:rPr>
-          <w:szCs w:val="28"/>
-        </w:rPr>
-        <w:t xml:space="preserve"> principal address is:</w:t>
+        <w:t>Whose principal address is:</w:t>
       </w:r>
     </w:p>
     <w:p>
@@ -1321,21 +1308,7 @@
         <w:rPr>
           <w:szCs w:val="24"/>
         </w:rPr>
-        <w:t xml:space="preserve">Existing mortgage balance encumbering the Property to </w:t>
-      </w:r>
-      <w:proofErr w:type="gramStart"/>
-      <w:r>
-        <w:rPr>
-          <w:szCs w:val="24"/>
-        </w:rPr>
-        <w:t>be taken</w:t>
-      </w:r>
-      <w:proofErr w:type="gramEnd"/>
-      <w:r>
-        <w:rPr>
-          <w:szCs w:val="24"/>
-        </w:rPr>
-        <w:t xml:space="preserve"> subject to by Purchaser (approximately).                     </w:t>
+        <w:t xml:space="preserve">Existing mortgage balance encumbering the Property to be taken subject to by Purchaser (approximately).                     </w:t>
       </w:r>
       <w:r>
         <w:rPr>
@@ -1369,21 +1342,7 @@
         <w:rPr>
           <w:szCs w:val="24"/>
         </w:rPr>
-        <w:t xml:space="preserve">Total Purchase </w:t>
-      </w:r>
-      <w:proofErr w:type="gramStart"/>
-      <w:r>
-        <w:rPr>
-          <w:szCs w:val="24"/>
-        </w:rPr>
-        <w:t>Price  -</w:t>
-      </w:r>
-      <w:proofErr w:type="gramEnd"/>
-      <w:r>
-        <w:rPr>
-          <w:szCs w:val="24"/>
-        </w:rPr>
-        <w:t xml:space="preserve"> exactly</w:t>
+        <w:t>Total Purchase Price  - exactly</w:t>
       </w:r>
       <w:r>
         <w:rPr>
@@ -1443,21 +1402,7 @@
         <w:rPr>
           <w:szCs w:val="28"/>
         </w:rPr>
-        <w:t xml:space="preserve">Purchaser agrees to provide </w:t>
-      </w:r>
-      <w:proofErr w:type="gramStart"/>
-      <w:r>
-        <w:rPr>
-          <w:szCs w:val="28"/>
-        </w:rPr>
-        <w:t>an additional</w:t>
-      </w:r>
-      <w:proofErr w:type="gramEnd"/>
-      <w:r>
-        <w:rPr>
-          <w:szCs w:val="28"/>
-        </w:rPr>
-        <w:t xml:space="preserve"> charges and fees associated with the recording of a Memorandum of (this) Contract for Deed and administrative costs of the Seller</w:t>
+        <w:t>Purchaser agrees to provide an additional charges and fees associated with the recording of a Memorandum of (this) Contract for Deed and administrative costs of the Seller</w:t>
       </w:r>
       <w:r>
         <w:rPr>
@@ -1586,14 +1531,7 @@
         <w:rPr>
           <w:szCs w:val="28"/>
         </w:rPr>
-        <w:t xml:space="preserve"> Wood Destroying Organism </w:t>
-      </w:r>
-      <w:proofErr w:type="gramStart"/>
-      <w:r>
-        <w:rPr>
-          <w:szCs w:val="28"/>
-        </w:rPr>
-        <w:t xml:space="preserve">Report </w:t>
+        <w:t xml:space="preserve"> Wood Destroying Organism Report </w:t>
       </w:r>
       <w:r>
         <w:rPr>
@@ -1607,38 +1545,13 @@
           <w:bCs/>
           <w:szCs w:val="28"/>
         </w:rPr>
-        <w:t>[</w:t>
-      </w:r>
-      <w:proofErr w:type="gramEnd"/>
-      <w:r>
-        <w:rPr>
-          <w:b/>
-          <w:bCs/>
-          <w:szCs w:val="28"/>
-        </w:rPr>
-        <w:t>X</w:t>
-      </w:r>
-      <w:proofErr w:type="gramStart"/>
-      <w:r>
-        <w:rPr>
-          <w:b/>
-          <w:bCs/>
-          <w:szCs w:val="28"/>
-        </w:rPr>
-        <w:t>]</w:t>
-      </w:r>
-      <w:r>
-        <w:rPr>
-          <w:szCs w:val="28"/>
-        </w:rPr>
-        <w:t xml:space="preserve">  Real</w:t>
-      </w:r>
-      <w:proofErr w:type="gramEnd"/>
-      <w:r>
-        <w:rPr>
-          <w:szCs w:val="28"/>
-        </w:rPr>
-        <w:t xml:space="preserve"> estate brokerage fee</w:t>
+        <w:t>[X]</w:t>
+      </w:r>
+      <w:r>
+        <w:rPr>
+          <w:szCs w:val="28"/>
+        </w:rPr>
+        <w:t xml:space="preserve">  Real estate brokerage fee</w:t>
       </w:r>
     </w:p>
     <w:p>
@@ -1698,21 +1611,7 @@
         <w:rPr>
           <w:szCs w:val="28"/>
         </w:rPr>
-        <w:t xml:space="preserve">[ </w:t>
-      </w:r>
-      <w:proofErr w:type="gramStart"/>
-      <w:r>
-        <w:rPr>
-          <w:szCs w:val="28"/>
-        </w:rPr>
-        <w:t xml:space="preserve">  ]</w:t>
-      </w:r>
-      <w:proofErr w:type="gramEnd"/>
-      <w:r>
-        <w:rPr>
-          <w:szCs w:val="28"/>
-        </w:rPr>
-        <w:t xml:space="preserve"> Other______________________________________</w:t>
+        <w:t>[   ] Other______________________________________</w:t>
       </w:r>
     </w:p>
     <w:p>
@@ -1802,34 +1701,16 @@
           <w:bCs/>
           <w:szCs w:val="28"/>
         </w:rPr>
-        <w:t xml:space="preserve">[X]Title insurance </w:t>
-      </w:r>
-      <w:proofErr w:type="gramStart"/>
+        <w:t xml:space="preserve">[X]Title insurance policy   </w:t>
+      </w:r>
       <w:r>
         <w:rPr>
           <w:b/>
           <w:bCs/>
           <w:szCs w:val="28"/>
         </w:rPr>
-        <w:t xml:space="preserve">policy   </w:t>
-      </w:r>
-      <w:r>
-        <w:rPr>
-          <w:b/>
-          <w:bCs/>
-          <w:szCs w:val="28"/>
-        </w:rPr>
-        <w:tab/>
-        <w:t>[</w:t>
-      </w:r>
-      <w:proofErr w:type="gramEnd"/>
-      <w:r>
-        <w:rPr>
-          <w:b/>
-          <w:bCs/>
-          <w:szCs w:val="28"/>
-        </w:rPr>
-        <w:t xml:space="preserve">X] Attorney's fee </w:t>
+        <w:tab/>
+        <w:t xml:space="preserve">[X] Attorney's fee </w:t>
       </w:r>
     </w:p>
     <w:p>
@@ -1854,34 +1735,16 @@
           <w:bCs/>
           <w:szCs w:val="28"/>
         </w:rPr>
-        <w:t xml:space="preserve">[X] Closing </w:t>
-      </w:r>
-      <w:proofErr w:type="gramStart"/>
+        <w:t xml:space="preserve">[X] Closing Costs   </w:t>
+      </w:r>
       <w:r>
         <w:rPr>
           <w:b/>
           <w:bCs/>
           <w:szCs w:val="28"/>
         </w:rPr>
-        <w:t xml:space="preserve">Costs   </w:t>
-      </w:r>
-      <w:r>
-        <w:rPr>
-          <w:b/>
-          <w:bCs/>
-          <w:szCs w:val="28"/>
-        </w:rPr>
-        <w:tab/>
-        <w:t>[</w:t>
-      </w:r>
-      <w:proofErr w:type="gramEnd"/>
-      <w:r>
-        <w:rPr>
-          <w:b/>
-          <w:bCs/>
-          <w:szCs w:val="28"/>
-        </w:rPr>
-        <w:t xml:space="preserve">X] Recording fees   </w:t>
+        <w:tab/>
+        <w:t xml:space="preserve">[X] Recording fees   </w:t>
       </w:r>
     </w:p>
     <w:p>
@@ -1906,34 +1769,16 @@
           <w:bCs/>
           <w:szCs w:val="28"/>
         </w:rPr>
-        <w:t xml:space="preserve">[X] Note </w:t>
-      </w:r>
-      <w:proofErr w:type="gramStart"/>
+        <w:t xml:space="preserve">[X] Note stamps   </w:t>
+      </w:r>
       <w:r>
         <w:rPr>
           <w:b/>
           <w:bCs/>
           <w:szCs w:val="28"/>
         </w:rPr>
-        <w:t xml:space="preserve">stamps   </w:t>
-      </w:r>
-      <w:r>
-        <w:rPr>
-          <w:b/>
-          <w:bCs/>
-          <w:szCs w:val="28"/>
-        </w:rPr>
-        <w:tab/>
-        <w:t>[</w:t>
-      </w:r>
-      <w:proofErr w:type="gramEnd"/>
-      <w:r>
-        <w:rPr>
-          <w:b/>
-          <w:bCs/>
-          <w:szCs w:val="28"/>
-        </w:rPr>
-        <w:t xml:space="preserve">X] Intangible tax    </w:t>
+        <w:tab/>
+        <w:t xml:space="preserve">[X] Intangible tax    </w:t>
       </w:r>
     </w:p>
     <w:p>
@@ -1977,42 +1822,14 @@
         <w:rPr>
           <w:szCs w:val="28"/>
         </w:rPr>
-        <w:t xml:space="preserve">[ </w:t>
-      </w:r>
-      <w:proofErr w:type="gramStart"/>
-      <w:r>
-        <w:rPr>
-          <w:szCs w:val="28"/>
-        </w:rPr>
-        <w:t xml:space="preserve">  ]</w:t>
-      </w:r>
-      <w:proofErr w:type="gramEnd"/>
-      <w:r>
-        <w:rPr>
-          <w:szCs w:val="28"/>
-        </w:rPr>
-        <w:t xml:space="preserve"> Credit reports   </w:t>
-      </w:r>
-      <w:r>
-        <w:rPr>
-          <w:szCs w:val="28"/>
-        </w:rPr>
-        <w:tab/>
-        <w:t xml:space="preserve">[ </w:t>
-      </w:r>
-      <w:proofErr w:type="gramStart"/>
-      <w:r>
-        <w:rPr>
-          <w:szCs w:val="28"/>
-        </w:rPr>
-        <w:t xml:space="preserve">  ]</w:t>
-      </w:r>
-      <w:proofErr w:type="gramEnd"/>
-      <w:r>
-        <w:rPr>
-          <w:szCs w:val="28"/>
-        </w:rPr>
-        <w:t xml:space="preserve"> Loan origination fee   </w:t>
+        <w:t xml:space="preserve">[   ] Credit reports   </w:t>
+      </w:r>
+      <w:r>
+        <w:rPr>
+          <w:szCs w:val="28"/>
+        </w:rPr>
+        <w:tab/>
+        <w:t xml:space="preserve">[   ] Loan origination fee   </w:t>
       </w:r>
     </w:p>
     <w:p>
@@ -2033,42 +1850,14 @@
         <w:rPr>
           <w:szCs w:val="28"/>
         </w:rPr>
-        <w:t xml:space="preserve">[ </w:t>
-      </w:r>
-      <w:proofErr w:type="gramStart"/>
-      <w:r>
-        <w:rPr>
-          <w:szCs w:val="28"/>
-        </w:rPr>
-        <w:t xml:space="preserve">  ]</w:t>
-      </w:r>
-      <w:proofErr w:type="gramEnd"/>
-      <w:r>
-        <w:rPr>
-          <w:szCs w:val="28"/>
-        </w:rPr>
-        <w:t xml:space="preserve"> Loan insurance premium   </w:t>
-      </w:r>
-      <w:r>
-        <w:rPr>
-          <w:szCs w:val="28"/>
-        </w:rPr>
-        <w:tab/>
-        <w:t xml:space="preserve">[ </w:t>
-      </w:r>
-      <w:proofErr w:type="gramStart"/>
-      <w:r>
-        <w:rPr>
-          <w:szCs w:val="28"/>
-        </w:rPr>
-        <w:t xml:space="preserve">  ]</w:t>
-      </w:r>
-      <w:proofErr w:type="gramEnd"/>
-      <w:r>
-        <w:rPr>
-          <w:szCs w:val="28"/>
-        </w:rPr>
-        <w:t xml:space="preserve"> Other_________________________________</w:t>
+        <w:t xml:space="preserve">[   ] Loan insurance premium   </w:t>
+      </w:r>
+      <w:r>
+        <w:rPr>
+          <w:szCs w:val="28"/>
+        </w:rPr>
+        <w:tab/>
+        <w:t>[   ] Other_________________________________</w:t>
       </w:r>
     </w:p>
     <w:p>
@@ -2085,19 +1874,11 @@
           <w:szCs w:val="28"/>
         </w:rPr>
       </w:pPr>
-      <w:proofErr w:type="gramStart"/>
-      <w:r>
-        <w:rPr>
-          <w:szCs w:val="28"/>
-        </w:rPr>
-        <w:t>[  ]</w:t>
-      </w:r>
-      <w:proofErr w:type="gramEnd"/>
-      <w:r>
-        <w:rPr>
-          <w:szCs w:val="28"/>
-        </w:rPr>
-        <w:t xml:space="preserve"> All other charges required by lender which Purchaser is prohibited from paying by law or regulation.</w:t>
+      <w:r>
+        <w:rPr>
+          <w:szCs w:val="28"/>
+        </w:rPr>
+        <w:t>[  ] All other charges required by lender which Purchaser is prohibited from paying by law or regulation.</w:t>
       </w:r>
     </w:p>
     <w:p>
@@ -2113,21 +1894,7 @@
         <w:rPr>
           <w:szCs w:val="28"/>
         </w:rPr>
-        <w:t xml:space="preserve">[ </w:t>
-      </w:r>
-      <w:proofErr w:type="gramStart"/>
-      <w:r>
-        <w:rPr>
-          <w:szCs w:val="28"/>
-        </w:rPr>
-        <w:t xml:space="preserve">  ]</w:t>
-      </w:r>
-      <w:proofErr w:type="gramEnd"/>
-      <w:r>
-        <w:rPr>
-          <w:szCs w:val="28"/>
-        </w:rPr>
-        <w:t xml:space="preserve"> Repairs or replacements, in addition to those in paragraph 9, not to exceed $_________________________</w:t>
+        <w:t>[   ] Repairs or replacements, in addition to those in paragraph 9, not to exceed $_________________________</w:t>
       </w:r>
     </w:p>
     <w:p>
@@ -2143,21 +1910,7 @@
         <w:rPr>
           <w:szCs w:val="28"/>
         </w:rPr>
-        <w:t xml:space="preserve">[ </w:t>
-      </w:r>
-      <w:proofErr w:type="gramStart"/>
-      <w:r>
-        <w:rPr>
-          <w:szCs w:val="28"/>
-        </w:rPr>
-        <w:t xml:space="preserve">  ]</w:t>
-      </w:r>
-      <w:proofErr w:type="gramEnd"/>
-      <w:r>
-        <w:rPr>
-          <w:szCs w:val="28"/>
-        </w:rPr>
-        <w:t xml:space="preserve"> All mortgage payments or condominium and association fees will be </w:t>
+        <w:t xml:space="preserve">[   ] All mortgage payments or condominium and association fees will be </w:t>
       </w:r>
       <w:r>
         <w:rPr>
@@ -2277,13 +2030,13 @@
     </w:p>
     <w:tbl>
       <w:tblPr>
-        <w:tblW w:w="10508" w:type="dxa"/>
+        <w:tblW w:w="9737" w:type="dxa"/>
         <w:jc w:val="center"/>
         <w:tblLook w:val="04A0" w:firstRow="1" w:lastRow="0" w:firstColumn="1" w:lastColumn="0" w:noHBand="0" w:noVBand="1"/>
       </w:tblPr>
       <w:tblGrid>
         <w:gridCol w:w="5828"/>
-        <w:gridCol w:w="4680"/>
+        <w:gridCol w:w="3909"/>
       </w:tblGrid>
       <w:tr>
         <w:trPr>
@@ -2394,21 +2147,11 @@
               <w:t>Total Monthly Payment:</w:t>
             </w:r>
           </w:p>
-          <w:p>
-            <w:pPr>
-              <w:numPr>
-                <w:ilvl w:val="1"/>
-                <w:numId w:val="10"/>
-              </w:numPr>
-            </w:pPr>
-            <w:r>
-              <w:t>(*) The property Insurance and Property Tax values are correct for the contract year only and will adjust annually.</w:t>
-            </w:r>
-          </w:p>
+          <w:p/>
         </w:tc>
         <w:tc>
           <w:tcPr>
-            <w:tcW w:w="4680" w:type="dxa"/>
+            <w:tcW w:w="3909" w:type="dxa"/>
           </w:tcPr>
           <w:tbl>
             <w:tblPr>
@@ -2567,127 +2310,56 @@
               <w:pStyle w:val="t1"/>
               <w:spacing w:line="264" w:lineRule="auto"/>
             </w:pPr>
-            <w:r>
-              <w:t>360</w:t>
-            </w:r>
-          </w:p>
-          <w:p>
-            <w:pPr>
-              <w:pStyle w:val="t1"/>
-              <w:spacing w:line="264" w:lineRule="auto"/>
-            </w:pPr>
-            <w:r>
-              <w:t>7/1/2026</w:t>
-            </w:r>
-          </w:p>
-          <w:p>
-            <w:pPr>
-              <w:pStyle w:val="t1"/>
-              <w:spacing w:line="264" w:lineRule="auto"/>
-            </w:pPr>
-            <w:r>
-              <w:t>6/1/2056</w:t>
-            </w:r>
-          </w:p>
-          <w:p>
-            <w:pPr>
-              <w:pStyle w:val="t1"/>
-              <w:spacing w:line="264" w:lineRule="auto"/>
-            </w:pPr>
-            <w:r>
-              <w:t>2,504.43</w:t>
-            </w:r>
-          </w:p>
-          <w:p>
-            <w:pPr>
-              <w:pStyle w:val="t1"/>
-              <w:spacing w:line="264" w:lineRule="auto"/>
-            </w:pPr>
-            <w:r>
-              <w:t>51.50</w:t>
-            </w:r>
-          </w:p>
-          <w:p>
-            <w:pPr>
-              <w:pStyle w:val="t1"/>
-              <w:spacing w:line="264" w:lineRule="auto"/>
-            </w:pPr>
-            <w:r>
-              <w:t>145.10</w:t>
-            </w:r>
-          </w:p>
-          <w:p>
-            <w:pPr>
-              <w:pStyle w:val="t1"/>
-              <w:spacing w:line="264" w:lineRule="auto"/>
-            </w:pPr>
-            <w:r>
-              <w:t>2,701.03</w:t>
-            </w:r>
-          </w:p>
-        </w:tc>
-      </w:tr>
-      <w:tr>
-        <w:trPr>
-          <w:jc w:val="center"/>
-        </w:trPr>
-        <w:tc>
-          <w:tcPr>
-            <w:tcW w:w="5828" w:type="dxa"/>
-          </w:tcPr>
-          <w:p>
-            <w:pPr>
-              <w:pStyle w:val="t1"/>
-              <w:tabs>
-                <w:tab w:val="left" w:pos="360"/>
-                <w:tab w:val="left" w:pos="720"/>
-                <w:tab w:val="left" w:pos="3240"/>
-                <w:tab w:val="left" w:pos="7200"/>
-                <w:tab w:val="left" w:pos="8280"/>
-                <w:tab w:val="left" w:pos="9780"/>
-              </w:tabs>
-              <w:spacing w:line="264" w:lineRule="auto"/>
-              <w:ind w:left="360"/>
-              <w:jc w:val="both"/>
-              <w:rPr>
-                <w:b/>
-                <w:bCs/>
-                <w:szCs w:val="28"/>
-              </w:rPr>
-            </w:pPr>
-          </w:p>
-        </w:tc>
-        <w:tc>
-          <w:tcPr>
-            <w:tcW w:w="4680" w:type="dxa"/>
-          </w:tcPr>
-          <w:p>
-            <w:pPr>
-              <w:pStyle w:val="t1"/>
-              <w:numPr>
-                <w:ilvl w:val="0"/>
-                <w:numId w:val="10"/>
-              </w:numPr>
-              <w:tabs>
-                <w:tab w:val="left" w:pos="360"/>
-                <w:tab w:val="left" w:pos="720"/>
-                <w:tab w:val="left" w:pos="3240"/>
-                <w:tab w:val="left" w:pos="7200"/>
-                <w:tab w:val="left" w:pos="8280"/>
-                <w:tab w:val="left" w:pos="9780"/>
-              </w:tabs>
-              <w:spacing w:line="264" w:lineRule="auto"/>
-              <w:jc w:val="both"/>
-              <w:rPr>
-                <w:b/>
-                <w:bCs/>
-                <w:szCs w:val="28"/>
-              </w:rPr>
-            </w:pPr>
           </w:p>
         </w:tc>
       </w:tr>
     </w:tbl>
+    <w:p>
+      <w:pPr>
+        <w:pStyle w:val="t1"/>
+        <w:numPr>
+          <w:ilvl w:val="1"/>
+          <w:numId w:val="10"/>
+        </w:numPr>
+        <w:tabs>
+          <w:tab w:val="left" w:pos="720"/>
+          <w:tab w:val="left" w:pos="3240"/>
+          <w:tab w:val="left" w:pos="7200"/>
+          <w:tab w:val="left" w:pos="8280"/>
+          <w:tab w:val="left" w:pos="9780"/>
+        </w:tabs>
+        <w:spacing w:line="264" w:lineRule="auto"/>
+        <w:ind w:left="630"/>
+        <w:jc w:val="both"/>
+        <w:rPr>
+          <w:szCs w:val="24"/>
+        </w:rPr>
+      </w:pPr>
+      <w:r>
+        <w:t>(</w:t>
+      </w:r>
+      <w:r>
+        <w:t>*) The property Insurance and Property Tax values are correct for the contract year only and will adjust annually.</w:t>
+      </w:r>
+    </w:p>
+    <w:p>
+      <w:pPr>
+        <w:pStyle w:val="t1"/>
+        <w:tabs>
+          <w:tab w:val="left" w:pos="720"/>
+          <w:tab w:val="left" w:pos="3240"/>
+          <w:tab w:val="left" w:pos="7200"/>
+          <w:tab w:val="left" w:pos="8280"/>
+          <w:tab w:val="left" w:pos="9780"/>
+        </w:tabs>
+        <w:spacing w:line="264" w:lineRule="auto"/>
+        <w:ind w:left="630"/>
+        <w:jc w:val="both"/>
+        <w:rPr>
+          <w:szCs w:val="24"/>
+        </w:rPr>
+      </w:pPr>
+    </w:p>
     <w:p>
       <w:pPr>
         <w:pStyle w:val="t1"/>
@@ -2856,14 +2528,6 @@
         <w:t>A lien to attorneys of 100,000</w:t>
       </w:r>
       <w:r/>
-      <w:proofErr w:type="spellStart"/>
-      <w:r/>
-      <w:proofErr w:type="spellEnd"/>
-      <w:r/>
-      <w:r/>
-      <w:proofErr w:type="gramStart"/>
-      <w:r/>
-      <w:proofErr w:type="gramEnd"/>
       <w:r/>
     </w:p>
     <w:p>
@@ -2898,21 +2562,7 @@
         <w:rPr>
           <w:szCs w:val="24"/>
         </w:rPr>
-        <w:t xml:space="preserve">A PURCHASER’S RIGHTS UNDER A CONTRACT FOR DEED SHALL NOT BE FORFEITED EXCEPT AS PROVIDED IN N.C. GEN. STAT. CHAPTER 47H. A CONTRACT FOR DEED CANNOT BE FORFEITED UNLESS A BREACH HAS OCCURRED IN ONE OR MORE OF </w:t>
-      </w:r>
-      <w:proofErr w:type="gramStart"/>
-      <w:r>
-        <w:rPr>
-          <w:szCs w:val="24"/>
-        </w:rPr>
-        <w:t>THE PURCHASER’S</w:t>
-      </w:r>
-      <w:proofErr w:type="gramEnd"/>
-      <w:r>
-        <w:rPr>
-          <w:szCs w:val="24"/>
-        </w:rPr>
-        <w:t xml:space="preserve"> EXPRESS OBLIGATIONS UNDER THE CONTRACT AND THE CONTRACT PROVIDES THAT AS A RESULT OF SUCH BREACH THE SELLER IS ENTITLED TO FORFEIT THE CONTRACT. EXAMPLES OF BREACH OF CONTRACT INCLUDE LACK OF PAYMENT EXTENDING BEYOND 15 DAYS OF DUE DATE, PROHIBITED USE OF </w:t>
+        <w:t xml:space="preserve">A PURCHASER’S RIGHTS UNDER A CONTRACT FOR DEED SHALL NOT BE FORFEITED EXCEPT AS PROVIDED IN N.C. GEN. STAT. CHAPTER 47H. A CONTRACT FOR DEED CANNOT BE FORFEITED UNLESS A BREACH HAS OCCURRED IN ONE OR MORE OF THE PURCHASER’S EXPRESS OBLIGATIONS UNDER THE CONTRACT AND THE CONTRACT PROVIDES THAT AS A RESULT OF SUCH BREACH THE SELLER IS ENTITLED TO FORFEIT THE CONTRACT. EXAMPLES OF BREACH OF CONTRACT INCLUDE LACK OF PAYMENT EXTENDING BEYOND 15 DAYS OF DUE DATE, PROHIBITED USE OF </w:t>
       </w:r>
       <w:r>
         <w:rPr>
@@ -2955,21 +2605,7 @@
         <w:rPr>
           <w:szCs w:val="24"/>
         </w:rPr>
-        <w:t xml:space="preserve">Any unauthorized or unpermitted construction, improvements, excavation (to include clearing, logging, and planting), or otherwise altering the property from its original condition at the time this contract is executed is prohibited.  Authorization may be given by the Seller for certain improvements if Purchaser </w:t>
-      </w:r>
-      <w:proofErr w:type="gramStart"/>
-      <w:r>
-        <w:rPr>
-          <w:szCs w:val="24"/>
-        </w:rPr>
-        <w:t>submits an application</w:t>
-      </w:r>
-      <w:proofErr w:type="gramEnd"/>
-      <w:r>
-        <w:rPr>
-          <w:szCs w:val="24"/>
-        </w:rPr>
-        <w:t xml:space="preserve"> in writing to make changes and receives authorization in writing from Seller.  Authorization will be withheld or granted solely at the discretion of the Seller. Additionally, any use not permitted by local, state, and federal laws and ordinances is prohibited. </w:t>
+        <w:t xml:space="preserve">Any unauthorized or unpermitted construction, improvements, excavation (to include clearing, logging, and planting), or otherwise altering the property from its original condition at the time this contract is executed is prohibited.  Authorization may be given by the Seller for certain improvements if Purchaser submits an application in writing to make changes and receives authorization in writing from Seller.  Authorization will be withheld or granted solely at the discretion of the Seller. Additionally, any use not permitted by local, state, and federal laws and ordinances is prohibited. </w:t>
       </w:r>
     </w:p>
     <w:p>
@@ -3004,21 +2640,7 @@
         <w:rPr>
           <w:szCs w:val="24"/>
         </w:rPr>
-        <w:t xml:space="preserve"> Purchaser may prepay some or </w:t>
-      </w:r>
-      <w:proofErr w:type="gramStart"/>
-      <w:r>
-        <w:rPr>
-          <w:szCs w:val="24"/>
-        </w:rPr>
-        <w:t>all of</w:t>
-      </w:r>
-      <w:proofErr w:type="gramEnd"/>
-      <w:r>
-        <w:rPr>
-          <w:szCs w:val="24"/>
-        </w:rPr>
-        <w:t xml:space="preserve"> the remaining Balance Owed on this contract at any time.</w:t>
+        <w:t xml:space="preserve"> Purchaser may prepay some or all of the remaining Balance Owed on this contract at any time.</w:t>
       </w:r>
     </w:p>
     <w:p>
@@ -3395,21 +3017,7 @@
         <w:rPr>
           <w:szCs w:val="28"/>
         </w:rPr>
-        <w:t xml:space="preserve"> has </w:t>
-      </w:r>
-      <w:proofErr w:type="gramStart"/>
-      <w:r>
-        <w:rPr>
-          <w:szCs w:val="28"/>
-        </w:rPr>
-        <w:t>[  ]</w:t>
-      </w:r>
-      <w:proofErr w:type="gramEnd"/>
-      <w:r>
-        <w:rPr>
-          <w:szCs w:val="28"/>
-        </w:rPr>
-        <w:t xml:space="preserve"> has not inspected the property and HAS NOT RELIED UPON ANY REPRESENTATIONS MADE BY ANY REAL ESTATE AGENT in describing the property, and Purchaser accepts the property in its PRESENT AS IS CONDITION, except as otherwise specified herein.</w:t>
+        <w:t xml:space="preserve"> has [  ] has not inspected the property and HAS NOT RELIED UPON ANY REPRESENTATIONS MADE BY ANY REAL ESTATE AGENT in describing the property, and Purchaser accepts the property in its PRESENT AS IS CONDITION, except as otherwise specified herein.</w:t>
       </w:r>
     </w:p>
     <w:p>
@@ -3559,25 +3167,7 @@
           <w:bCs/>
           <w:szCs w:val="28"/>
         </w:rPr>
-        <w:t xml:space="preserve">[ </w:t>
-      </w:r>
-      <w:proofErr w:type="gramStart"/>
-      <w:r>
-        <w:rPr>
-          <w:b/>
-          <w:bCs/>
-          <w:szCs w:val="28"/>
-        </w:rPr>
-        <w:t xml:space="preserve">  ]</w:t>
-      </w:r>
-      <w:proofErr w:type="gramEnd"/>
-      <w:r>
-        <w:rPr>
-          <w:b/>
-          <w:bCs/>
-          <w:szCs w:val="28"/>
-        </w:rPr>
-        <w:t xml:space="preserve"> _____________days after date of satisfaction of all conditions in paragraph 19 unless extended by other conditions of this Agreement or this agreement is cancelled by the Purchaser.</w:t>
+        <w:t>[   ] _____________days after date of satisfaction of all conditions in paragraph 19 unless extended by other conditions of this Agreement or this agreement is cancelled by the Purchaser.</w:t>
       </w:r>
       <w:r>
         <w:rPr>
@@ -3663,48 +3253,28 @@
         <w:rPr>
           <w:szCs w:val="28"/>
         </w:rPr>
-        <w:t xml:space="preserve">Additional Terms, Conditions or Addenda (lettered </w:t>
-      </w:r>
-      <w:proofErr w:type="spellStart"/>
-      <w:proofErr w:type="gramStart"/>
-      <w:r>
-        <w:rPr>
-          <w:szCs w:val="28"/>
-        </w:rPr>
-        <w:t>a,b</w:t>
-      </w:r>
-      <w:proofErr w:type="gramEnd"/>
-      <w:r>
-        <w:rPr>
-          <w:szCs w:val="28"/>
-        </w:rPr>
-        <w:t>,</w:t>
-      </w:r>
-      <w:proofErr w:type="gramStart"/>
-      <w:r>
-        <w:rPr>
-          <w:szCs w:val="28"/>
-        </w:rPr>
-        <w:t>c,d</w:t>
-      </w:r>
-      <w:proofErr w:type="spellEnd"/>
-      <w:proofErr w:type="gramEnd"/>
-      <w:r>
-        <w:rPr>
-          <w:szCs w:val="28"/>
-        </w:rPr>
-        <w:t>, etc.)</w:t>
-      </w:r>
-    </w:p>
-    <w:p>
-      <w:pPr>
-        <w:spacing w:line="264" w:lineRule="auto"/>
-      </w:pPr>
-      <w:r>
-        <w:rPr>
-          <w:b/>
-        </w:rPr>
-        <w:t>This Contract is signed contingent upon any changes Seller's attorney may make or require. The parties shall sign the Contract again at closing with any such alterations incorporated. If any such changes are sufficient to cause Purchaser to withdraw from the transaction, Purchaser's due diligence funds shall be returned to Purchaser.</w:t>
+        <w:t>Additional Terms, Conditions or Addenda (lettered a,b,c,d, etc.)</w:t>
+      </w:r>
+    </w:p>
+    <w:p>
+      <w:pPr>
+        <w:spacing w:line="264" w:lineRule="auto"/>
+      </w:pPr>
+      <w:r>
+        <w:rPr>
+          <w:b/>
+        </w:rPr>
+        <w:t>This Contract is signed subject to any changes Seller's attorney may make or require. The parties shall sign the Contract again at closing, or execute any required amendment, with any such attorney-required alterations incorporated. If such changes are material and Purchaser does not agree to proceed, Seller may elect to proceed under the previously signed Contract. If Seller does not so elect, Purchaser's due diligence funds shall be returned to Purchaser.</w:t>
+      </w:r>
+      <w:r>
+        <w:rPr>
+          <w:b/>
+        </w:rPr>
+      </w:r>
+      <w:r>
+        <w:rPr>
+          <w:b/>
+        </w:rPr>
       </w:r>
     </w:p>
     <w:p>
@@ -3850,7 +3420,14 @@
         <w:rPr>
           <w:szCs w:val="28"/>
         </w:rPr>
-        <w:t xml:space="preserve">Personal Property: included in the purchase price are all fixed equipment including ceiling fans, drapery hardware, attached lighting fixtures, mailbox, fence, plants and shrubbery as now installed on the property. </w:t>
+        <w:t xml:space="preserve">Personal Property: included in the purchase price are all fixed equipment including ceiling </w:t>
+      </w:r>
+      <w:r>
+        <w:rPr>
+          <w:szCs w:val="28"/>
+        </w:rPr>
+        <w:lastRenderedPageBreak/>
+        <w:t xml:space="preserve">fans, drapery hardware, attached lighting fixtures, mailbox, fence, plants and shrubbery as now installed on the property. </w:t>
       </w:r>
     </w:p>
     <w:p>
@@ -3937,28 +3514,13 @@
           <w:szCs w:val="28"/>
           <w:u w:val="single"/>
         </w:rPr>
-        <w:t xml:space="preserve">     </w:t>
-      </w:r>
-      <w:proofErr w:type="gramStart"/>
-      <w:r>
-        <w:rPr>
-          <w:szCs w:val="28"/>
-          <w:u w:val="single"/>
-        </w:rPr>
-        <w:t xml:space="preserve">  </w:t>
-      </w:r>
-      <w:r>
-        <w:rPr>
-          <w:szCs w:val="28"/>
-        </w:rPr>
-        <w:t>.</w:t>
-      </w:r>
-      <w:proofErr w:type="gramEnd"/>
-      <w:r>
-        <w:rPr>
-          <w:szCs w:val="28"/>
-        </w:rPr>
-        <w:t xml:space="preserve"> </w:t>
+        <w:t xml:space="preserve">       </w:t>
+      </w:r>
+      <w:r>
+        <w:rPr>
+          <w:szCs w:val="28"/>
+        </w:rPr>
+        <w:t xml:space="preserve">. </w:t>
       </w:r>
     </w:p>
     <w:p>
@@ -4066,15 +3628,7 @@
           <w:u w:val="single"/>
         </w:rPr>
         <w:tab/>
-        <w:t xml:space="preserve">     </w:t>
-      </w:r>
-      <w:proofErr w:type="gramStart"/>
-      <w:r>
-        <w:rPr>
-          <w:szCs w:val="28"/>
-          <w:u w:val="single"/>
-        </w:rPr>
-        <w:t xml:space="preserve">  </w:t>
+        <w:t xml:space="preserve">       </w:t>
       </w:r>
       <w:r>
         <w:rPr>
@@ -4082,7 +3636,6 @@
         </w:rPr>
         <w:t>.</w:t>
       </w:r>
-      <w:proofErr w:type="gramEnd"/>
     </w:p>
     <w:p>
       <w:pPr>
@@ -4638,27 +4191,16 @@
         </w:rPr>
       </w:pPr>
       <w:r>
-        <w:t>STATE</w:t>
-      </w:r>
-      <w:proofErr w:type="gramStart"/>
-      <w:r>
-        <w:t xml:space="preserve">:   </w:t>
-      </w:r>
-      <w:r>
-        <w:tab/>
-      </w:r>
-      <w:r>
-        <w:rPr>
-          <w:u w:val="single"/>
-        </w:rPr>
-        <w:t>North</w:t>
-      </w:r>
-      <w:proofErr w:type="gramEnd"/>
-      <w:r>
-        <w:rPr>
-          <w:u w:val="single"/>
-        </w:rPr>
-        <w:t xml:space="preserve"> Carolina</w:t>
+        <w:t xml:space="preserve">STATE:   </w:t>
+      </w:r>
+      <w:r>
+        <w:tab/>
+      </w:r>
+      <w:r>
+        <w:rPr>
+          <w:u w:val="single"/>
+        </w:rPr>
+        <w:t>North Carolina</w:t>
       </w:r>
     </w:p>
     <w:p>
@@ -4670,9 +4212,6 @@
       <w:r>
         <w:t>COUNTY:  Wake</w:t>
       </w:r>
-      <w:proofErr w:type="gramStart"/>
-      <w:r/>
-      <w:proofErr w:type="gramEnd"/>
     </w:p>
     <w:p>
       <w:pPr>
@@ -4860,33 +4399,19 @@
         <w:rPr>
           <w:rStyle w:val="normaltextrun"/>
         </w:rPr>
-        <w:t xml:space="preserve">Notary </w:t>
-      </w:r>
-      <w:proofErr w:type="gramStart"/>
+        <w:t>Notary Public </w:t>
+      </w:r>
+      <w:r>
+        <w:rPr>
+          <w:rStyle w:val="eop"/>
+        </w:rPr>
+        <w:t> </w:t>
+      </w:r>
       <w:r>
         <w:rPr>
           <w:rStyle w:val="normaltextrun"/>
         </w:rPr>
-        <w:t>Public </w:t>
-      </w:r>
-      <w:r>
-        <w:rPr>
-          <w:rStyle w:val="eop"/>
-        </w:rPr>
-        <w:t> </w:t>
-      </w:r>
-      <w:r>
-        <w:rPr>
-          <w:rStyle w:val="normaltextrun"/>
-        </w:rPr>
-        <w:t>My</w:t>
-      </w:r>
-      <w:proofErr w:type="gramEnd"/>
-      <w:r>
-        <w:rPr>
-          <w:rStyle w:val="normaltextrun"/>
-        </w:rPr>
-        <w:t xml:space="preserve"> Commission expires:</w:t>
+        <w:t>My Commission expires:</w:t>
       </w:r>
       <w:r>
         <w:rPr>
@@ -5206,66 +4731,11 @@
           <w:szCs w:val="28"/>
         </w:rPr>
       </w:pPr>
-      <w:proofErr w:type="gramStart"/>
       <w:r>
         <w:rPr>
           <w:szCs w:val="28"/>
         </w:rPr>
         <w:t>[ ] Agent   [X] Seller, by the signature below, acknowledge receipt of $6,000.00 [  ] Cash   [   ] Check, as earnest money deposit, which is credited toward the total down payment mentioned in paragraph 1A of this Agreement. The remaining down payment balance of $14,790.00 shall be paid at closing.</w:t>
-      </w:r>
-      <w:proofErr w:type="gramEnd"/>
-      <w:r>
-        <w:rPr>
-          <w:szCs w:val="28"/>
-        </w:rPr>
-      </w:r>
-      <w:proofErr w:type="gramStart"/>
-      <w:r>
-        <w:rPr>
-          <w:szCs w:val="28"/>
-        </w:rPr>
-      </w:r>
-      <w:proofErr w:type="gramEnd"/>
-      <w:r>
-        <w:rPr>
-          <w:szCs w:val="28"/>
-        </w:rPr>
-      </w:r>
-      <w:proofErr w:type="gramStart"/>
-      <w:r>
-        <w:rPr>
-          <w:szCs w:val="28"/>
-        </w:rPr>
-      </w:r>
-      <w:proofErr w:type="gramEnd"/>
-      <w:r>
-        <w:rPr>
-          <w:szCs w:val="28"/>
-        </w:rPr>
-      </w:r>
-      <w:proofErr w:type="gramStart"/>
-      <w:r>
-        <w:rPr>
-          <w:szCs w:val="28"/>
-        </w:rPr>
-      </w:r>
-      <w:proofErr w:type="gramEnd"/>
-      <w:r>
-        <w:rPr>
-          <w:szCs w:val="28"/>
-        </w:rPr>
-      </w:r>
-      <w:proofErr w:type="gramStart"/>
-      <w:r>
-        <w:rPr>
-          <w:szCs w:val="28"/>
-        </w:rPr>
-      </w:r>
-      <w:proofErr w:type="gramEnd"/>
-      <w:r>
-        <w:rPr>
-          <w:szCs w:val="28"/>
-        </w:rPr>
       </w:r>
     </w:p>
     <w:p>
@@ -5654,27 +5124,16 @@
         </w:rPr>
       </w:pPr>
       <w:r>
-        <w:t>STATE</w:t>
-      </w:r>
-      <w:proofErr w:type="gramStart"/>
-      <w:r>
-        <w:t xml:space="preserve">:   </w:t>
-      </w:r>
-      <w:r>
-        <w:tab/>
-      </w:r>
-      <w:r>
-        <w:rPr>
-          <w:u w:val="single"/>
-        </w:rPr>
-        <w:t>North</w:t>
-      </w:r>
-      <w:proofErr w:type="gramEnd"/>
-      <w:r>
-        <w:rPr>
-          <w:u w:val="single"/>
-        </w:rPr>
-        <w:t xml:space="preserve"> Carolina</w:t>
+        <w:t xml:space="preserve">STATE:   </w:t>
+      </w:r>
+      <w:r>
+        <w:tab/>
+      </w:r>
+      <w:r>
+        <w:rPr>
+          <w:u w:val="single"/>
+        </w:rPr>
+        <w:t>North Carolina</w:t>
       </w:r>
       <w:r>
         <w:rPr>
@@ -5695,9 +5154,6 @@
       <w:r>
         <w:t>COUNTY:  Wake</w:t>
       </w:r>
-      <w:proofErr w:type="gramStart"/>
-      <w:r/>
-      <w:proofErr w:type="gramEnd"/>
     </w:p>
     <w:p>
       <w:pPr>
@@ -5991,33 +5447,19 @@
         <w:rPr>
           <w:rStyle w:val="normaltextrun"/>
         </w:rPr>
-        <w:t xml:space="preserve">Notary </w:t>
-      </w:r>
-      <w:proofErr w:type="gramStart"/>
+        <w:t>Notary Public </w:t>
+      </w:r>
+      <w:r>
+        <w:rPr>
+          <w:rStyle w:val="eop"/>
+        </w:rPr>
+        <w:t> </w:t>
+      </w:r>
       <w:r>
         <w:rPr>
           <w:rStyle w:val="normaltextrun"/>
         </w:rPr>
-        <w:t>Public </w:t>
-      </w:r>
-      <w:r>
-        <w:rPr>
-          <w:rStyle w:val="eop"/>
-        </w:rPr>
-        <w:t> </w:t>
-      </w:r>
-      <w:r>
-        <w:rPr>
-          <w:rStyle w:val="normaltextrun"/>
-        </w:rPr>
-        <w:t>My</w:t>
-      </w:r>
-      <w:proofErr w:type="gramEnd"/>
-      <w:r>
-        <w:rPr>
-          <w:rStyle w:val="normaltextrun"/>
-        </w:rPr>
-        <w:t xml:space="preserve"> Commission expires:</w:t>
+        <w:t>My Commission expires:</w:t>
       </w:r>
       <w:r>
         <w:rPr>
@@ -8340,15 +7782,7 @@
 </file>
 
 <file path=customXml/item2.xml><?xml version="1.0" encoding="utf-8"?>
-<p:properties xmlns:p="http://schemas.microsoft.com/office/2006/metadata/properties" xmlns:xsi="http://www.w3.org/2001/XMLSchema-instance" xmlns:pc="http://schemas.microsoft.com/office/infopath/2007/PartnerControls">
-  <documentManagement>
-    <TaxCatchAll xmlns="42cc25d9-27fe-4f07-accb-ded05ec47eee" xsi:nil="true"/>
-    <lcf76f155ced4ddcb4097134ff3c332f xmlns="ab9fedca-001d-4cc9-b244-d9c3be5a27d3">
-      <Terms xmlns="http://schemas.microsoft.com/office/infopath/2007/PartnerControls"/>
-    </lcf76f155ced4ddcb4097134ff3c332f>
-    <_Flow_SignoffStatus xmlns="ab9fedca-001d-4cc9-b244-d9c3be5a27d3" xsi:nil="true"/>
-  </documentManagement>
-</p:properties>
+<b:Sources xmlns:b="http://schemas.openxmlformats.org/officeDocument/2006/bibliography" xmlns="http://schemas.openxmlformats.org/officeDocument/2006/bibliography" SelectedStyle="\APASixthEditionOfficeOnline.xsl" StyleName="APA" Version="6"/>
 </file>
 
 <file path=customXml/item3.xml><?xml version="1.0" encoding="utf-8"?>
@@ -8613,7 +8047,15 @@
 </file>
 
 <file path=customXml/item4.xml><?xml version="1.0" encoding="utf-8"?>
-<b:Sources xmlns:b="http://schemas.openxmlformats.org/officeDocument/2006/bibliography" xmlns="http://schemas.openxmlformats.org/officeDocument/2006/bibliography" SelectedStyle="\APASixthEditionOfficeOnline.xsl" StyleName="APA" Version="6"/>
+<p:properties xmlns:p="http://schemas.microsoft.com/office/2006/metadata/properties" xmlns:xsi="http://www.w3.org/2001/XMLSchema-instance" xmlns:pc="http://schemas.microsoft.com/office/infopath/2007/PartnerControls">
+  <documentManagement>
+    <TaxCatchAll xmlns="42cc25d9-27fe-4f07-accb-ded05ec47eee" xsi:nil="true"/>
+    <lcf76f155ced4ddcb4097134ff3c332f xmlns="ab9fedca-001d-4cc9-b244-d9c3be5a27d3">
+      <Terms xmlns="http://schemas.microsoft.com/office/infopath/2007/PartnerControls"/>
+    </lcf76f155ced4ddcb4097134ff3c332f>
+    <_Flow_SignoffStatus xmlns="ab9fedca-001d-4cc9-b244-d9c3be5a27d3" xsi:nil="true"/>
+  </documentManagement>
+</p:properties>
 </file>
 
 <file path=customXml/itemProps1.xml><?xml version="1.0" encoding="utf-8"?>
@@ -8625,12 +8067,9 @@
 </file>
 
 <file path=customXml/itemProps2.xml><?xml version="1.0" encoding="utf-8"?>
-<ds:datastoreItem xmlns:ds="http://schemas.openxmlformats.org/officeDocument/2006/customXml" ds:itemID="{1A4736DD-7889-4919-A280-9BE82A810A58}">
+<ds:datastoreItem xmlns:ds="http://schemas.openxmlformats.org/officeDocument/2006/customXml" ds:itemID="{3679C442-D341-425F-8964-A65FCEFD3D9B}">
   <ds:schemaRefs>
-    <ds:schemaRef ds:uri="http://schemas.microsoft.com/office/2006/metadata/properties"/>
-    <ds:schemaRef ds:uri="http://schemas.microsoft.com/office/infopath/2007/PartnerControls"/>
-    <ds:schemaRef ds:uri="42cc25d9-27fe-4f07-accb-ded05ec47eee"/>
-    <ds:schemaRef ds:uri="ab9fedca-001d-4cc9-b244-d9c3be5a27d3"/>
+    <ds:schemaRef ds:uri="http://schemas.openxmlformats.org/officeDocument/2006/bibliography"/>
   </ds:schemaRefs>
 </ds:datastoreItem>
 </file>
@@ -8655,9 +8094,12 @@
 </file>
 
 <file path=customXml/itemProps4.xml><?xml version="1.0" encoding="utf-8"?>
-<ds:datastoreItem xmlns:ds="http://schemas.openxmlformats.org/officeDocument/2006/customXml" ds:itemID="{3679C442-D341-425F-8964-A65FCEFD3D9B}">
+<ds:datastoreItem xmlns:ds="http://schemas.openxmlformats.org/officeDocument/2006/customXml" ds:itemID="{1A4736DD-7889-4919-A280-9BE82A810A58}">
   <ds:schemaRefs>
-    <ds:schemaRef ds:uri="http://schemas.openxmlformats.org/officeDocument/2006/bibliography"/>
+    <ds:schemaRef ds:uri="http://schemas.microsoft.com/office/2006/metadata/properties"/>
+    <ds:schemaRef ds:uri="http://schemas.microsoft.com/office/infopath/2007/PartnerControls"/>
+    <ds:schemaRef ds:uri="42cc25d9-27fe-4f07-accb-ded05ec47eee"/>
+    <ds:schemaRef ds:uri="ab9fedca-001d-4cc9-b244-d9c3be5a27d3"/>
   </ds:schemaRefs>
 </ds:datastoreItem>
 </file>
</xml_diff>

<commit_message>
Refresh Rose package spelling and formatting
</commit_message>
<xml_diff>
--- a/Project Rooms/Contract for Deed/output/320 Rose - Contract for Deed Agreement - DRAFT.docx
+++ b/Project Rooms/Contract for Deed/output/320 Rose - Contract for Deed Agreement - DRAFT.docx
@@ -2118,7 +2118,13 @@
               <w:spacing w:line="264" w:lineRule="auto"/>
             </w:pPr>
             <w:r>
-              <w:t>Property Insurance *:</w:t>
+              <w:t>Property Insurance</w:t>
+            </w:r>
+            <w:r>
+              <w:t>-paid into escrow</w:t>
+            </w:r>
+            <w:r>
+              <w:t xml:space="preserve"> *:</w:t>
             </w:r>
           </w:p>
           <w:p>
@@ -2131,7 +2137,16 @@
               <w:spacing w:line="264" w:lineRule="auto"/>
             </w:pPr>
             <w:r>
-              <w:t>Property Tax *:</w:t>
+              <w:t>Property Tax</w:t>
+            </w:r>
+            <w:r>
+              <w:t>-</w:t>
+            </w:r>
+            <w:r>
+              <w:t>paid into escrow</w:t>
+            </w:r>
+            <w:r>
+              <w:t xml:space="preserve"> *:</w:t>
             </w:r>
           </w:p>
           <w:p>
@@ -2517,18 +2532,46 @@
       <w:pPr>
         <w:jc w:val="center"/>
         <w:rPr>
-          <w:szCs w:val="28"/>
-        </w:rPr>
-      </w:pPr>
-      <w:r>
+          <w:b/>
+          <w:bCs/>
+          <w:szCs w:val="28"/>
+        </w:rPr>
+      </w:pPr>
+      <w:r>
+        <w:rPr>
+          <w:b/>
+          <w:bCs/>
+        </w:rPr>
         <w:t>1st mortgage to Shellpoint of 122,713.02</w:t>
         <w:br/>
-        <w:t>Defered Balance of 54,532.00</w:t>
+        <w:t>Deferred Balance of 54,532.00</w:t>
         <w:br/>
-        <w:t>A lien to attorneys of 100,000</w:t>
-      </w:r>
-      <w:r/>
-      <w:r/>
+        <w:t>A lien of 100,000.00</w:t>
+      </w:r>
+      <w:r>
+        <w:rPr>
+          <w:b/>
+          <w:bCs/>
+        </w:rPr>
+      </w:r>
+      <w:r>
+        <w:rPr>
+          <w:b/>
+          <w:bCs/>
+        </w:rPr>
+      </w:r>
+      <w:r>
+        <w:rPr>
+          <w:b/>
+          <w:bCs/>
+        </w:rPr>
+      </w:r>
+      <w:r>
+        <w:rPr>
+          <w:b/>
+          <w:bCs/>
+        </w:rPr>
+      </w:r>
     </w:p>
     <w:p>
       <w:pPr>
@@ -3259,17 +3302,15 @@
     <w:p>
       <w:pPr>
         <w:spacing w:line="264" w:lineRule="auto"/>
-      </w:pPr>
-      <w:r>
-        <w:rPr>
-          <w:b/>
+        <w:rPr>
+          <w:b/>
+        </w:rPr>
+      </w:pPr>
+      <w:r>
+        <w:rPr>
+          <w:bCs/>
         </w:rPr>
         <w:t>This Contract is signed subject to any changes Seller's attorney may make or require. The parties shall sign the Contract again at closing, or execute any required amendment, with any such attorney-required alterations incorporated. If such changes are material and Purchaser does not agree to proceed, Seller may elect to proceed under the previously signed Contract. If Seller does not so elect, Purchaser's due diligence funds shall be returned to Purchaser.</w:t>
-      </w:r>
-      <w:r>
-        <w:rPr>
-          <w:b/>
-        </w:rPr>
       </w:r>
       <w:r>
         <w:rPr>
@@ -3285,14 +3326,14 @@
         </w:numPr>
         <w:spacing w:line="264" w:lineRule="auto"/>
         <w:rPr>
-          <w:b/>
+          <w:bCs/>
           <w:sz w:val="22"/>
           <w:szCs w:val="22"/>
         </w:rPr>
       </w:pPr>
       <w:r>
         <w:rPr>
-          <w:b/>
+          <w:bCs/>
           <w:sz w:val="22"/>
           <w:szCs w:val="22"/>
         </w:rPr>
@@ -3307,14 +3348,14 @@
         </w:numPr>
         <w:spacing w:line="264" w:lineRule="auto"/>
         <w:rPr>
-          <w:b/>
+          <w:bCs/>
           <w:sz w:val="22"/>
           <w:szCs w:val="22"/>
         </w:rPr>
       </w:pPr>
       <w:r>
         <w:rPr>
-          <w:b/>
+          <w:bCs/>
           <w:sz w:val="22"/>
           <w:szCs w:val="22"/>
         </w:rPr>
@@ -3329,14 +3370,14 @@
         </w:numPr>
         <w:spacing w:line="264" w:lineRule="auto"/>
         <w:rPr>
-          <w:b/>
+          <w:bCs/>
           <w:sz w:val="22"/>
           <w:szCs w:val="22"/>
         </w:rPr>
       </w:pPr>
       <w:r>
         <w:rPr>
-          <w:b/>
+          <w:bCs/>
           <w:sz w:val="22"/>
           <w:szCs w:val="22"/>
         </w:rPr>
@@ -3351,14 +3392,14 @@
         </w:numPr>
         <w:spacing w:line="264" w:lineRule="auto"/>
         <w:rPr>
-          <w:b/>
+          <w:bCs/>
           <w:sz w:val="22"/>
           <w:szCs w:val="22"/>
         </w:rPr>
       </w:pPr>
       <w:r>
         <w:rPr>
-          <w:b/>
+          <w:bCs/>
           <w:sz w:val="22"/>
           <w:szCs w:val="22"/>
         </w:rPr>
@@ -3373,14 +3414,14 @@
         </w:numPr>
         <w:spacing w:line="264" w:lineRule="auto"/>
         <w:rPr>
-          <w:b/>
+          <w:bCs/>
           <w:sz w:val="22"/>
           <w:szCs w:val="22"/>
         </w:rPr>
       </w:pPr>
       <w:r>
         <w:rPr>
-          <w:b/>
+          <w:bCs/>
           <w:sz w:val="22"/>
           <w:szCs w:val="22"/>
         </w:rPr>
@@ -4259,14 +4300,6 @@
         <w:rPr>
           <w:u w:val="single"/>
         </w:rPr>
-      </w:r>
-      <w:r/>
-      <w:r/>
-      <w:r/>
-      <w:r>
-        <w:rPr>
-          <w:u w:val="single"/>
-        </w:rPr>
         <w:tab/>
         <w:tab/>
         <w:tab/>
@@ -5223,12 +5256,6 @@
         <w:rPr>
           <w:u w:val="single"/>
         </w:rPr>
-      </w:r>
-      <w:r/>
-      <w:r>
-        <w:rPr>
-          <w:u w:val="single"/>
-        </w:rPr>
         <w:tab/>
         <w:tab/>
         <w:tab/>
@@ -5266,7 +5293,6 @@
         </w:rPr>
         <w:t>Wes Browning, Manager of Investment Services LLC, Trustee of 320 Rose Pl Real Estate Trust dated March, 5 2025,</w:t>
       </w:r>
-      <w:r/>
       <w:r/>
       <w:r>
         <w:t xml:space="preserve"> personally appeared before me this day and acknowledged the execution of the foregoing instrument.  Witness my hand and notarial seal,</w:t>
@@ -7782,7 +7808,15 @@
 </file>
 
 <file path=customXml/item2.xml><?xml version="1.0" encoding="utf-8"?>
-<b:Sources xmlns:b="http://schemas.openxmlformats.org/officeDocument/2006/bibliography" xmlns="http://schemas.openxmlformats.org/officeDocument/2006/bibliography" SelectedStyle="\APASixthEditionOfficeOnline.xsl" StyleName="APA" Version="6"/>
+<p:properties xmlns:p="http://schemas.microsoft.com/office/2006/metadata/properties" xmlns:xsi="http://www.w3.org/2001/XMLSchema-instance" xmlns:pc="http://schemas.microsoft.com/office/infopath/2007/PartnerControls">
+  <documentManagement>
+    <TaxCatchAll xmlns="42cc25d9-27fe-4f07-accb-ded05ec47eee" xsi:nil="true"/>
+    <lcf76f155ced4ddcb4097134ff3c332f xmlns="ab9fedca-001d-4cc9-b244-d9c3be5a27d3">
+      <Terms xmlns="http://schemas.microsoft.com/office/infopath/2007/PartnerControls"/>
+    </lcf76f155ced4ddcb4097134ff3c332f>
+    <_Flow_SignoffStatus xmlns="ab9fedca-001d-4cc9-b244-d9c3be5a27d3" xsi:nil="true"/>
+  </documentManagement>
+</p:properties>
 </file>
 
 <file path=customXml/item3.xml><?xml version="1.0" encoding="utf-8"?>
@@ -8047,15 +8081,7 @@
 </file>
 
 <file path=customXml/item4.xml><?xml version="1.0" encoding="utf-8"?>
-<p:properties xmlns:p="http://schemas.microsoft.com/office/2006/metadata/properties" xmlns:xsi="http://www.w3.org/2001/XMLSchema-instance" xmlns:pc="http://schemas.microsoft.com/office/infopath/2007/PartnerControls">
-  <documentManagement>
-    <TaxCatchAll xmlns="42cc25d9-27fe-4f07-accb-ded05ec47eee" xsi:nil="true"/>
-    <lcf76f155ced4ddcb4097134ff3c332f xmlns="ab9fedca-001d-4cc9-b244-d9c3be5a27d3">
-      <Terms xmlns="http://schemas.microsoft.com/office/infopath/2007/PartnerControls"/>
-    </lcf76f155ced4ddcb4097134ff3c332f>
-    <_Flow_SignoffStatus xmlns="ab9fedca-001d-4cc9-b244-d9c3be5a27d3" xsi:nil="true"/>
-  </documentManagement>
-</p:properties>
+<b:Sources xmlns:b="http://schemas.openxmlformats.org/officeDocument/2006/bibliography" xmlns="http://schemas.openxmlformats.org/officeDocument/2006/bibliography" SelectedStyle="\APASixthEditionOfficeOnline.xsl" StyleName="APA" Version="6"/>
 </file>
 
 <file path=customXml/itemProps1.xml><?xml version="1.0" encoding="utf-8"?>
@@ -8067,9 +8093,12 @@
 </file>
 
 <file path=customXml/itemProps2.xml><?xml version="1.0" encoding="utf-8"?>
-<ds:datastoreItem xmlns:ds="http://schemas.openxmlformats.org/officeDocument/2006/customXml" ds:itemID="{3679C442-D341-425F-8964-A65FCEFD3D9B}">
+<ds:datastoreItem xmlns:ds="http://schemas.openxmlformats.org/officeDocument/2006/customXml" ds:itemID="{1A4736DD-7889-4919-A280-9BE82A810A58}">
   <ds:schemaRefs>
-    <ds:schemaRef ds:uri="http://schemas.openxmlformats.org/officeDocument/2006/bibliography"/>
+    <ds:schemaRef ds:uri="http://schemas.microsoft.com/office/2006/metadata/properties"/>
+    <ds:schemaRef ds:uri="http://schemas.microsoft.com/office/infopath/2007/PartnerControls"/>
+    <ds:schemaRef ds:uri="42cc25d9-27fe-4f07-accb-ded05ec47eee"/>
+    <ds:schemaRef ds:uri="ab9fedca-001d-4cc9-b244-d9c3be5a27d3"/>
   </ds:schemaRefs>
 </ds:datastoreItem>
 </file>
@@ -8094,12 +8123,9 @@
 </file>
 
 <file path=customXml/itemProps4.xml><?xml version="1.0" encoding="utf-8"?>
-<ds:datastoreItem xmlns:ds="http://schemas.openxmlformats.org/officeDocument/2006/customXml" ds:itemID="{1A4736DD-7889-4919-A280-9BE82A810A58}">
+<ds:datastoreItem xmlns:ds="http://schemas.openxmlformats.org/officeDocument/2006/customXml" ds:itemID="{3679C442-D341-425F-8964-A65FCEFD3D9B}">
   <ds:schemaRefs>
-    <ds:schemaRef ds:uri="http://schemas.microsoft.com/office/2006/metadata/properties"/>
-    <ds:schemaRef ds:uri="http://schemas.microsoft.com/office/infopath/2007/PartnerControls"/>
-    <ds:schemaRef ds:uri="42cc25d9-27fe-4f07-accb-ded05ec47eee"/>
-    <ds:schemaRef ds:uri="ab9fedca-001d-4cc9-b244-d9c3be5a27d3"/>
+    <ds:schemaRef ds:uri="http://schemas.openxmlformats.org/officeDocument/2006/bibliography"/>
   </ds:schemaRefs>
 </ds:datastoreItem>
 </file>
</xml_diff>